<commit_message>
Finalised proposal template 📑
</commit_message>
<xml_diff>
--- a/public/assets/ideasprint-proposal-template.docx
+++ b/public/assets/ideasprint-proposal-template.docx
@@ -168,8 +168,8 @@
             <w:tblLook w:val="04A0" w:firstRow="1" w:lastRow="0" w:firstColumn="1" w:lastColumn="0" w:noHBand="0" w:noVBand="1"/>
           </w:tblPr>
           <w:tblGrid>
-            <w:gridCol w:w="4860"/>
-            <w:gridCol w:w="4860"/>
+            <w:gridCol w:w="3325"/>
+            <w:gridCol w:w="6395"/>
           </w:tblGrid>
           <w:tr>
             <w:trPr>
@@ -177,7 +177,7 @@
             </w:trPr>
             <w:tc>
               <w:tcPr>
-                <w:tcW w:w="4860" w:type="dxa"/>
+                <w:tcW w:w="3325" w:type="dxa"/>
                 <w:vAlign w:val="center"/>
               </w:tcPr>
               <w:p>
@@ -240,7 +240,7 @@
             </w:tc>
             <w:tc>
               <w:tcPr>
-                <w:tcW w:w="4860" w:type="dxa"/>
+                <w:tcW w:w="6395" w:type="dxa"/>
                 <w:vAlign w:val="center"/>
               </w:tcPr>
               <w:p>
@@ -270,7 +270,7 @@
             </w:trPr>
             <w:tc>
               <w:tcPr>
-                <w:tcW w:w="4860" w:type="dxa"/>
+                <w:tcW w:w="3325" w:type="dxa"/>
                 <w:vAlign w:val="center"/>
               </w:tcPr>
               <w:p>
@@ -324,7 +324,7 @@
             </w:tc>
             <w:tc>
               <w:tcPr>
-                <w:tcW w:w="4860" w:type="dxa"/>
+                <w:tcW w:w="6395" w:type="dxa"/>
                 <w:vAlign w:val="center"/>
               </w:tcPr>
               <w:p>
@@ -354,7 +354,7 @@
             </w:trPr>
             <w:tc>
               <w:tcPr>
-                <w:tcW w:w="4860" w:type="dxa"/>
+                <w:tcW w:w="3325" w:type="dxa"/>
                 <w:vAlign w:val="center"/>
               </w:tcPr>
               <w:p>
@@ -417,7 +417,7 @@
             </w:tc>
             <w:tc>
               <w:tcPr>
-                <w:tcW w:w="4860" w:type="dxa"/>
+                <w:tcW w:w="6395" w:type="dxa"/>
                 <w:vAlign w:val="center"/>
               </w:tcPr>
               <w:p>
@@ -470,20 +470,21 @@
           <w:r>
             <w:rPr>
               <w:noProof/>
+              <w:sz w:val="2"/>
             </w:rPr>
             <w:drawing>
-              <wp:anchor distT="0" distB="0" distL="114300" distR="114300" simplePos="0" relativeHeight="251685888" behindDoc="1" locked="0" layoutInCell="1" allowOverlap="1" wp14:anchorId="27A09710" wp14:editId="05D7C9C1">
+              <wp:anchor distT="0" distB="0" distL="114300" distR="114300" simplePos="0" relativeHeight="251703296" behindDoc="0" locked="0" layoutInCell="1" allowOverlap="1" wp14:anchorId="2EFE9B03" wp14:editId="33C1C520">
                 <wp:simplePos x="0" y="0"/>
                 <wp:positionH relativeFrom="margin">
                   <wp:align>center</wp:align>
                 </wp:positionH>
-                <wp:positionV relativeFrom="margin">
-                  <wp:posOffset>1790700</wp:posOffset>
+                <wp:positionV relativeFrom="paragraph">
+                  <wp:posOffset>2411095</wp:posOffset>
                 </wp:positionV>
-                <wp:extent cx="6272862" cy="2359025"/>
+                <wp:extent cx="4829381" cy="1678182"/>
                 <wp:effectExtent l="0" t="0" r="0" b="0"/>
                 <wp:wrapNone/>
-                <wp:docPr id="521956648" name="Picture 12"/>
+                <wp:docPr id="1149086742" name="Picture 17"/>
                 <wp:cNvGraphicFramePr>
                   <a:graphicFrameLocks xmlns:a="http://schemas.openxmlformats.org/drawingml/2006/main" noChangeAspect="1"/>
                 </wp:cNvGraphicFramePr>
@@ -491,20 +492,20 @@
                   <a:graphicData uri="http://schemas.openxmlformats.org/drawingml/2006/picture">
                     <pic:pic xmlns:pic="http://schemas.openxmlformats.org/drawingml/2006/picture">
                       <pic:nvPicPr>
-                        <pic:cNvPr id="0" name="Picture 6"/>
+                        <pic:cNvPr id="0" name="Picture 5"/>
                         <pic:cNvPicPr>
                           <a:picLocks noChangeAspect="1" noChangeArrowheads="1"/>
                         </pic:cNvPicPr>
                       </pic:nvPicPr>
-                      <pic:blipFill>
-                        <a:blip r:embed="rId9">
+                      <pic:blipFill rotWithShape="1">
+                        <a:blip r:embed="rId9" cstate="print">
                           <a:extLst>
                             <a:ext uri="{28A0092B-C50C-407E-A947-70E740481C1C}">
                               <a14:useLocalDpi xmlns:a14="http://schemas.microsoft.com/office/drawing/2010/main" val="0"/>
                             </a:ext>
                           </a:extLst>
                         </a:blip>
-                        <a:srcRect/>
+                        <a:srcRect l="7904" t="17498" r="7325" b="30022"/>
                         <a:stretch>
                           <a:fillRect/>
                         </a:stretch>
@@ -512,7 +513,7 @@
                       <pic:spPr bwMode="auto">
                         <a:xfrm>
                           <a:off x="0" y="0"/>
-                          <a:ext cx="6272862" cy="2359025"/>
+                          <a:ext cx="4829381" cy="1678182"/>
                         </a:xfrm>
                         <a:prstGeom prst="rect">
                           <a:avLst/>
@@ -521,14 +522,19 @@
                         <a:ln>
                           <a:noFill/>
                         </a:ln>
+                        <a:extLst>
+                          <a:ext uri="{53640926-AAD7-44D8-BBD7-CCE9431645EC}">
+                            <a14:shadowObscured xmlns:a14="http://schemas.microsoft.com/office/drawing/2010/main"/>
+                          </a:ext>
+                        </a:extLst>
                       </pic:spPr>
                     </pic:pic>
                   </a:graphicData>
                 </a:graphic>
-                <wp14:sizeRelH relativeFrom="margin">
+                <wp14:sizeRelH relativeFrom="page">
                   <wp14:pctWidth>0</wp14:pctWidth>
                 </wp14:sizeRelH>
-                <wp14:sizeRelV relativeFrom="margin">
+                <wp14:sizeRelV relativeFrom="page">
                   <wp14:pctHeight>0</wp14:pctHeight>
                 </wp14:sizeRelV>
               </wp:anchor>
@@ -543,7 +549,7 @@
               <w:szCs w:val="32"/>
             </w:rPr>
             <w:drawing>
-              <wp:anchor distT="0" distB="0" distL="114300" distR="114300" simplePos="0" relativeHeight="251686912" behindDoc="1" locked="0" layoutInCell="1" allowOverlap="1" wp14:anchorId="3A0F7062" wp14:editId="0CCDD695">
+              <wp:anchor distT="0" distB="0" distL="114300" distR="114300" simplePos="0" relativeHeight="251686912" behindDoc="1" locked="0" layoutInCell="1" allowOverlap="1" wp14:anchorId="3A0F7062" wp14:editId="38FCDBCF">
                 <wp:simplePos x="0" y="0"/>
                 <wp:positionH relativeFrom="margin">
                   <wp:align>center</wp:align>
@@ -1110,7 +1116,6 @@
                 <w:sz w:val="28"/>
                 <w:szCs w:val="28"/>
               </w:rPr>
-              <w:lastRenderedPageBreak/>
               <w:t>Video Link</w:t>
             </w:r>
           </w:p>
@@ -1132,14 +1137,31 @@
           <w:b/>
           <w:bCs/>
         </w:rPr>
-        <w:t>Insert Link:</w:t>
+        <w:t>Insert Link</w:t>
+      </w:r>
+      <w:proofErr w:type="gramStart"/>
+      <w:r>
+        <w:rPr>
+          <w:rFonts w:cs="Poppins"/>
+          <w:b/>
+          <w:bCs/>
+        </w:rPr>
+        <w:t>:</w:t>
       </w:r>
       <w:r>
         <w:rPr>
           <w:b/>
           <w:bCs/>
         </w:rPr>
-        <w:t xml:space="preserve">  -Link-</w:t>
+        <w:t xml:space="preserve">  -</w:t>
+      </w:r>
+      <w:proofErr w:type="gramEnd"/>
+      <w:r>
+        <w:rPr>
+          <w:b/>
+          <w:bCs/>
+        </w:rPr>
+        <w:t>Link-</w:t>
       </w:r>
       <w:r>
         <w:rPr>
@@ -1191,756 +1213,2074 @@
     </w:tbl>
     <w:p/>
     <w:p/>
-    <w:tbl>
-      <w:tblPr>
-        <w:tblStyle w:val="TableGrid"/>
-        <w:tblW w:w="0" w:type="auto"/>
-        <w:tblBorders>
-          <w:top w:val="none" w:sz="0" w:space="0" w:color="auto"/>
-          <w:left w:val="none" w:sz="0" w:space="0" w:color="auto"/>
-          <w:bottom w:val="none" w:sz="0" w:space="0" w:color="auto"/>
-          <w:right w:val="none" w:sz="0" w:space="0" w:color="auto"/>
-          <w:insideH w:val="none" w:sz="0" w:space="0" w:color="auto"/>
-          <w:insideV w:val="none" w:sz="0" w:space="0" w:color="auto"/>
-        </w:tblBorders>
-        <w:tblLook w:val="04A0" w:firstRow="1" w:lastRow="0" w:firstColumn="1" w:lastColumn="0" w:noHBand="0" w:noVBand="1"/>
-      </w:tblPr>
-      <w:tblGrid>
-        <w:gridCol w:w="4663"/>
-        <w:gridCol w:w="4663"/>
-      </w:tblGrid>
-      <w:tr>
-        <w:trPr>
-          <w:trHeight w:val="2034"/>
-        </w:trPr>
-        <w:tc>
-          <w:tcPr>
-            <w:tcW w:w="4663" w:type="dxa"/>
-            <w:vAlign w:val="center"/>
-          </w:tcPr>
-          <w:p>
-            <w:pPr>
-              <w:rPr>
-                <w:rFonts w:cs="Poppins Medium"/>
-              </w:rPr>
-            </w:pPr>
-            <w:r>
-              <w:rPr>
-                <w:rFonts w:cs="Poppins Medium"/>
-              </w:rPr>
-              <w:t>Member Name:</w:t>
-            </w:r>
-          </w:p>
-          <w:p>
-            <w:pPr>
-              <w:rPr>
-                <w:rFonts w:cs="Poppins Medium"/>
-              </w:rPr>
-            </w:pPr>
-            <w:r>
-              <w:rPr>
-                <w:rFonts w:cs="Poppins Medium"/>
-              </w:rPr>
-              <w:t>Student No:</w:t>
-            </w:r>
-          </w:p>
-          <w:p>
-            <w:r>
-              <w:rPr>
-                <w:rFonts w:cs="Poppins Medium"/>
-              </w:rPr>
-              <w:t>Phone No:</w:t>
-            </w:r>
-          </w:p>
-        </w:tc>
-        <w:tc>
-          <w:tcPr>
-            <w:tcW w:w="4663" w:type="dxa"/>
-            <w:vAlign w:val="center"/>
-          </w:tcPr>
-          <w:p>
-            <w:r>
-              <w:rPr>
-                <w:noProof/>
-              </w:rPr>
-              <mc:AlternateContent>
-                <mc:Choice Requires="wps">
-                  <w:drawing>
-                    <wp:anchor distT="0" distB="0" distL="114300" distR="114300" simplePos="0" relativeHeight="251674624" behindDoc="0" locked="0" layoutInCell="1" allowOverlap="1" wp14:anchorId="6E645243" wp14:editId="501231BA">
-                      <wp:simplePos x="0" y="0"/>
-                      <wp:positionH relativeFrom="column">
-                        <wp:posOffset>1562735</wp:posOffset>
-                      </wp:positionH>
-                      <wp:positionV relativeFrom="paragraph">
-                        <wp:posOffset>-74930</wp:posOffset>
-                      </wp:positionV>
-                      <wp:extent cx="1104900" cy="1104900"/>
-                      <wp:effectExtent l="0" t="0" r="0" b="0"/>
-                      <wp:wrapNone/>
-                      <wp:docPr id="578980711" name="Oval 10"/>
-                      <wp:cNvGraphicFramePr/>
-                      <a:graphic xmlns:a="http://schemas.openxmlformats.org/drawingml/2006/main">
-                        <a:graphicData uri="http://schemas.microsoft.com/office/word/2010/wordprocessingShape">
-                          <wps:wsp>
-                            <wps:cNvSpPr/>
-                            <wps:spPr>
-                              <a:xfrm>
-                                <a:off x="0" y="0"/>
-                                <a:ext cx="1104900" cy="1104900"/>
-                              </a:xfrm>
-                              <a:prstGeom prst="ellipse">
-                                <a:avLst/>
-                              </a:prstGeom>
-                              <a:blipFill dpi="0" rotWithShape="1">
-                                <a:blip r:embed="rId11" cstate="print">
-                                  <a:extLst>
-                                    <a:ext uri="{28A0092B-C50C-407E-A947-70E740481C1C}">
-                                      <a14:useLocalDpi xmlns:a14="http://schemas.microsoft.com/office/drawing/2010/main" val="0"/>
-                                    </a:ext>
-                                  </a:extLst>
-                                </a:blip>
-                                <a:srcRect/>
-                                <a:stretch>
-                                  <a:fillRect/>
-                                </a:stretch>
-                              </a:blipFill>
-                              <a:ln>
-                                <a:noFill/>
-                              </a:ln>
-                            </wps:spPr>
-                            <wps:style>
-                              <a:lnRef idx="2">
-                                <a:schemeClr val="accent1">
-                                  <a:shade val="15000"/>
-                                </a:schemeClr>
-                              </a:lnRef>
-                              <a:fillRef idx="1">
-                                <a:schemeClr val="accent1"/>
-                              </a:fillRef>
-                              <a:effectRef idx="0">
-                                <a:schemeClr val="accent1"/>
-                              </a:effectRef>
-                              <a:fontRef idx="minor">
-                                <a:schemeClr val="lt1"/>
-                              </a:fontRef>
-                            </wps:style>
-                            <wps:bodyPr rot="0" spcFirstLastPara="0" vertOverflow="overflow" horzOverflow="overflow" vert="horz" wrap="square" lIns="91440" tIns="45720" rIns="91440" bIns="45720" numCol="1" spcCol="0" rtlCol="0" fromWordArt="0" anchor="ctr" anchorCtr="0" forceAA="0" compatLnSpc="1">
-                              <a:prstTxWarp prst="textNoShape">
-                                <a:avLst/>
-                              </a:prstTxWarp>
-                              <a:noAutofit/>
-                            </wps:bodyPr>
-                          </wps:wsp>
-                        </a:graphicData>
-                      </a:graphic>
-                      <wp14:sizeRelH relativeFrom="margin">
-                        <wp14:pctWidth>0</wp14:pctWidth>
-                      </wp14:sizeRelH>
-                      <wp14:sizeRelV relativeFrom="margin">
-                        <wp14:pctHeight>0</wp14:pctHeight>
-                      </wp14:sizeRelV>
-                    </wp:anchor>
-                  </w:drawing>
-                </mc:Choice>
-                <mc:Fallback>
-                  <w:pict>
-                    <v:oval w14:anchorId="2B25572C" id="Oval 10" o:spid="_x0000_s1026" style="position:absolute;margin-left:123.05pt;margin-top:-5.9pt;width:87pt;height:87pt;z-index:251674624;visibility:visible;mso-wrap-style:square;mso-width-percent:0;mso-height-percent:0;mso-wrap-distance-left:9pt;mso-wrap-distance-top:0;mso-wrap-distance-right:9pt;mso-wrap-distance-bottom:0;mso-position-horizontal:absolute;mso-position-horizontal-relative:text;mso-position-vertical:absolute;mso-position-vertical-relative:text;mso-width-percent:0;mso-height-percent:0;mso-width-relative:margin;mso-height-relative:margin;v-text-anchor:middle" o:gfxdata="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" stroked="f" strokeweight="1pt">
-                      <v:fill r:id="rId12" o:title="" recolor="t" rotate="t" type="frame"/>
-                      <v:stroke joinstyle="miter"/>
-                    </v:oval>
-                  </w:pict>
-                </mc:Fallback>
-              </mc:AlternateContent>
-            </w:r>
-          </w:p>
-        </w:tc>
-      </w:tr>
-      <w:tr>
-        <w:trPr>
-          <w:trHeight w:val="1877"/>
-        </w:trPr>
-        <w:tc>
-          <w:tcPr>
-            <w:tcW w:w="4663" w:type="dxa"/>
-            <w:vAlign w:val="center"/>
-          </w:tcPr>
-          <w:p>
-            <w:pPr>
-              <w:rPr>
-                <w:rFonts w:cs="Poppins Medium"/>
-              </w:rPr>
-            </w:pPr>
-            <w:r>
-              <w:rPr>
-                <w:rFonts w:cs="Poppins Medium"/>
-              </w:rPr>
-              <w:t>Member Name:</w:t>
-            </w:r>
-          </w:p>
-          <w:p>
-            <w:pPr>
-              <w:rPr>
-                <w:rFonts w:cs="Poppins Medium"/>
-              </w:rPr>
-            </w:pPr>
-            <w:r>
-              <w:rPr>
-                <w:rFonts w:cs="Poppins Medium"/>
-              </w:rPr>
-              <w:t>Student No:</w:t>
-            </w:r>
-          </w:p>
-          <w:p>
-            <w:r>
-              <w:rPr>
-                <w:rFonts w:cs="Poppins Medium"/>
-              </w:rPr>
-              <w:t>Phone No:</w:t>
-            </w:r>
-          </w:p>
-        </w:tc>
-        <w:tc>
-          <w:tcPr>
-            <w:tcW w:w="4663" w:type="dxa"/>
-            <w:vAlign w:val="center"/>
-          </w:tcPr>
-          <w:p>
-            <w:r>
-              <w:rPr>
-                <w:noProof/>
-              </w:rPr>
-              <mc:AlternateContent>
-                <mc:Choice Requires="wps">
-                  <w:drawing>
-                    <wp:anchor distT="0" distB="0" distL="114300" distR="114300" simplePos="0" relativeHeight="251676672" behindDoc="0" locked="0" layoutInCell="1" allowOverlap="1" wp14:anchorId="42E6F03C" wp14:editId="7AA6AF48">
-                      <wp:simplePos x="0" y="0"/>
-                      <wp:positionH relativeFrom="column">
-                        <wp:posOffset>1569085</wp:posOffset>
-                      </wp:positionH>
-                      <wp:positionV relativeFrom="paragraph">
-                        <wp:posOffset>25400</wp:posOffset>
-                      </wp:positionV>
-                      <wp:extent cx="1104900" cy="1104900"/>
-                      <wp:effectExtent l="0" t="0" r="0" b="0"/>
-                      <wp:wrapNone/>
-                      <wp:docPr id="1189252545" name="Oval 10"/>
-                      <wp:cNvGraphicFramePr/>
-                      <a:graphic xmlns:a="http://schemas.openxmlformats.org/drawingml/2006/main">
-                        <a:graphicData uri="http://schemas.microsoft.com/office/word/2010/wordprocessingShape">
-                          <wps:wsp>
-                            <wps:cNvSpPr/>
-                            <wps:spPr>
-                              <a:xfrm>
-                                <a:off x="0" y="0"/>
-                                <a:ext cx="1104900" cy="1104900"/>
-                              </a:xfrm>
-                              <a:prstGeom prst="ellipse">
-                                <a:avLst/>
-                              </a:prstGeom>
-                              <a:blipFill dpi="0" rotWithShape="1">
-                                <a:blip r:embed="rId11" cstate="print">
-                                  <a:extLst>
-                                    <a:ext uri="{28A0092B-C50C-407E-A947-70E740481C1C}">
-                                      <a14:useLocalDpi xmlns:a14="http://schemas.microsoft.com/office/drawing/2010/main" val="0"/>
-                                    </a:ext>
-                                  </a:extLst>
-                                </a:blip>
-                                <a:srcRect/>
-                                <a:stretch>
-                                  <a:fillRect/>
-                                </a:stretch>
-                              </a:blipFill>
-                              <a:ln>
-                                <a:noFill/>
-                              </a:ln>
-                            </wps:spPr>
-                            <wps:style>
-                              <a:lnRef idx="2">
-                                <a:schemeClr val="accent1">
-                                  <a:shade val="15000"/>
-                                </a:schemeClr>
-                              </a:lnRef>
-                              <a:fillRef idx="1">
-                                <a:schemeClr val="accent1"/>
-                              </a:fillRef>
-                              <a:effectRef idx="0">
-                                <a:schemeClr val="accent1"/>
-                              </a:effectRef>
-                              <a:fontRef idx="minor">
-                                <a:schemeClr val="lt1"/>
-                              </a:fontRef>
-                            </wps:style>
-                            <wps:bodyPr rot="0" spcFirstLastPara="0" vertOverflow="overflow" horzOverflow="overflow" vert="horz" wrap="square" lIns="91440" tIns="45720" rIns="91440" bIns="45720" numCol="1" spcCol="0" rtlCol="0" fromWordArt="0" anchor="ctr" anchorCtr="0" forceAA="0" compatLnSpc="1">
-                              <a:prstTxWarp prst="textNoShape">
-                                <a:avLst/>
-                              </a:prstTxWarp>
-                              <a:noAutofit/>
-                            </wps:bodyPr>
-                          </wps:wsp>
-                        </a:graphicData>
-                      </a:graphic>
-                      <wp14:sizeRelH relativeFrom="margin">
-                        <wp14:pctWidth>0</wp14:pctWidth>
-                      </wp14:sizeRelH>
-                      <wp14:sizeRelV relativeFrom="margin">
-                        <wp14:pctHeight>0</wp14:pctHeight>
-                      </wp14:sizeRelV>
-                    </wp:anchor>
-                  </w:drawing>
-                </mc:Choice>
-                <mc:Fallback>
-                  <w:pict>
-                    <v:oval w14:anchorId="47EDF3AE" id="Oval 10" o:spid="_x0000_s1026" style="position:absolute;margin-left:123.55pt;margin-top:2pt;width:87pt;height:87pt;z-index:251676672;visibility:visible;mso-wrap-style:square;mso-width-percent:0;mso-height-percent:0;mso-wrap-distance-left:9pt;mso-wrap-distance-top:0;mso-wrap-distance-right:9pt;mso-wrap-distance-bottom:0;mso-position-horizontal:absolute;mso-position-horizontal-relative:text;mso-position-vertical:absolute;mso-position-vertical-relative:text;mso-width-percent:0;mso-height-percent:0;mso-width-relative:margin;mso-height-relative:margin;v-text-anchor:middle" o:gfxdata="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" stroked="f" strokeweight="1pt">
-                      <v:fill r:id="rId12" o:title="" recolor="t" rotate="t" type="frame"/>
-                      <v:stroke joinstyle="miter"/>
-                    </v:oval>
-                  </w:pict>
-                </mc:Fallback>
-              </mc:AlternateContent>
-            </w:r>
-          </w:p>
-        </w:tc>
-      </w:tr>
-      <w:tr>
-        <w:trPr>
-          <w:trHeight w:val="1943"/>
-        </w:trPr>
-        <w:tc>
-          <w:tcPr>
-            <w:tcW w:w="4663" w:type="dxa"/>
-            <w:vAlign w:val="center"/>
-          </w:tcPr>
-          <w:p>
-            <w:pPr>
-              <w:rPr>
-                <w:rFonts w:cs="Poppins Medium"/>
-              </w:rPr>
-            </w:pPr>
-            <w:r>
-              <w:rPr>
-                <w:rFonts w:cs="Poppins Medium"/>
-              </w:rPr>
-              <w:t>Member Name:</w:t>
-            </w:r>
-          </w:p>
-          <w:p>
-            <w:pPr>
-              <w:rPr>
-                <w:rFonts w:cs="Poppins Medium"/>
-              </w:rPr>
-            </w:pPr>
-            <w:r>
-              <w:rPr>
-                <w:rFonts w:cs="Poppins Medium"/>
-              </w:rPr>
-              <w:t>Student No:</w:t>
-            </w:r>
-          </w:p>
-          <w:p>
-            <w:r>
-              <w:rPr>
-                <w:rFonts w:cs="Poppins Medium"/>
-              </w:rPr>
-              <w:t>Phone No:</w:t>
-            </w:r>
-          </w:p>
-        </w:tc>
-        <w:tc>
-          <w:tcPr>
-            <w:tcW w:w="4663" w:type="dxa"/>
-            <w:vAlign w:val="center"/>
-          </w:tcPr>
-          <w:p>
-            <w:r>
-              <w:rPr>
-                <w:noProof/>
-              </w:rPr>
-              <mc:AlternateContent>
-                <mc:Choice Requires="wps">
-                  <w:drawing>
-                    <wp:anchor distT="0" distB="0" distL="114300" distR="114300" simplePos="0" relativeHeight="251678720" behindDoc="0" locked="0" layoutInCell="1" allowOverlap="1" wp14:anchorId="1058E076" wp14:editId="2DFD6BA4">
-                      <wp:simplePos x="0" y="0"/>
-                      <wp:positionH relativeFrom="column">
-                        <wp:posOffset>1561465</wp:posOffset>
-                      </wp:positionH>
-                      <wp:positionV relativeFrom="paragraph">
-                        <wp:posOffset>36830</wp:posOffset>
-                      </wp:positionV>
-                      <wp:extent cx="1104900" cy="1104900"/>
-                      <wp:effectExtent l="0" t="0" r="0" b="0"/>
-                      <wp:wrapNone/>
-                      <wp:docPr id="838855957" name="Oval 10"/>
-                      <wp:cNvGraphicFramePr/>
-                      <a:graphic xmlns:a="http://schemas.openxmlformats.org/drawingml/2006/main">
-                        <a:graphicData uri="http://schemas.microsoft.com/office/word/2010/wordprocessingShape">
-                          <wps:wsp>
-                            <wps:cNvSpPr/>
-                            <wps:spPr>
-                              <a:xfrm>
-                                <a:off x="0" y="0"/>
-                                <a:ext cx="1104900" cy="1104900"/>
-                              </a:xfrm>
-                              <a:prstGeom prst="ellipse">
-                                <a:avLst/>
-                              </a:prstGeom>
-                              <a:blipFill dpi="0" rotWithShape="1">
-                                <a:blip r:embed="rId11" cstate="print">
-                                  <a:extLst>
-                                    <a:ext uri="{28A0092B-C50C-407E-A947-70E740481C1C}">
-                                      <a14:useLocalDpi xmlns:a14="http://schemas.microsoft.com/office/drawing/2010/main" val="0"/>
-                                    </a:ext>
-                                  </a:extLst>
-                                </a:blip>
-                                <a:srcRect/>
-                                <a:stretch>
-                                  <a:fillRect/>
-                                </a:stretch>
-                              </a:blipFill>
-                              <a:ln>
-                                <a:noFill/>
-                              </a:ln>
-                            </wps:spPr>
-                            <wps:style>
-                              <a:lnRef idx="2">
-                                <a:schemeClr val="accent1">
-                                  <a:shade val="15000"/>
-                                </a:schemeClr>
-                              </a:lnRef>
-                              <a:fillRef idx="1">
-                                <a:schemeClr val="accent1"/>
-                              </a:fillRef>
-                              <a:effectRef idx="0">
-                                <a:schemeClr val="accent1"/>
-                              </a:effectRef>
-                              <a:fontRef idx="minor">
-                                <a:schemeClr val="lt1"/>
-                              </a:fontRef>
-                            </wps:style>
-                            <wps:bodyPr rot="0" spcFirstLastPara="0" vertOverflow="overflow" horzOverflow="overflow" vert="horz" wrap="square" lIns="91440" tIns="45720" rIns="91440" bIns="45720" numCol="1" spcCol="0" rtlCol="0" fromWordArt="0" anchor="ctr" anchorCtr="0" forceAA="0" compatLnSpc="1">
-                              <a:prstTxWarp prst="textNoShape">
-                                <a:avLst/>
-                              </a:prstTxWarp>
-                              <a:noAutofit/>
-                            </wps:bodyPr>
-                          </wps:wsp>
-                        </a:graphicData>
-                      </a:graphic>
-                      <wp14:sizeRelH relativeFrom="margin">
-                        <wp14:pctWidth>0</wp14:pctWidth>
-                      </wp14:sizeRelH>
-                      <wp14:sizeRelV relativeFrom="margin">
-                        <wp14:pctHeight>0</wp14:pctHeight>
-                      </wp14:sizeRelV>
-                    </wp:anchor>
-                  </w:drawing>
-                </mc:Choice>
-                <mc:Fallback>
-                  <w:pict>
-                    <v:oval w14:anchorId="3AE68646" id="Oval 10" o:spid="_x0000_s1026" style="position:absolute;margin-left:122.95pt;margin-top:2.9pt;width:87pt;height:87pt;z-index:251678720;visibility:visible;mso-wrap-style:square;mso-width-percent:0;mso-height-percent:0;mso-wrap-distance-left:9pt;mso-wrap-distance-top:0;mso-wrap-distance-right:9pt;mso-wrap-distance-bottom:0;mso-position-horizontal:absolute;mso-position-horizontal-relative:text;mso-position-vertical:absolute;mso-position-vertical-relative:text;mso-width-percent:0;mso-height-percent:0;mso-width-relative:margin;mso-height-relative:margin;v-text-anchor:middle" o:gfxdata="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" stroked="f" strokeweight="1pt">
-                      <v:fill r:id="rId12" o:title="" recolor="t" rotate="t" type="frame"/>
-                      <v:stroke joinstyle="miter"/>
-                    </v:oval>
-                  </w:pict>
-                </mc:Fallback>
-              </mc:AlternateContent>
-            </w:r>
-          </w:p>
-        </w:tc>
-      </w:tr>
-      <w:tr>
-        <w:trPr>
-          <w:trHeight w:val="1970"/>
-        </w:trPr>
-        <w:tc>
-          <w:tcPr>
-            <w:tcW w:w="4663" w:type="dxa"/>
-            <w:vAlign w:val="center"/>
-          </w:tcPr>
-          <w:p>
-            <w:pPr>
-              <w:rPr>
-                <w:rFonts w:cs="Poppins Medium"/>
-              </w:rPr>
-            </w:pPr>
-            <w:r>
-              <w:rPr>
-                <w:rFonts w:cs="Poppins Medium"/>
-              </w:rPr>
-              <w:t>Member Name:</w:t>
-            </w:r>
-          </w:p>
-          <w:p>
-            <w:pPr>
-              <w:rPr>
-                <w:rFonts w:cs="Poppins Medium"/>
-              </w:rPr>
-            </w:pPr>
-            <w:r>
-              <w:rPr>
-                <w:rFonts w:cs="Poppins Medium"/>
-              </w:rPr>
-              <w:t>Student No:</w:t>
-            </w:r>
-          </w:p>
-          <w:p>
-            <w:r>
-              <w:rPr>
-                <w:rFonts w:cs="Poppins Medium"/>
-              </w:rPr>
-              <w:t>Phone No:</w:t>
-            </w:r>
-          </w:p>
-        </w:tc>
-        <w:tc>
-          <w:tcPr>
-            <w:tcW w:w="4663" w:type="dxa"/>
-            <w:vAlign w:val="center"/>
-          </w:tcPr>
-          <w:p>
-            <w:r>
-              <w:rPr>
-                <w:noProof/>
-              </w:rPr>
-              <mc:AlternateContent>
-                <mc:Choice Requires="wps">
-                  <w:drawing>
-                    <wp:anchor distT="0" distB="0" distL="114300" distR="114300" simplePos="0" relativeHeight="251680768" behindDoc="0" locked="0" layoutInCell="1" allowOverlap="1" wp14:anchorId="69F3BC0A" wp14:editId="192DD4CB">
-                      <wp:simplePos x="0" y="0"/>
-                      <wp:positionH relativeFrom="column">
-                        <wp:posOffset>1566545</wp:posOffset>
-                      </wp:positionH>
-                      <wp:positionV relativeFrom="paragraph">
-                        <wp:posOffset>3810</wp:posOffset>
-                      </wp:positionV>
-                      <wp:extent cx="1104900" cy="1104900"/>
-                      <wp:effectExtent l="0" t="0" r="0" b="0"/>
-                      <wp:wrapNone/>
-                      <wp:docPr id="631940281" name="Oval 10"/>
-                      <wp:cNvGraphicFramePr/>
-                      <a:graphic xmlns:a="http://schemas.openxmlformats.org/drawingml/2006/main">
-                        <a:graphicData uri="http://schemas.microsoft.com/office/word/2010/wordprocessingShape">
-                          <wps:wsp>
-                            <wps:cNvSpPr/>
-                            <wps:spPr>
-                              <a:xfrm>
-                                <a:off x="0" y="0"/>
-                                <a:ext cx="1104900" cy="1104900"/>
-                              </a:xfrm>
-                              <a:prstGeom prst="ellipse">
-                                <a:avLst/>
-                              </a:prstGeom>
-                              <a:blipFill dpi="0" rotWithShape="1">
-                                <a:blip r:embed="rId11" cstate="print">
-                                  <a:extLst>
-                                    <a:ext uri="{28A0092B-C50C-407E-A947-70E740481C1C}">
-                                      <a14:useLocalDpi xmlns:a14="http://schemas.microsoft.com/office/drawing/2010/main" val="0"/>
-                                    </a:ext>
-                                  </a:extLst>
-                                </a:blip>
-                                <a:srcRect/>
-                                <a:stretch>
-                                  <a:fillRect/>
-                                </a:stretch>
-                              </a:blipFill>
-                              <a:ln>
-                                <a:noFill/>
-                              </a:ln>
-                            </wps:spPr>
-                            <wps:style>
-                              <a:lnRef idx="2">
-                                <a:schemeClr val="accent1">
-                                  <a:shade val="15000"/>
-                                </a:schemeClr>
-                              </a:lnRef>
-                              <a:fillRef idx="1">
-                                <a:schemeClr val="accent1"/>
-                              </a:fillRef>
-                              <a:effectRef idx="0">
-                                <a:schemeClr val="accent1"/>
-                              </a:effectRef>
-                              <a:fontRef idx="minor">
-                                <a:schemeClr val="lt1"/>
-                              </a:fontRef>
-                            </wps:style>
-                            <wps:bodyPr rot="0" spcFirstLastPara="0" vertOverflow="overflow" horzOverflow="overflow" vert="horz" wrap="square" lIns="91440" tIns="45720" rIns="91440" bIns="45720" numCol="1" spcCol="0" rtlCol="0" fromWordArt="0" anchor="ctr" anchorCtr="0" forceAA="0" compatLnSpc="1">
-                              <a:prstTxWarp prst="textNoShape">
-                                <a:avLst/>
-                              </a:prstTxWarp>
-                              <a:noAutofit/>
-                            </wps:bodyPr>
-                          </wps:wsp>
-                        </a:graphicData>
-                      </a:graphic>
-                      <wp14:sizeRelH relativeFrom="margin">
-                        <wp14:pctWidth>0</wp14:pctWidth>
-                      </wp14:sizeRelH>
-                      <wp14:sizeRelV relativeFrom="margin">
-                        <wp14:pctHeight>0</wp14:pctHeight>
-                      </wp14:sizeRelV>
-                    </wp:anchor>
-                  </w:drawing>
-                </mc:Choice>
-                <mc:Fallback>
-                  <w:pict>
-                    <v:oval w14:anchorId="1386DFDA" id="Oval 10" o:spid="_x0000_s1026" style="position:absolute;margin-left:123.35pt;margin-top:.3pt;width:87pt;height:87pt;z-index:251680768;visibility:visible;mso-wrap-style:square;mso-width-percent:0;mso-height-percent:0;mso-wrap-distance-left:9pt;mso-wrap-distance-top:0;mso-wrap-distance-right:9pt;mso-wrap-distance-bottom:0;mso-position-horizontal:absolute;mso-position-horizontal-relative:text;mso-position-vertical:absolute;mso-position-vertical-relative:text;mso-width-percent:0;mso-height-percent:0;mso-width-relative:margin;mso-height-relative:margin;v-text-anchor:middle" o:gfxdata="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" stroked="f" strokeweight="1pt">
-                      <v:fill r:id="rId12" o:title="" recolor="t" rotate="t" type="frame"/>
-                      <v:stroke joinstyle="miter"/>
-                    </v:oval>
-                  </w:pict>
-                </mc:Fallback>
-              </mc:AlternateContent>
-            </w:r>
-          </w:p>
-        </w:tc>
-      </w:tr>
-      <w:tr>
-        <w:trPr>
-          <w:trHeight w:val="2060"/>
-        </w:trPr>
-        <w:tc>
-          <w:tcPr>
-            <w:tcW w:w="4663" w:type="dxa"/>
-            <w:vAlign w:val="center"/>
-          </w:tcPr>
-          <w:p>
-            <w:pPr>
-              <w:rPr>
-                <w:rFonts w:cs="Poppins Medium"/>
-              </w:rPr>
-            </w:pPr>
-            <w:r>
-              <w:rPr>
-                <w:rFonts w:cs="Poppins Medium"/>
-              </w:rPr>
-              <w:t>Member Name:</w:t>
-            </w:r>
-          </w:p>
-          <w:p>
-            <w:pPr>
-              <w:rPr>
-                <w:rFonts w:cs="Poppins Medium"/>
-              </w:rPr>
-            </w:pPr>
-            <w:r>
-              <w:rPr>
-                <w:rFonts w:cs="Poppins Medium"/>
-              </w:rPr>
-              <w:t>Student No:</w:t>
-            </w:r>
-          </w:p>
-          <w:p>
-            <w:r>
-              <w:rPr>
-                <w:rFonts w:cs="Poppins Medium"/>
-              </w:rPr>
-              <w:t>Phone No:</w:t>
-            </w:r>
-          </w:p>
-        </w:tc>
-        <w:tc>
-          <w:tcPr>
-            <w:tcW w:w="4663" w:type="dxa"/>
-            <w:vAlign w:val="center"/>
-          </w:tcPr>
-          <w:p>
-            <w:r>
-              <w:rPr>
-                <w:noProof/>
-              </w:rPr>
-              <mc:AlternateContent>
-                <mc:Choice Requires="wps">
-                  <w:drawing>
-                    <wp:anchor distT="0" distB="0" distL="114300" distR="114300" simplePos="0" relativeHeight="251682816" behindDoc="0" locked="0" layoutInCell="1" allowOverlap="1" wp14:anchorId="7B4028C2" wp14:editId="0B7E92FC">
-                      <wp:simplePos x="0" y="0"/>
-                      <wp:positionH relativeFrom="column">
-                        <wp:posOffset>1564005</wp:posOffset>
-                      </wp:positionH>
-                      <wp:positionV relativeFrom="paragraph">
-                        <wp:posOffset>12700</wp:posOffset>
-                      </wp:positionV>
-                      <wp:extent cx="1104900" cy="1104900"/>
-                      <wp:effectExtent l="0" t="0" r="0" b="0"/>
-                      <wp:wrapNone/>
-                      <wp:docPr id="766218724" name="Oval 10"/>
-                      <wp:cNvGraphicFramePr/>
-                      <a:graphic xmlns:a="http://schemas.openxmlformats.org/drawingml/2006/main">
-                        <a:graphicData uri="http://schemas.microsoft.com/office/word/2010/wordprocessingShape">
-                          <wps:wsp>
-                            <wps:cNvSpPr/>
-                            <wps:spPr>
-                              <a:xfrm>
-                                <a:off x="0" y="0"/>
-                                <a:ext cx="1104900" cy="1104900"/>
-                              </a:xfrm>
-                              <a:prstGeom prst="ellipse">
-                                <a:avLst/>
-                              </a:prstGeom>
-                              <a:blipFill dpi="0" rotWithShape="1">
-                                <a:blip r:embed="rId11" cstate="print">
-                                  <a:extLst>
-                                    <a:ext uri="{28A0092B-C50C-407E-A947-70E740481C1C}">
-                                      <a14:useLocalDpi xmlns:a14="http://schemas.microsoft.com/office/drawing/2010/main" val="0"/>
-                                    </a:ext>
-                                  </a:extLst>
-                                </a:blip>
-                                <a:srcRect/>
-                                <a:stretch>
-                                  <a:fillRect/>
-                                </a:stretch>
-                              </a:blipFill>
-                              <a:ln>
-                                <a:noFill/>
-                              </a:ln>
-                            </wps:spPr>
-                            <wps:style>
-                              <a:lnRef idx="2">
-                                <a:schemeClr val="accent1">
-                                  <a:shade val="15000"/>
-                                </a:schemeClr>
-                              </a:lnRef>
-                              <a:fillRef idx="1">
-                                <a:schemeClr val="accent1"/>
-                              </a:fillRef>
-                              <a:effectRef idx="0">
-                                <a:schemeClr val="accent1"/>
-                              </a:effectRef>
-                              <a:fontRef idx="minor">
-                                <a:schemeClr val="lt1"/>
-                              </a:fontRef>
-                            </wps:style>
-                            <wps:bodyPr rot="0" spcFirstLastPara="0" vertOverflow="overflow" horzOverflow="overflow" vert="horz" wrap="square" lIns="91440" tIns="45720" rIns="91440" bIns="45720" numCol="1" spcCol="0" rtlCol="0" fromWordArt="0" anchor="ctr" anchorCtr="0" forceAA="0" compatLnSpc="1">
-                              <a:prstTxWarp prst="textNoShape">
-                                <a:avLst/>
-                              </a:prstTxWarp>
-                              <a:noAutofit/>
-                            </wps:bodyPr>
-                          </wps:wsp>
-                        </a:graphicData>
-                      </a:graphic>
-                      <wp14:sizeRelH relativeFrom="margin">
-                        <wp14:pctWidth>0</wp14:pctWidth>
-                      </wp14:sizeRelH>
-                      <wp14:sizeRelV relativeFrom="margin">
-                        <wp14:pctHeight>0</wp14:pctHeight>
-                      </wp14:sizeRelV>
-                    </wp:anchor>
-                  </w:drawing>
-                </mc:Choice>
-                <mc:Fallback>
-                  <w:pict>
-                    <v:oval w14:anchorId="4D59DF05" id="Oval 10" o:spid="_x0000_s1026" style="position:absolute;margin-left:123.15pt;margin-top:1pt;width:87pt;height:87pt;z-index:251682816;visibility:visible;mso-wrap-style:square;mso-width-percent:0;mso-height-percent:0;mso-wrap-distance-left:9pt;mso-wrap-distance-top:0;mso-wrap-distance-right:9pt;mso-wrap-distance-bottom:0;mso-position-horizontal:absolute;mso-position-horizontal-relative:text;mso-position-vertical:absolute;mso-position-vertical-relative:text;mso-width-percent:0;mso-height-percent:0;mso-width-relative:margin;mso-height-relative:margin;v-text-anchor:middle" o:gfxdata="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" stroked="f" strokeweight="1pt">
-                      <v:fill r:id="rId12" o:title="" recolor="t" rotate="t" type="frame"/>
-                      <v:stroke joinstyle="miter"/>
-                    </v:oval>
-                  </w:pict>
-                </mc:Fallback>
-              </mc:AlternateContent>
-            </w:r>
-          </w:p>
-        </w:tc>
-      </w:tr>
-    </w:tbl>
-    <w:p/>
+    <w:p>
+      <w:r>
+        <w:rPr>
+          <w:noProof/>
+        </w:rPr>
+        <mc:AlternateContent>
+          <mc:Choice Requires="wps">
+            <w:drawing>
+              <wp:anchor distT="0" distB="0" distL="114300" distR="114300" simplePos="0" relativeHeight="251702272" behindDoc="0" locked="0" layoutInCell="1" allowOverlap="1" wp14:anchorId="4A2ED01A" wp14:editId="52EDFBEC">
+                <wp:simplePos x="0" y="0"/>
+                <wp:positionH relativeFrom="column">
+                  <wp:posOffset>1917340</wp:posOffset>
+                </wp:positionH>
+                <wp:positionV relativeFrom="paragraph">
+                  <wp:posOffset>5683323</wp:posOffset>
+                </wp:positionV>
+                <wp:extent cx="2832265" cy="908463"/>
+                <wp:effectExtent l="0" t="0" r="6350" b="6350"/>
+                <wp:wrapNone/>
+                <wp:docPr id="2145072715" name="Text Box 20"/>
+                <wp:cNvGraphicFramePr/>
+                <a:graphic xmlns:a="http://schemas.openxmlformats.org/drawingml/2006/main">
+                  <a:graphicData uri="http://schemas.microsoft.com/office/word/2010/wordprocessingShape">
+                    <wps:wsp>
+                      <wps:cNvSpPr txBox="1"/>
+                      <wps:spPr>
+                        <a:xfrm>
+                          <a:off x="0" y="0"/>
+                          <a:ext cx="2832265" cy="908463"/>
+                        </a:xfrm>
+                        <a:prstGeom prst="rect">
+                          <a:avLst/>
+                        </a:prstGeom>
+                        <a:solidFill>
+                          <a:schemeClr val="lt1"/>
+                        </a:solidFill>
+                        <a:ln w="6350">
+                          <a:noFill/>
+                        </a:ln>
+                      </wps:spPr>
+                      <wps:txbx>
+                        <w:txbxContent>
+                          <w:p>
+                            <w:pPr>
+                              <w:rPr>
+                                <w:rFonts w:cs="Poppins Medium"/>
+                              </w:rPr>
+                            </w:pPr>
+                            <w:r>
+                              <w:rPr>
+                                <w:rFonts w:cs="Poppins Medium"/>
+                              </w:rPr>
+                              <w:t xml:space="preserve">Member </w:t>
+                            </w:r>
+                            <w:proofErr w:type="gramStart"/>
+                            <w:r>
+                              <w:rPr>
+                                <w:rFonts w:cs="Poppins Medium"/>
+                              </w:rPr>
+                              <w:t>Name</w:t>
+                            </w:r>
+                            <w:r>
+                              <w:rPr>
+                                <w:rFonts w:cs="Poppins Medium"/>
+                              </w:rPr>
+                              <w:t xml:space="preserve"> </w:t>
+                            </w:r>
+                            <w:r>
+                              <w:rPr>
+                                <w:rFonts w:cs="Poppins Medium"/>
+                              </w:rPr>
+                              <w:t>:</w:t>
+                            </w:r>
+                            <w:proofErr w:type="gramEnd"/>
+                          </w:p>
+                          <w:p>
+                            <w:pPr>
+                              <w:rPr>
+                                <w:rFonts w:cs="Poppins Medium"/>
+                              </w:rPr>
+                            </w:pPr>
+                            <w:r>
+                              <w:rPr>
+                                <w:rFonts w:cs="Poppins Medium"/>
+                              </w:rPr>
+                              <w:t>Student No</w:t>
+                            </w:r>
+                            <w:r>
+                              <w:rPr>
+                                <w:rFonts w:cs="Poppins Medium"/>
+                              </w:rPr>
+                              <w:tab/>
+                              <w:t xml:space="preserve"> </w:t>
+                            </w:r>
+                            <w:proofErr w:type="gramStart"/>
+                            <w:r>
+                              <w:rPr>
+                                <w:rFonts w:cs="Poppins Medium"/>
+                              </w:rPr>
+                              <w:t xml:space="preserve"> </w:t>
+                            </w:r>
+                            <w:r>
+                              <w:rPr>
+                                <w:rFonts w:cs="Poppins Medium"/>
+                              </w:rPr>
+                              <w:t xml:space="preserve"> </w:t>
+                            </w:r>
+                            <w:r>
+                              <w:rPr>
+                                <w:rFonts w:cs="Poppins Medium"/>
+                              </w:rPr>
+                              <w:t>:</w:t>
+                            </w:r>
+                            <w:proofErr w:type="gramEnd"/>
+                          </w:p>
+                          <w:p>
+                            <w:r>
+                              <w:rPr>
+                                <w:rFonts w:cs="Poppins Medium"/>
+                              </w:rPr>
+                              <w:t xml:space="preserve">Phone </w:t>
+                            </w:r>
+                            <w:proofErr w:type="gramStart"/>
+                            <w:r>
+                              <w:rPr>
+                                <w:rFonts w:cs="Poppins Medium"/>
+                              </w:rPr>
+                              <w:t>No</w:t>
+                            </w:r>
+                            <w:r>
+                              <w:rPr>
+                                <w:rFonts w:cs="Poppins Medium"/>
+                              </w:rPr>
+                              <w:t xml:space="preserve">  </w:t>
+                            </w:r>
+                            <w:r>
+                              <w:rPr>
+                                <w:rFonts w:cs="Poppins Medium"/>
+                              </w:rPr>
+                              <w:tab/>
+                            </w:r>
+                            <w:proofErr w:type="gramEnd"/>
+                            <w:r>
+                              <w:rPr>
+                                <w:rFonts w:cs="Poppins Medium"/>
+                              </w:rPr>
+                              <w:t xml:space="preserve"> </w:t>
+                            </w:r>
+                            <w:proofErr w:type="gramStart"/>
+                            <w:r>
+                              <w:rPr>
+                                <w:rFonts w:cs="Poppins Medium"/>
+                              </w:rPr>
+                              <w:t xml:space="preserve"> </w:t>
+                            </w:r>
+                            <w:r>
+                              <w:rPr>
+                                <w:rFonts w:cs="Poppins Medium"/>
+                              </w:rPr>
+                              <w:t xml:space="preserve"> </w:t>
+                            </w:r>
+                            <w:r>
+                              <w:rPr>
+                                <w:rFonts w:cs="Poppins Medium"/>
+                              </w:rPr>
+                              <w:t>:</w:t>
+                            </w:r>
+                            <w:proofErr w:type="gramEnd"/>
+                          </w:p>
+                        </w:txbxContent>
+                      </wps:txbx>
+                      <wps:bodyPr rot="0" spcFirstLastPara="0" vertOverflow="overflow" horzOverflow="overflow" vert="horz" wrap="square" lIns="91440" tIns="45720" rIns="91440" bIns="45720" numCol="1" spcCol="0" rtlCol="0" fromWordArt="0" anchor="t" anchorCtr="0" forceAA="0" compatLnSpc="1">
+                        <a:prstTxWarp prst="textNoShape">
+                          <a:avLst/>
+                        </a:prstTxWarp>
+                        <a:noAutofit/>
+                      </wps:bodyPr>
+                    </wps:wsp>
+                  </a:graphicData>
+                </a:graphic>
+                <wp14:sizeRelH relativeFrom="margin">
+                  <wp14:pctWidth>0</wp14:pctWidth>
+                </wp14:sizeRelH>
+                <wp14:sizeRelV relativeFrom="margin">
+                  <wp14:pctHeight>0</wp14:pctHeight>
+                </wp14:sizeRelV>
+              </wp:anchor>
+            </w:drawing>
+          </mc:Choice>
+          <mc:Fallback>
+            <w:pict>
+              <v:shapetype w14:anchorId="4A2ED01A" id="_x0000_t202" coordsize="21600,21600" o:spt="202" path="m,l,21600r21600,l21600,xe">
+                <v:stroke joinstyle="miter"/>
+                <v:path gradientshapeok="t" o:connecttype="rect"/>
+              </v:shapetype>
+              <v:shape id="Text Box 20" o:spid="_x0000_s1026" type="#_x0000_t202" style="position:absolute;margin-left:150.95pt;margin-top:447.5pt;width:223pt;height:71.55pt;z-index:251702272;visibility:visible;mso-wrap-style:square;mso-width-percent:0;mso-height-percent:0;mso-wrap-distance-left:9pt;mso-wrap-distance-top:0;mso-wrap-distance-right:9pt;mso-wrap-distance-bottom:0;mso-position-horizontal:absolute;mso-position-horizontal-relative:text;mso-position-vertical:absolute;mso-position-vertical-relative:text;mso-width-percent:0;mso-height-percent:0;mso-width-relative:margin;mso-height-relative:margin;v-text-anchor:top" o:gfxdata="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" fillcolor="white [3201]" stroked="f" strokeweight=".5pt">
+                <v:textbox>
+                  <w:txbxContent>
+                    <w:p>
+                      <w:pPr>
+                        <w:rPr>
+                          <w:rFonts w:cs="Poppins Medium"/>
+                        </w:rPr>
+                      </w:pPr>
+                      <w:r>
+                        <w:rPr>
+                          <w:rFonts w:cs="Poppins Medium"/>
+                        </w:rPr>
+                        <w:t xml:space="preserve">Member </w:t>
+                      </w:r>
+                      <w:proofErr w:type="gramStart"/>
+                      <w:r>
+                        <w:rPr>
+                          <w:rFonts w:cs="Poppins Medium"/>
+                        </w:rPr>
+                        <w:t>Name</w:t>
+                      </w:r>
+                      <w:r>
+                        <w:rPr>
+                          <w:rFonts w:cs="Poppins Medium"/>
+                        </w:rPr>
+                        <w:t xml:space="preserve"> </w:t>
+                      </w:r>
+                      <w:r>
+                        <w:rPr>
+                          <w:rFonts w:cs="Poppins Medium"/>
+                        </w:rPr>
+                        <w:t>:</w:t>
+                      </w:r>
+                      <w:proofErr w:type="gramEnd"/>
+                    </w:p>
+                    <w:p>
+                      <w:pPr>
+                        <w:rPr>
+                          <w:rFonts w:cs="Poppins Medium"/>
+                        </w:rPr>
+                      </w:pPr>
+                      <w:r>
+                        <w:rPr>
+                          <w:rFonts w:cs="Poppins Medium"/>
+                        </w:rPr>
+                        <w:t>Student No</w:t>
+                      </w:r>
+                      <w:r>
+                        <w:rPr>
+                          <w:rFonts w:cs="Poppins Medium"/>
+                        </w:rPr>
+                        <w:tab/>
+                        <w:t xml:space="preserve"> </w:t>
+                      </w:r>
+                      <w:proofErr w:type="gramStart"/>
+                      <w:r>
+                        <w:rPr>
+                          <w:rFonts w:cs="Poppins Medium"/>
+                        </w:rPr>
+                        <w:t xml:space="preserve"> </w:t>
+                      </w:r>
+                      <w:r>
+                        <w:rPr>
+                          <w:rFonts w:cs="Poppins Medium"/>
+                        </w:rPr>
+                        <w:t xml:space="preserve"> </w:t>
+                      </w:r>
+                      <w:r>
+                        <w:rPr>
+                          <w:rFonts w:cs="Poppins Medium"/>
+                        </w:rPr>
+                        <w:t>:</w:t>
+                      </w:r>
+                      <w:proofErr w:type="gramEnd"/>
+                    </w:p>
+                    <w:p>
+                      <w:r>
+                        <w:rPr>
+                          <w:rFonts w:cs="Poppins Medium"/>
+                        </w:rPr>
+                        <w:t xml:space="preserve">Phone </w:t>
+                      </w:r>
+                      <w:proofErr w:type="gramStart"/>
+                      <w:r>
+                        <w:rPr>
+                          <w:rFonts w:cs="Poppins Medium"/>
+                        </w:rPr>
+                        <w:t>No</w:t>
+                      </w:r>
+                      <w:r>
+                        <w:rPr>
+                          <w:rFonts w:cs="Poppins Medium"/>
+                        </w:rPr>
+                        <w:t xml:space="preserve">  </w:t>
+                      </w:r>
+                      <w:r>
+                        <w:rPr>
+                          <w:rFonts w:cs="Poppins Medium"/>
+                        </w:rPr>
+                        <w:tab/>
+                      </w:r>
+                      <w:proofErr w:type="gramEnd"/>
+                      <w:r>
+                        <w:rPr>
+                          <w:rFonts w:cs="Poppins Medium"/>
+                        </w:rPr>
+                        <w:t xml:space="preserve"> </w:t>
+                      </w:r>
+                      <w:proofErr w:type="gramStart"/>
+                      <w:r>
+                        <w:rPr>
+                          <w:rFonts w:cs="Poppins Medium"/>
+                        </w:rPr>
+                        <w:t xml:space="preserve"> </w:t>
+                      </w:r>
+                      <w:r>
+                        <w:rPr>
+                          <w:rFonts w:cs="Poppins Medium"/>
+                        </w:rPr>
+                        <w:t xml:space="preserve"> </w:t>
+                      </w:r>
+                      <w:r>
+                        <w:rPr>
+                          <w:rFonts w:cs="Poppins Medium"/>
+                        </w:rPr>
+                        <w:t>:</w:t>
+                      </w:r>
+                      <w:proofErr w:type="gramEnd"/>
+                    </w:p>
+                  </w:txbxContent>
+                </v:textbox>
+              </v:shape>
+            </w:pict>
+          </mc:Fallback>
+        </mc:AlternateContent>
+      </w:r>
+      <w:r>
+        <w:rPr>
+          <w:noProof/>
+        </w:rPr>
+        <mc:AlternateContent>
+          <mc:Choice Requires="wps">
+            <w:drawing>
+              <wp:anchor distT="0" distB="0" distL="114300" distR="114300" simplePos="0" relativeHeight="251700224" behindDoc="0" locked="0" layoutInCell="1" allowOverlap="1" wp14:anchorId="48999853" wp14:editId="13C27707">
+                <wp:simplePos x="0" y="0"/>
+                <wp:positionH relativeFrom="column">
+                  <wp:posOffset>1926003</wp:posOffset>
+                </wp:positionH>
+                <wp:positionV relativeFrom="paragraph">
+                  <wp:posOffset>4293754</wp:posOffset>
+                </wp:positionV>
+                <wp:extent cx="2832265" cy="908463"/>
+                <wp:effectExtent l="0" t="0" r="6350" b="6350"/>
+                <wp:wrapNone/>
+                <wp:docPr id="377664830" name="Text Box 20"/>
+                <wp:cNvGraphicFramePr/>
+                <a:graphic xmlns:a="http://schemas.openxmlformats.org/drawingml/2006/main">
+                  <a:graphicData uri="http://schemas.microsoft.com/office/word/2010/wordprocessingShape">
+                    <wps:wsp>
+                      <wps:cNvSpPr txBox="1"/>
+                      <wps:spPr>
+                        <a:xfrm>
+                          <a:off x="0" y="0"/>
+                          <a:ext cx="2832265" cy="908463"/>
+                        </a:xfrm>
+                        <a:prstGeom prst="rect">
+                          <a:avLst/>
+                        </a:prstGeom>
+                        <a:solidFill>
+                          <a:schemeClr val="lt1"/>
+                        </a:solidFill>
+                        <a:ln w="6350">
+                          <a:noFill/>
+                        </a:ln>
+                      </wps:spPr>
+                      <wps:txbx>
+                        <w:txbxContent>
+                          <w:p>
+                            <w:pPr>
+                              <w:rPr>
+                                <w:rFonts w:cs="Poppins Medium"/>
+                              </w:rPr>
+                            </w:pPr>
+                            <w:r>
+                              <w:rPr>
+                                <w:rFonts w:cs="Poppins Medium"/>
+                              </w:rPr>
+                              <w:t xml:space="preserve">Member </w:t>
+                            </w:r>
+                            <w:proofErr w:type="gramStart"/>
+                            <w:r>
+                              <w:rPr>
+                                <w:rFonts w:cs="Poppins Medium"/>
+                              </w:rPr>
+                              <w:t>Name</w:t>
+                            </w:r>
+                            <w:r>
+                              <w:rPr>
+                                <w:rFonts w:cs="Poppins Medium"/>
+                              </w:rPr>
+                              <w:t xml:space="preserve"> </w:t>
+                            </w:r>
+                            <w:r>
+                              <w:rPr>
+                                <w:rFonts w:cs="Poppins Medium"/>
+                              </w:rPr>
+                              <w:t>:</w:t>
+                            </w:r>
+                            <w:proofErr w:type="gramEnd"/>
+                          </w:p>
+                          <w:p>
+                            <w:pPr>
+                              <w:rPr>
+                                <w:rFonts w:cs="Poppins Medium"/>
+                              </w:rPr>
+                            </w:pPr>
+                            <w:r>
+                              <w:rPr>
+                                <w:rFonts w:cs="Poppins Medium"/>
+                              </w:rPr>
+                              <w:t>Student No</w:t>
+                            </w:r>
+                            <w:r>
+                              <w:rPr>
+                                <w:rFonts w:cs="Poppins Medium"/>
+                              </w:rPr>
+                              <w:tab/>
+                              <w:t xml:space="preserve"> </w:t>
+                            </w:r>
+                            <w:proofErr w:type="gramStart"/>
+                            <w:r>
+                              <w:rPr>
+                                <w:rFonts w:cs="Poppins Medium"/>
+                              </w:rPr>
+                              <w:t xml:space="preserve"> </w:t>
+                            </w:r>
+                            <w:r>
+                              <w:rPr>
+                                <w:rFonts w:cs="Poppins Medium"/>
+                              </w:rPr>
+                              <w:t xml:space="preserve"> </w:t>
+                            </w:r>
+                            <w:r>
+                              <w:rPr>
+                                <w:rFonts w:cs="Poppins Medium"/>
+                              </w:rPr>
+                              <w:t>:</w:t>
+                            </w:r>
+                            <w:proofErr w:type="gramEnd"/>
+                          </w:p>
+                          <w:p>
+                            <w:r>
+                              <w:rPr>
+                                <w:rFonts w:cs="Poppins Medium"/>
+                              </w:rPr>
+                              <w:t xml:space="preserve">Phone </w:t>
+                            </w:r>
+                            <w:proofErr w:type="gramStart"/>
+                            <w:r>
+                              <w:rPr>
+                                <w:rFonts w:cs="Poppins Medium"/>
+                              </w:rPr>
+                              <w:t>No</w:t>
+                            </w:r>
+                            <w:r>
+                              <w:rPr>
+                                <w:rFonts w:cs="Poppins Medium"/>
+                              </w:rPr>
+                              <w:t xml:space="preserve">  </w:t>
+                            </w:r>
+                            <w:r>
+                              <w:rPr>
+                                <w:rFonts w:cs="Poppins Medium"/>
+                              </w:rPr>
+                              <w:tab/>
+                            </w:r>
+                            <w:proofErr w:type="gramEnd"/>
+                            <w:r>
+                              <w:rPr>
+                                <w:rFonts w:cs="Poppins Medium"/>
+                              </w:rPr>
+                              <w:t xml:space="preserve"> </w:t>
+                            </w:r>
+                            <w:proofErr w:type="gramStart"/>
+                            <w:r>
+                              <w:rPr>
+                                <w:rFonts w:cs="Poppins Medium"/>
+                              </w:rPr>
+                              <w:t xml:space="preserve"> </w:t>
+                            </w:r>
+                            <w:r>
+                              <w:rPr>
+                                <w:rFonts w:cs="Poppins Medium"/>
+                              </w:rPr>
+                              <w:t xml:space="preserve"> </w:t>
+                            </w:r>
+                            <w:r>
+                              <w:rPr>
+                                <w:rFonts w:cs="Poppins Medium"/>
+                              </w:rPr>
+                              <w:t>:</w:t>
+                            </w:r>
+                            <w:proofErr w:type="gramEnd"/>
+                          </w:p>
+                        </w:txbxContent>
+                      </wps:txbx>
+                      <wps:bodyPr rot="0" spcFirstLastPara="0" vertOverflow="overflow" horzOverflow="overflow" vert="horz" wrap="square" lIns="91440" tIns="45720" rIns="91440" bIns="45720" numCol="1" spcCol="0" rtlCol="0" fromWordArt="0" anchor="t" anchorCtr="0" forceAA="0" compatLnSpc="1">
+                        <a:prstTxWarp prst="textNoShape">
+                          <a:avLst/>
+                        </a:prstTxWarp>
+                        <a:noAutofit/>
+                      </wps:bodyPr>
+                    </wps:wsp>
+                  </a:graphicData>
+                </a:graphic>
+                <wp14:sizeRelH relativeFrom="margin">
+                  <wp14:pctWidth>0</wp14:pctWidth>
+                </wp14:sizeRelH>
+                <wp14:sizeRelV relativeFrom="margin">
+                  <wp14:pctHeight>0</wp14:pctHeight>
+                </wp14:sizeRelV>
+              </wp:anchor>
+            </w:drawing>
+          </mc:Choice>
+          <mc:Fallback>
+            <w:pict>
+              <v:shape w14:anchorId="48999853" id="_x0000_s1027" type="#_x0000_t202" style="position:absolute;margin-left:151.65pt;margin-top:338.1pt;width:223pt;height:71.55pt;z-index:251700224;visibility:visible;mso-wrap-style:square;mso-width-percent:0;mso-height-percent:0;mso-wrap-distance-left:9pt;mso-wrap-distance-top:0;mso-wrap-distance-right:9pt;mso-wrap-distance-bottom:0;mso-position-horizontal:absolute;mso-position-horizontal-relative:text;mso-position-vertical:absolute;mso-position-vertical-relative:text;mso-width-percent:0;mso-height-percent:0;mso-width-relative:margin;mso-height-relative:margin;v-text-anchor:top" o:gfxdata="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" fillcolor="white [3201]" stroked="f" strokeweight=".5pt">
+                <v:textbox>
+                  <w:txbxContent>
+                    <w:p>
+                      <w:pPr>
+                        <w:rPr>
+                          <w:rFonts w:cs="Poppins Medium"/>
+                        </w:rPr>
+                      </w:pPr>
+                      <w:r>
+                        <w:rPr>
+                          <w:rFonts w:cs="Poppins Medium"/>
+                        </w:rPr>
+                        <w:t xml:space="preserve">Member </w:t>
+                      </w:r>
+                      <w:proofErr w:type="gramStart"/>
+                      <w:r>
+                        <w:rPr>
+                          <w:rFonts w:cs="Poppins Medium"/>
+                        </w:rPr>
+                        <w:t>Name</w:t>
+                      </w:r>
+                      <w:r>
+                        <w:rPr>
+                          <w:rFonts w:cs="Poppins Medium"/>
+                        </w:rPr>
+                        <w:t xml:space="preserve"> </w:t>
+                      </w:r>
+                      <w:r>
+                        <w:rPr>
+                          <w:rFonts w:cs="Poppins Medium"/>
+                        </w:rPr>
+                        <w:t>:</w:t>
+                      </w:r>
+                      <w:proofErr w:type="gramEnd"/>
+                    </w:p>
+                    <w:p>
+                      <w:pPr>
+                        <w:rPr>
+                          <w:rFonts w:cs="Poppins Medium"/>
+                        </w:rPr>
+                      </w:pPr>
+                      <w:r>
+                        <w:rPr>
+                          <w:rFonts w:cs="Poppins Medium"/>
+                        </w:rPr>
+                        <w:t>Student No</w:t>
+                      </w:r>
+                      <w:r>
+                        <w:rPr>
+                          <w:rFonts w:cs="Poppins Medium"/>
+                        </w:rPr>
+                        <w:tab/>
+                        <w:t xml:space="preserve"> </w:t>
+                      </w:r>
+                      <w:proofErr w:type="gramStart"/>
+                      <w:r>
+                        <w:rPr>
+                          <w:rFonts w:cs="Poppins Medium"/>
+                        </w:rPr>
+                        <w:t xml:space="preserve"> </w:t>
+                      </w:r>
+                      <w:r>
+                        <w:rPr>
+                          <w:rFonts w:cs="Poppins Medium"/>
+                        </w:rPr>
+                        <w:t xml:space="preserve"> </w:t>
+                      </w:r>
+                      <w:r>
+                        <w:rPr>
+                          <w:rFonts w:cs="Poppins Medium"/>
+                        </w:rPr>
+                        <w:t>:</w:t>
+                      </w:r>
+                      <w:proofErr w:type="gramEnd"/>
+                    </w:p>
+                    <w:p>
+                      <w:r>
+                        <w:rPr>
+                          <w:rFonts w:cs="Poppins Medium"/>
+                        </w:rPr>
+                        <w:t xml:space="preserve">Phone </w:t>
+                      </w:r>
+                      <w:proofErr w:type="gramStart"/>
+                      <w:r>
+                        <w:rPr>
+                          <w:rFonts w:cs="Poppins Medium"/>
+                        </w:rPr>
+                        <w:t>No</w:t>
+                      </w:r>
+                      <w:r>
+                        <w:rPr>
+                          <w:rFonts w:cs="Poppins Medium"/>
+                        </w:rPr>
+                        <w:t xml:space="preserve">  </w:t>
+                      </w:r>
+                      <w:r>
+                        <w:rPr>
+                          <w:rFonts w:cs="Poppins Medium"/>
+                        </w:rPr>
+                        <w:tab/>
+                      </w:r>
+                      <w:proofErr w:type="gramEnd"/>
+                      <w:r>
+                        <w:rPr>
+                          <w:rFonts w:cs="Poppins Medium"/>
+                        </w:rPr>
+                        <w:t xml:space="preserve"> </w:t>
+                      </w:r>
+                      <w:proofErr w:type="gramStart"/>
+                      <w:r>
+                        <w:rPr>
+                          <w:rFonts w:cs="Poppins Medium"/>
+                        </w:rPr>
+                        <w:t xml:space="preserve"> </w:t>
+                      </w:r>
+                      <w:r>
+                        <w:rPr>
+                          <w:rFonts w:cs="Poppins Medium"/>
+                        </w:rPr>
+                        <w:t xml:space="preserve"> </w:t>
+                      </w:r>
+                      <w:r>
+                        <w:rPr>
+                          <w:rFonts w:cs="Poppins Medium"/>
+                        </w:rPr>
+                        <w:t>:</w:t>
+                      </w:r>
+                      <w:proofErr w:type="gramEnd"/>
+                    </w:p>
+                  </w:txbxContent>
+                </v:textbox>
+              </v:shape>
+            </w:pict>
+          </mc:Fallback>
+        </mc:AlternateContent>
+      </w:r>
+      <w:r>
+        <w:rPr>
+          <w:noProof/>
+        </w:rPr>
+        <mc:AlternateContent>
+          <mc:Choice Requires="wps">
+            <w:drawing>
+              <wp:anchor distT="0" distB="0" distL="114300" distR="114300" simplePos="0" relativeHeight="251698176" behindDoc="0" locked="0" layoutInCell="1" allowOverlap="1" wp14:anchorId="32DEB753" wp14:editId="597E5452">
+                <wp:simplePos x="0" y="0"/>
+                <wp:positionH relativeFrom="column">
+                  <wp:posOffset>1920459</wp:posOffset>
+                </wp:positionH>
+                <wp:positionV relativeFrom="paragraph">
+                  <wp:posOffset>2898714</wp:posOffset>
+                </wp:positionV>
+                <wp:extent cx="2832265" cy="908463"/>
+                <wp:effectExtent l="0" t="0" r="6350" b="6350"/>
+                <wp:wrapNone/>
+                <wp:docPr id="1587744752" name="Text Box 20"/>
+                <wp:cNvGraphicFramePr/>
+                <a:graphic xmlns:a="http://schemas.openxmlformats.org/drawingml/2006/main">
+                  <a:graphicData uri="http://schemas.microsoft.com/office/word/2010/wordprocessingShape">
+                    <wps:wsp>
+                      <wps:cNvSpPr txBox="1"/>
+                      <wps:spPr>
+                        <a:xfrm>
+                          <a:off x="0" y="0"/>
+                          <a:ext cx="2832265" cy="908463"/>
+                        </a:xfrm>
+                        <a:prstGeom prst="rect">
+                          <a:avLst/>
+                        </a:prstGeom>
+                        <a:solidFill>
+                          <a:schemeClr val="lt1"/>
+                        </a:solidFill>
+                        <a:ln w="6350">
+                          <a:noFill/>
+                        </a:ln>
+                      </wps:spPr>
+                      <wps:txbx>
+                        <w:txbxContent>
+                          <w:p>
+                            <w:pPr>
+                              <w:rPr>
+                                <w:rFonts w:cs="Poppins Medium"/>
+                              </w:rPr>
+                            </w:pPr>
+                            <w:r>
+                              <w:rPr>
+                                <w:rFonts w:cs="Poppins Medium"/>
+                              </w:rPr>
+                              <w:t xml:space="preserve">Member </w:t>
+                            </w:r>
+                            <w:proofErr w:type="gramStart"/>
+                            <w:r>
+                              <w:rPr>
+                                <w:rFonts w:cs="Poppins Medium"/>
+                              </w:rPr>
+                              <w:t>Name</w:t>
+                            </w:r>
+                            <w:r>
+                              <w:rPr>
+                                <w:rFonts w:cs="Poppins Medium"/>
+                              </w:rPr>
+                              <w:t xml:space="preserve"> </w:t>
+                            </w:r>
+                            <w:r>
+                              <w:rPr>
+                                <w:rFonts w:cs="Poppins Medium"/>
+                              </w:rPr>
+                              <w:t>:</w:t>
+                            </w:r>
+                            <w:proofErr w:type="gramEnd"/>
+                          </w:p>
+                          <w:p>
+                            <w:pPr>
+                              <w:rPr>
+                                <w:rFonts w:cs="Poppins Medium"/>
+                              </w:rPr>
+                            </w:pPr>
+                            <w:r>
+                              <w:rPr>
+                                <w:rFonts w:cs="Poppins Medium"/>
+                              </w:rPr>
+                              <w:t>Student No</w:t>
+                            </w:r>
+                            <w:r>
+                              <w:rPr>
+                                <w:rFonts w:cs="Poppins Medium"/>
+                              </w:rPr>
+                              <w:tab/>
+                              <w:t xml:space="preserve"> </w:t>
+                            </w:r>
+                            <w:proofErr w:type="gramStart"/>
+                            <w:r>
+                              <w:rPr>
+                                <w:rFonts w:cs="Poppins Medium"/>
+                              </w:rPr>
+                              <w:t xml:space="preserve"> </w:t>
+                            </w:r>
+                            <w:r>
+                              <w:rPr>
+                                <w:rFonts w:cs="Poppins Medium"/>
+                              </w:rPr>
+                              <w:t xml:space="preserve"> </w:t>
+                            </w:r>
+                            <w:r>
+                              <w:rPr>
+                                <w:rFonts w:cs="Poppins Medium"/>
+                              </w:rPr>
+                              <w:t>:</w:t>
+                            </w:r>
+                            <w:proofErr w:type="gramEnd"/>
+                          </w:p>
+                          <w:p>
+                            <w:r>
+                              <w:rPr>
+                                <w:rFonts w:cs="Poppins Medium"/>
+                              </w:rPr>
+                              <w:t xml:space="preserve">Phone </w:t>
+                            </w:r>
+                            <w:proofErr w:type="gramStart"/>
+                            <w:r>
+                              <w:rPr>
+                                <w:rFonts w:cs="Poppins Medium"/>
+                              </w:rPr>
+                              <w:t>No</w:t>
+                            </w:r>
+                            <w:r>
+                              <w:rPr>
+                                <w:rFonts w:cs="Poppins Medium"/>
+                              </w:rPr>
+                              <w:t xml:space="preserve">  </w:t>
+                            </w:r>
+                            <w:r>
+                              <w:rPr>
+                                <w:rFonts w:cs="Poppins Medium"/>
+                              </w:rPr>
+                              <w:tab/>
+                            </w:r>
+                            <w:proofErr w:type="gramEnd"/>
+                            <w:r>
+                              <w:rPr>
+                                <w:rFonts w:cs="Poppins Medium"/>
+                              </w:rPr>
+                              <w:t xml:space="preserve"> </w:t>
+                            </w:r>
+                            <w:proofErr w:type="gramStart"/>
+                            <w:r>
+                              <w:rPr>
+                                <w:rFonts w:cs="Poppins Medium"/>
+                              </w:rPr>
+                              <w:t xml:space="preserve"> </w:t>
+                            </w:r>
+                            <w:r>
+                              <w:rPr>
+                                <w:rFonts w:cs="Poppins Medium"/>
+                              </w:rPr>
+                              <w:t xml:space="preserve"> </w:t>
+                            </w:r>
+                            <w:r>
+                              <w:rPr>
+                                <w:rFonts w:cs="Poppins Medium"/>
+                              </w:rPr>
+                              <w:t>:</w:t>
+                            </w:r>
+                            <w:proofErr w:type="gramEnd"/>
+                          </w:p>
+                        </w:txbxContent>
+                      </wps:txbx>
+                      <wps:bodyPr rot="0" spcFirstLastPara="0" vertOverflow="overflow" horzOverflow="overflow" vert="horz" wrap="square" lIns="91440" tIns="45720" rIns="91440" bIns="45720" numCol="1" spcCol="0" rtlCol="0" fromWordArt="0" anchor="t" anchorCtr="0" forceAA="0" compatLnSpc="1">
+                        <a:prstTxWarp prst="textNoShape">
+                          <a:avLst/>
+                        </a:prstTxWarp>
+                        <a:noAutofit/>
+                      </wps:bodyPr>
+                    </wps:wsp>
+                  </a:graphicData>
+                </a:graphic>
+                <wp14:sizeRelH relativeFrom="margin">
+                  <wp14:pctWidth>0</wp14:pctWidth>
+                </wp14:sizeRelH>
+                <wp14:sizeRelV relativeFrom="margin">
+                  <wp14:pctHeight>0</wp14:pctHeight>
+                </wp14:sizeRelV>
+              </wp:anchor>
+            </w:drawing>
+          </mc:Choice>
+          <mc:Fallback>
+            <w:pict>
+              <v:shape w14:anchorId="32DEB753" id="_x0000_s1028" type="#_x0000_t202" style="position:absolute;margin-left:151.2pt;margin-top:228.25pt;width:223pt;height:71.55pt;z-index:251698176;visibility:visible;mso-wrap-style:square;mso-width-percent:0;mso-height-percent:0;mso-wrap-distance-left:9pt;mso-wrap-distance-top:0;mso-wrap-distance-right:9pt;mso-wrap-distance-bottom:0;mso-position-horizontal:absolute;mso-position-horizontal-relative:text;mso-position-vertical:absolute;mso-position-vertical-relative:text;mso-width-percent:0;mso-height-percent:0;mso-width-relative:margin;mso-height-relative:margin;v-text-anchor:top" o:gfxdata="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" fillcolor="white [3201]" stroked="f" strokeweight=".5pt">
+                <v:textbox>
+                  <w:txbxContent>
+                    <w:p>
+                      <w:pPr>
+                        <w:rPr>
+                          <w:rFonts w:cs="Poppins Medium"/>
+                        </w:rPr>
+                      </w:pPr>
+                      <w:r>
+                        <w:rPr>
+                          <w:rFonts w:cs="Poppins Medium"/>
+                        </w:rPr>
+                        <w:t xml:space="preserve">Member </w:t>
+                      </w:r>
+                      <w:proofErr w:type="gramStart"/>
+                      <w:r>
+                        <w:rPr>
+                          <w:rFonts w:cs="Poppins Medium"/>
+                        </w:rPr>
+                        <w:t>Name</w:t>
+                      </w:r>
+                      <w:r>
+                        <w:rPr>
+                          <w:rFonts w:cs="Poppins Medium"/>
+                        </w:rPr>
+                        <w:t xml:space="preserve"> </w:t>
+                      </w:r>
+                      <w:r>
+                        <w:rPr>
+                          <w:rFonts w:cs="Poppins Medium"/>
+                        </w:rPr>
+                        <w:t>:</w:t>
+                      </w:r>
+                      <w:proofErr w:type="gramEnd"/>
+                    </w:p>
+                    <w:p>
+                      <w:pPr>
+                        <w:rPr>
+                          <w:rFonts w:cs="Poppins Medium"/>
+                        </w:rPr>
+                      </w:pPr>
+                      <w:r>
+                        <w:rPr>
+                          <w:rFonts w:cs="Poppins Medium"/>
+                        </w:rPr>
+                        <w:t>Student No</w:t>
+                      </w:r>
+                      <w:r>
+                        <w:rPr>
+                          <w:rFonts w:cs="Poppins Medium"/>
+                        </w:rPr>
+                        <w:tab/>
+                        <w:t xml:space="preserve"> </w:t>
+                      </w:r>
+                      <w:proofErr w:type="gramStart"/>
+                      <w:r>
+                        <w:rPr>
+                          <w:rFonts w:cs="Poppins Medium"/>
+                        </w:rPr>
+                        <w:t xml:space="preserve"> </w:t>
+                      </w:r>
+                      <w:r>
+                        <w:rPr>
+                          <w:rFonts w:cs="Poppins Medium"/>
+                        </w:rPr>
+                        <w:t xml:space="preserve"> </w:t>
+                      </w:r>
+                      <w:r>
+                        <w:rPr>
+                          <w:rFonts w:cs="Poppins Medium"/>
+                        </w:rPr>
+                        <w:t>:</w:t>
+                      </w:r>
+                      <w:proofErr w:type="gramEnd"/>
+                    </w:p>
+                    <w:p>
+                      <w:r>
+                        <w:rPr>
+                          <w:rFonts w:cs="Poppins Medium"/>
+                        </w:rPr>
+                        <w:t xml:space="preserve">Phone </w:t>
+                      </w:r>
+                      <w:proofErr w:type="gramStart"/>
+                      <w:r>
+                        <w:rPr>
+                          <w:rFonts w:cs="Poppins Medium"/>
+                        </w:rPr>
+                        <w:t>No</w:t>
+                      </w:r>
+                      <w:r>
+                        <w:rPr>
+                          <w:rFonts w:cs="Poppins Medium"/>
+                        </w:rPr>
+                        <w:t xml:space="preserve">  </w:t>
+                      </w:r>
+                      <w:r>
+                        <w:rPr>
+                          <w:rFonts w:cs="Poppins Medium"/>
+                        </w:rPr>
+                        <w:tab/>
+                      </w:r>
+                      <w:proofErr w:type="gramEnd"/>
+                      <w:r>
+                        <w:rPr>
+                          <w:rFonts w:cs="Poppins Medium"/>
+                        </w:rPr>
+                        <w:t xml:space="preserve"> </w:t>
+                      </w:r>
+                      <w:proofErr w:type="gramStart"/>
+                      <w:r>
+                        <w:rPr>
+                          <w:rFonts w:cs="Poppins Medium"/>
+                        </w:rPr>
+                        <w:t xml:space="preserve"> </w:t>
+                      </w:r>
+                      <w:r>
+                        <w:rPr>
+                          <w:rFonts w:cs="Poppins Medium"/>
+                        </w:rPr>
+                        <w:t xml:space="preserve"> </w:t>
+                      </w:r>
+                      <w:r>
+                        <w:rPr>
+                          <w:rFonts w:cs="Poppins Medium"/>
+                        </w:rPr>
+                        <w:t>:</w:t>
+                      </w:r>
+                      <w:proofErr w:type="gramEnd"/>
+                    </w:p>
+                  </w:txbxContent>
+                </v:textbox>
+              </v:shape>
+            </w:pict>
+          </mc:Fallback>
+        </mc:AlternateContent>
+      </w:r>
+      <w:r>
+        <w:rPr>
+          <w:noProof/>
+        </w:rPr>
+        <mc:AlternateContent>
+          <mc:Choice Requires="wps">
+            <w:drawing>
+              <wp:anchor distT="0" distB="0" distL="114300" distR="114300" simplePos="0" relativeHeight="251696128" behindDoc="0" locked="0" layoutInCell="1" allowOverlap="1" wp14:anchorId="7F3294EE" wp14:editId="560EF39E">
+                <wp:simplePos x="0" y="0"/>
+                <wp:positionH relativeFrom="column">
+                  <wp:posOffset>1926938</wp:posOffset>
+                </wp:positionH>
+                <wp:positionV relativeFrom="paragraph">
+                  <wp:posOffset>1479550</wp:posOffset>
+                </wp:positionV>
+                <wp:extent cx="2832265" cy="908463"/>
+                <wp:effectExtent l="0" t="0" r="6350" b="6350"/>
+                <wp:wrapNone/>
+                <wp:docPr id="120256358" name="Text Box 20"/>
+                <wp:cNvGraphicFramePr/>
+                <a:graphic xmlns:a="http://schemas.openxmlformats.org/drawingml/2006/main">
+                  <a:graphicData uri="http://schemas.microsoft.com/office/word/2010/wordprocessingShape">
+                    <wps:wsp>
+                      <wps:cNvSpPr txBox="1"/>
+                      <wps:spPr>
+                        <a:xfrm>
+                          <a:off x="0" y="0"/>
+                          <a:ext cx="2832265" cy="908463"/>
+                        </a:xfrm>
+                        <a:prstGeom prst="rect">
+                          <a:avLst/>
+                        </a:prstGeom>
+                        <a:solidFill>
+                          <a:schemeClr val="lt1"/>
+                        </a:solidFill>
+                        <a:ln w="6350">
+                          <a:noFill/>
+                        </a:ln>
+                      </wps:spPr>
+                      <wps:txbx>
+                        <w:txbxContent>
+                          <w:p>
+                            <w:pPr>
+                              <w:rPr>
+                                <w:rFonts w:cs="Poppins Medium"/>
+                              </w:rPr>
+                            </w:pPr>
+                            <w:r>
+                              <w:rPr>
+                                <w:rFonts w:cs="Poppins Medium"/>
+                              </w:rPr>
+                              <w:t xml:space="preserve">Member </w:t>
+                            </w:r>
+                            <w:proofErr w:type="gramStart"/>
+                            <w:r>
+                              <w:rPr>
+                                <w:rFonts w:cs="Poppins Medium"/>
+                              </w:rPr>
+                              <w:t>Name</w:t>
+                            </w:r>
+                            <w:r>
+                              <w:rPr>
+                                <w:rFonts w:cs="Poppins Medium"/>
+                              </w:rPr>
+                              <w:t xml:space="preserve"> </w:t>
+                            </w:r>
+                            <w:r>
+                              <w:rPr>
+                                <w:rFonts w:cs="Poppins Medium"/>
+                              </w:rPr>
+                              <w:t>:</w:t>
+                            </w:r>
+                            <w:proofErr w:type="gramEnd"/>
+                          </w:p>
+                          <w:p>
+                            <w:pPr>
+                              <w:rPr>
+                                <w:rFonts w:cs="Poppins Medium"/>
+                              </w:rPr>
+                            </w:pPr>
+                            <w:r>
+                              <w:rPr>
+                                <w:rFonts w:cs="Poppins Medium"/>
+                              </w:rPr>
+                              <w:t>Student No</w:t>
+                            </w:r>
+                            <w:r>
+                              <w:rPr>
+                                <w:rFonts w:cs="Poppins Medium"/>
+                              </w:rPr>
+                              <w:tab/>
+                              <w:t xml:space="preserve"> </w:t>
+                            </w:r>
+                            <w:proofErr w:type="gramStart"/>
+                            <w:r>
+                              <w:rPr>
+                                <w:rFonts w:cs="Poppins Medium"/>
+                              </w:rPr>
+                              <w:t xml:space="preserve"> </w:t>
+                            </w:r>
+                            <w:r>
+                              <w:rPr>
+                                <w:rFonts w:cs="Poppins Medium"/>
+                              </w:rPr>
+                              <w:t xml:space="preserve"> </w:t>
+                            </w:r>
+                            <w:r>
+                              <w:rPr>
+                                <w:rFonts w:cs="Poppins Medium"/>
+                              </w:rPr>
+                              <w:t>:</w:t>
+                            </w:r>
+                            <w:proofErr w:type="gramEnd"/>
+                          </w:p>
+                          <w:p>
+                            <w:r>
+                              <w:rPr>
+                                <w:rFonts w:cs="Poppins Medium"/>
+                              </w:rPr>
+                              <w:t xml:space="preserve">Phone </w:t>
+                            </w:r>
+                            <w:proofErr w:type="gramStart"/>
+                            <w:r>
+                              <w:rPr>
+                                <w:rFonts w:cs="Poppins Medium"/>
+                              </w:rPr>
+                              <w:t>No</w:t>
+                            </w:r>
+                            <w:r>
+                              <w:rPr>
+                                <w:rFonts w:cs="Poppins Medium"/>
+                              </w:rPr>
+                              <w:t xml:space="preserve">  </w:t>
+                            </w:r>
+                            <w:r>
+                              <w:rPr>
+                                <w:rFonts w:cs="Poppins Medium"/>
+                              </w:rPr>
+                              <w:tab/>
+                            </w:r>
+                            <w:proofErr w:type="gramEnd"/>
+                            <w:r>
+                              <w:rPr>
+                                <w:rFonts w:cs="Poppins Medium"/>
+                              </w:rPr>
+                              <w:t xml:space="preserve"> </w:t>
+                            </w:r>
+                            <w:proofErr w:type="gramStart"/>
+                            <w:r>
+                              <w:rPr>
+                                <w:rFonts w:cs="Poppins Medium"/>
+                              </w:rPr>
+                              <w:t xml:space="preserve"> </w:t>
+                            </w:r>
+                            <w:r>
+                              <w:rPr>
+                                <w:rFonts w:cs="Poppins Medium"/>
+                              </w:rPr>
+                              <w:t xml:space="preserve"> </w:t>
+                            </w:r>
+                            <w:r>
+                              <w:rPr>
+                                <w:rFonts w:cs="Poppins Medium"/>
+                              </w:rPr>
+                              <w:t>:</w:t>
+                            </w:r>
+                            <w:proofErr w:type="gramEnd"/>
+                          </w:p>
+                        </w:txbxContent>
+                      </wps:txbx>
+                      <wps:bodyPr rot="0" spcFirstLastPara="0" vertOverflow="overflow" horzOverflow="overflow" vert="horz" wrap="square" lIns="91440" tIns="45720" rIns="91440" bIns="45720" numCol="1" spcCol="0" rtlCol="0" fromWordArt="0" anchor="t" anchorCtr="0" forceAA="0" compatLnSpc="1">
+                        <a:prstTxWarp prst="textNoShape">
+                          <a:avLst/>
+                        </a:prstTxWarp>
+                        <a:noAutofit/>
+                      </wps:bodyPr>
+                    </wps:wsp>
+                  </a:graphicData>
+                </a:graphic>
+                <wp14:sizeRelH relativeFrom="margin">
+                  <wp14:pctWidth>0</wp14:pctWidth>
+                </wp14:sizeRelH>
+                <wp14:sizeRelV relativeFrom="margin">
+                  <wp14:pctHeight>0</wp14:pctHeight>
+                </wp14:sizeRelV>
+              </wp:anchor>
+            </w:drawing>
+          </mc:Choice>
+          <mc:Fallback>
+            <w:pict>
+              <v:shape w14:anchorId="7F3294EE" id="_x0000_s1029" type="#_x0000_t202" style="position:absolute;margin-left:151.75pt;margin-top:116.5pt;width:223pt;height:71.55pt;z-index:251696128;visibility:visible;mso-wrap-style:square;mso-width-percent:0;mso-height-percent:0;mso-wrap-distance-left:9pt;mso-wrap-distance-top:0;mso-wrap-distance-right:9pt;mso-wrap-distance-bottom:0;mso-position-horizontal:absolute;mso-position-horizontal-relative:text;mso-position-vertical:absolute;mso-position-vertical-relative:text;mso-width-percent:0;mso-height-percent:0;mso-width-relative:margin;mso-height-relative:margin;v-text-anchor:top" o:gfxdata="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" fillcolor="white [3201]" stroked="f" strokeweight=".5pt">
+                <v:textbox>
+                  <w:txbxContent>
+                    <w:p>
+                      <w:pPr>
+                        <w:rPr>
+                          <w:rFonts w:cs="Poppins Medium"/>
+                        </w:rPr>
+                      </w:pPr>
+                      <w:r>
+                        <w:rPr>
+                          <w:rFonts w:cs="Poppins Medium"/>
+                        </w:rPr>
+                        <w:t xml:space="preserve">Member </w:t>
+                      </w:r>
+                      <w:proofErr w:type="gramStart"/>
+                      <w:r>
+                        <w:rPr>
+                          <w:rFonts w:cs="Poppins Medium"/>
+                        </w:rPr>
+                        <w:t>Name</w:t>
+                      </w:r>
+                      <w:r>
+                        <w:rPr>
+                          <w:rFonts w:cs="Poppins Medium"/>
+                        </w:rPr>
+                        <w:t xml:space="preserve"> </w:t>
+                      </w:r>
+                      <w:r>
+                        <w:rPr>
+                          <w:rFonts w:cs="Poppins Medium"/>
+                        </w:rPr>
+                        <w:t>:</w:t>
+                      </w:r>
+                      <w:proofErr w:type="gramEnd"/>
+                    </w:p>
+                    <w:p>
+                      <w:pPr>
+                        <w:rPr>
+                          <w:rFonts w:cs="Poppins Medium"/>
+                        </w:rPr>
+                      </w:pPr>
+                      <w:r>
+                        <w:rPr>
+                          <w:rFonts w:cs="Poppins Medium"/>
+                        </w:rPr>
+                        <w:t>Student No</w:t>
+                      </w:r>
+                      <w:r>
+                        <w:rPr>
+                          <w:rFonts w:cs="Poppins Medium"/>
+                        </w:rPr>
+                        <w:tab/>
+                        <w:t xml:space="preserve"> </w:t>
+                      </w:r>
+                      <w:proofErr w:type="gramStart"/>
+                      <w:r>
+                        <w:rPr>
+                          <w:rFonts w:cs="Poppins Medium"/>
+                        </w:rPr>
+                        <w:t xml:space="preserve"> </w:t>
+                      </w:r>
+                      <w:r>
+                        <w:rPr>
+                          <w:rFonts w:cs="Poppins Medium"/>
+                        </w:rPr>
+                        <w:t xml:space="preserve"> </w:t>
+                      </w:r>
+                      <w:r>
+                        <w:rPr>
+                          <w:rFonts w:cs="Poppins Medium"/>
+                        </w:rPr>
+                        <w:t>:</w:t>
+                      </w:r>
+                      <w:proofErr w:type="gramEnd"/>
+                    </w:p>
+                    <w:p>
+                      <w:r>
+                        <w:rPr>
+                          <w:rFonts w:cs="Poppins Medium"/>
+                        </w:rPr>
+                        <w:t xml:space="preserve">Phone </w:t>
+                      </w:r>
+                      <w:proofErr w:type="gramStart"/>
+                      <w:r>
+                        <w:rPr>
+                          <w:rFonts w:cs="Poppins Medium"/>
+                        </w:rPr>
+                        <w:t>No</w:t>
+                      </w:r>
+                      <w:r>
+                        <w:rPr>
+                          <w:rFonts w:cs="Poppins Medium"/>
+                        </w:rPr>
+                        <w:t xml:space="preserve">  </w:t>
+                      </w:r>
+                      <w:r>
+                        <w:rPr>
+                          <w:rFonts w:cs="Poppins Medium"/>
+                        </w:rPr>
+                        <w:tab/>
+                      </w:r>
+                      <w:proofErr w:type="gramEnd"/>
+                      <w:r>
+                        <w:rPr>
+                          <w:rFonts w:cs="Poppins Medium"/>
+                        </w:rPr>
+                        <w:t xml:space="preserve"> </w:t>
+                      </w:r>
+                      <w:proofErr w:type="gramStart"/>
+                      <w:r>
+                        <w:rPr>
+                          <w:rFonts w:cs="Poppins Medium"/>
+                        </w:rPr>
+                        <w:t xml:space="preserve"> </w:t>
+                      </w:r>
+                      <w:r>
+                        <w:rPr>
+                          <w:rFonts w:cs="Poppins Medium"/>
+                        </w:rPr>
+                        <w:t xml:space="preserve"> </w:t>
+                      </w:r>
+                      <w:r>
+                        <w:rPr>
+                          <w:rFonts w:cs="Poppins Medium"/>
+                        </w:rPr>
+                        <w:t>:</w:t>
+                      </w:r>
+                      <w:proofErr w:type="gramEnd"/>
+                    </w:p>
+                  </w:txbxContent>
+                </v:textbox>
+              </v:shape>
+            </w:pict>
+          </mc:Fallback>
+        </mc:AlternateContent>
+      </w:r>
+      <w:r>
+        <w:rPr>
+          <w:noProof/>
+        </w:rPr>
+        <mc:AlternateContent>
+          <mc:Choice Requires="wps">
+            <w:drawing>
+              <wp:anchor distT="0" distB="0" distL="114300" distR="114300" simplePos="0" relativeHeight="251694080" behindDoc="0" locked="0" layoutInCell="1" allowOverlap="1" wp14:anchorId="7377FA49" wp14:editId="3CA76892">
+                <wp:simplePos x="0" y="0"/>
+                <wp:positionH relativeFrom="column">
+                  <wp:posOffset>1929325</wp:posOffset>
+                </wp:positionH>
+                <wp:positionV relativeFrom="paragraph">
+                  <wp:posOffset>99662</wp:posOffset>
+                </wp:positionV>
+                <wp:extent cx="2832265" cy="908463"/>
+                <wp:effectExtent l="0" t="0" r="6350" b="6350"/>
+                <wp:wrapNone/>
+                <wp:docPr id="1867629395" name="Text Box 20"/>
+                <wp:cNvGraphicFramePr/>
+                <a:graphic xmlns:a="http://schemas.openxmlformats.org/drawingml/2006/main">
+                  <a:graphicData uri="http://schemas.microsoft.com/office/word/2010/wordprocessingShape">
+                    <wps:wsp>
+                      <wps:cNvSpPr txBox="1"/>
+                      <wps:spPr>
+                        <a:xfrm>
+                          <a:off x="0" y="0"/>
+                          <a:ext cx="2832265" cy="908463"/>
+                        </a:xfrm>
+                        <a:prstGeom prst="rect">
+                          <a:avLst/>
+                        </a:prstGeom>
+                        <a:solidFill>
+                          <a:schemeClr val="lt1"/>
+                        </a:solidFill>
+                        <a:ln w="6350">
+                          <a:noFill/>
+                        </a:ln>
+                      </wps:spPr>
+                      <wps:txbx>
+                        <w:txbxContent>
+                          <w:p>
+                            <w:pPr>
+                              <w:rPr>
+                                <w:rFonts w:cs="Poppins Medium"/>
+                              </w:rPr>
+                            </w:pPr>
+                            <w:r>
+                              <w:rPr>
+                                <w:rFonts w:cs="Poppins Medium"/>
+                              </w:rPr>
+                              <w:t xml:space="preserve">Member </w:t>
+                            </w:r>
+                            <w:proofErr w:type="gramStart"/>
+                            <w:r>
+                              <w:rPr>
+                                <w:rFonts w:cs="Poppins Medium"/>
+                              </w:rPr>
+                              <w:t>Name</w:t>
+                            </w:r>
+                            <w:r>
+                              <w:rPr>
+                                <w:rFonts w:cs="Poppins Medium"/>
+                              </w:rPr>
+                              <w:t xml:space="preserve"> </w:t>
+                            </w:r>
+                            <w:r>
+                              <w:rPr>
+                                <w:rFonts w:cs="Poppins Medium"/>
+                              </w:rPr>
+                              <w:t>:</w:t>
+                            </w:r>
+                            <w:proofErr w:type="gramEnd"/>
+                          </w:p>
+                          <w:p>
+                            <w:pPr>
+                              <w:rPr>
+                                <w:rFonts w:cs="Poppins Medium"/>
+                              </w:rPr>
+                            </w:pPr>
+                            <w:r>
+                              <w:rPr>
+                                <w:rFonts w:cs="Poppins Medium"/>
+                              </w:rPr>
+                              <w:t>Student No</w:t>
+                            </w:r>
+                            <w:r>
+                              <w:rPr>
+                                <w:rFonts w:cs="Poppins Medium"/>
+                              </w:rPr>
+                              <w:tab/>
+                              <w:t xml:space="preserve"> </w:t>
+                            </w:r>
+                            <w:proofErr w:type="gramStart"/>
+                            <w:r>
+                              <w:rPr>
+                                <w:rFonts w:cs="Poppins Medium"/>
+                              </w:rPr>
+                              <w:t xml:space="preserve"> </w:t>
+                            </w:r>
+                            <w:r>
+                              <w:rPr>
+                                <w:rFonts w:cs="Poppins Medium"/>
+                              </w:rPr>
+                              <w:t xml:space="preserve"> </w:t>
+                            </w:r>
+                            <w:r>
+                              <w:rPr>
+                                <w:rFonts w:cs="Poppins Medium"/>
+                              </w:rPr>
+                              <w:t>:</w:t>
+                            </w:r>
+                            <w:proofErr w:type="gramEnd"/>
+                          </w:p>
+                          <w:p>
+                            <w:r>
+                              <w:rPr>
+                                <w:rFonts w:cs="Poppins Medium"/>
+                              </w:rPr>
+                              <w:t>Phone No</w:t>
+                            </w:r>
+                            <w:r>
+                              <w:rPr>
+                                <w:rFonts w:cs="Poppins Medium"/>
+                              </w:rPr>
+                              <w:tab/>
+                              <w:t xml:space="preserve"> </w:t>
+                            </w:r>
+                            <w:proofErr w:type="gramStart"/>
+                            <w:r>
+                              <w:rPr>
+                                <w:rFonts w:cs="Poppins Medium"/>
+                              </w:rPr>
+                              <w:t xml:space="preserve"> </w:t>
+                            </w:r>
+                            <w:r>
+                              <w:rPr>
+                                <w:rFonts w:cs="Poppins Medium"/>
+                              </w:rPr>
+                              <w:t xml:space="preserve"> </w:t>
+                            </w:r>
+                            <w:r>
+                              <w:rPr>
+                                <w:rFonts w:cs="Poppins Medium"/>
+                              </w:rPr>
+                              <w:t>:</w:t>
+                            </w:r>
+                            <w:proofErr w:type="gramEnd"/>
+                          </w:p>
+                        </w:txbxContent>
+                      </wps:txbx>
+                      <wps:bodyPr rot="0" spcFirstLastPara="0" vertOverflow="overflow" horzOverflow="overflow" vert="horz" wrap="square" lIns="91440" tIns="45720" rIns="91440" bIns="45720" numCol="1" spcCol="0" rtlCol="0" fromWordArt="0" anchor="t" anchorCtr="0" forceAA="0" compatLnSpc="1">
+                        <a:prstTxWarp prst="textNoShape">
+                          <a:avLst/>
+                        </a:prstTxWarp>
+                        <a:noAutofit/>
+                      </wps:bodyPr>
+                    </wps:wsp>
+                  </a:graphicData>
+                </a:graphic>
+                <wp14:sizeRelH relativeFrom="margin">
+                  <wp14:pctWidth>0</wp14:pctWidth>
+                </wp14:sizeRelH>
+                <wp14:sizeRelV relativeFrom="margin">
+                  <wp14:pctHeight>0</wp14:pctHeight>
+                </wp14:sizeRelV>
+              </wp:anchor>
+            </w:drawing>
+          </mc:Choice>
+          <mc:Fallback>
+            <w:pict>
+              <v:shape w14:anchorId="7377FA49" id="_x0000_s1030" type="#_x0000_t202" style="position:absolute;margin-left:151.9pt;margin-top:7.85pt;width:223pt;height:71.55pt;z-index:251694080;visibility:visible;mso-wrap-style:square;mso-width-percent:0;mso-height-percent:0;mso-wrap-distance-left:9pt;mso-wrap-distance-top:0;mso-wrap-distance-right:9pt;mso-wrap-distance-bottom:0;mso-position-horizontal:absolute;mso-position-horizontal-relative:text;mso-position-vertical:absolute;mso-position-vertical-relative:text;mso-width-percent:0;mso-height-percent:0;mso-width-relative:margin;mso-height-relative:margin;v-text-anchor:top" o:gfxdata="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" fillcolor="white [3201]" stroked="f" strokeweight=".5pt">
+                <v:textbox>
+                  <w:txbxContent>
+                    <w:p>
+                      <w:pPr>
+                        <w:rPr>
+                          <w:rFonts w:cs="Poppins Medium"/>
+                        </w:rPr>
+                      </w:pPr>
+                      <w:r>
+                        <w:rPr>
+                          <w:rFonts w:cs="Poppins Medium"/>
+                        </w:rPr>
+                        <w:t xml:space="preserve">Member </w:t>
+                      </w:r>
+                      <w:proofErr w:type="gramStart"/>
+                      <w:r>
+                        <w:rPr>
+                          <w:rFonts w:cs="Poppins Medium"/>
+                        </w:rPr>
+                        <w:t>Name</w:t>
+                      </w:r>
+                      <w:r>
+                        <w:rPr>
+                          <w:rFonts w:cs="Poppins Medium"/>
+                        </w:rPr>
+                        <w:t xml:space="preserve"> </w:t>
+                      </w:r>
+                      <w:r>
+                        <w:rPr>
+                          <w:rFonts w:cs="Poppins Medium"/>
+                        </w:rPr>
+                        <w:t>:</w:t>
+                      </w:r>
+                      <w:proofErr w:type="gramEnd"/>
+                    </w:p>
+                    <w:p>
+                      <w:pPr>
+                        <w:rPr>
+                          <w:rFonts w:cs="Poppins Medium"/>
+                        </w:rPr>
+                      </w:pPr>
+                      <w:r>
+                        <w:rPr>
+                          <w:rFonts w:cs="Poppins Medium"/>
+                        </w:rPr>
+                        <w:t>Student No</w:t>
+                      </w:r>
+                      <w:r>
+                        <w:rPr>
+                          <w:rFonts w:cs="Poppins Medium"/>
+                        </w:rPr>
+                        <w:tab/>
+                        <w:t xml:space="preserve"> </w:t>
+                      </w:r>
+                      <w:proofErr w:type="gramStart"/>
+                      <w:r>
+                        <w:rPr>
+                          <w:rFonts w:cs="Poppins Medium"/>
+                        </w:rPr>
+                        <w:t xml:space="preserve"> </w:t>
+                      </w:r>
+                      <w:r>
+                        <w:rPr>
+                          <w:rFonts w:cs="Poppins Medium"/>
+                        </w:rPr>
+                        <w:t xml:space="preserve"> </w:t>
+                      </w:r>
+                      <w:r>
+                        <w:rPr>
+                          <w:rFonts w:cs="Poppins Medium"/>
+                        </w:rPr>
+                        <w:t>:</w:t>
+                      </w:r>
+                      <w:proofErr w:type="gramEnd"/>
+                    </w:p>
+                    <w:p>
+                      <w:r>
+                        <w:rPr>
+                          <w:rFonts w:cs="Poppins Medium"/>
+                        </w:rPr>
+                        <w:t>Phone No</w:t>
+                      </w:r>
+                      <w:r>
+                        <w:rPr>
+                          <w:rFonts w:cs="Poppins Medium"/>
+                        </w:rPr>
+                        <w:tab/>
+                        <w:t xml:space="preserve"> </w:t>
+                      </w:r>
+                      <w:proofErr w:type="gramStart"/>
+                      <w:r>
+                        <w:rPr>
+                          <w:rFonts w:cs="Poppins Medium"/>
+                        </w:rPr>
+                        <w:t xml:space="preserve"> </w:t>
+                      </w:r>
+                      <w:r>
+                        <w:rPr>
+                          <w:rFonts w:cs="Poppins Medium"/>
+                        </w:rPr>
+                        <w:t xml:space="preserve"> </w:t>
+                      </w:r>
+                      <w:r>
+                        <w:rPr>
+                          <w:rFonts w:cs="Poppins Medium"/>
+                        </w:rPr>
+                        <w:t>:</w:t>
+                      </w:r>
+                      <w:proofErr w:type="gramEnd"/>
+                    </w:p>
+                  </w:txbxContent>
+                </v:textbox>
+              </v:shape>
+            </w:pict>
+          </mc:Fallback>
+        </mc:AlternateContent>
+      </w:r>
+      <w:r>
+        <w:rPr>
+          <w:noProof/>
+        </w:rPr>
+        <mc:AlternateContent>
+          <mc:Choice Requires="wps">
+            <w:drawing>
+              <wp:anchor distT="0" distB="0" distL="114300" distR="114300" simplePos="0" relativeHeight="251693056" behindDoc="0" locked="0" layoutInCell="1" allowOverlap="1" wp14:anchorId="07641073" wp14:editId="530CE473">
+                <wp:simplePos x="0" y="0"/>
+                <wp:positionH relativeFrom="column">
+                  <wp:posOffset>379203</wp:posOffset>
+                </wp:positionH>
+                <wp:positionV relativeFrom="paragraph">
+                  <wp:posOffset>5611231</wp:posOffset>
+                </wp:positionV>
+                <wp:extent cx="1104900" cy="1104900"/>
+                <wp:effectExtent l="0" t="0" r="0" b="0"/>
+                <wp:wrapNone/>
+                <wp:docPr id="766218724" name="Oval 10"/>
+                <wp:cNvGraphicFramePr/>
+                <a:graphic xmlns:a="http://schemas.openxmlformats.org/drawingml/2006/main">
+                  <a:graphicData uri="http://schemas.microsoft.com/office/word/2010/wordprocessingShape">
+                    <wps:wsp>
+                      <wps:cNvSpPr/>
+                      <wps:spPr>
+                        <a:xfrm>
+                          <a:off x="0" y="0"/>
+                          <a:ext cx="1104900" cy="1104900"/>
+                        </a:xfrm>
+                        <a:prstGeom prst="ellipse">
+                          <a:avLst/>
+                        </a:prstGeom>
+                        <a:blipFill dpi="0" rotWithShape="1">
+                          <a:blip r:embed="rId11" cstate="print">
+                            <a:extLst>
+                              <a:ext uri="{28A0092B-C50C-407E-A947-70E740481C1C}">
+                                <a14:useLocalDpi xmlns:a14="http://schemas.microsoft.com/office/drawing/2010/main" val="0"/>
+                              </a:ext>
+                            </a:extLst>
+                          </a:blip>
+                          <a:srcRect/>
+                          <a:stretch>
+                            <a:fillRect/>
+                          </a:stretch>
+                        </a:blipFill>
+                        <a:ln>
+                          <a:noFill/>
+                        </a:ln>
+                      </wps:spPr>
+                      <wps:style>
+                        <a:lnRef idx="2">
+                          <a:schemeClr val="accent1">
+                            <a:shade val="15000"/>
+                          </a:schemeClr>
+                        </a:lnRef>
+                        <a:fillRef idx="1">
+                          <a:schemeClr val="accent1"/>
+                        </a:fillRef>
+                        <a:effectRef idx="0">
+                          <a:schemeClr val="accent1"/>
+                        </a:effectRef>
+                        <a:fontRef idx="minor">
+                          <a:schemeClr val="lt1"/>
+                        </a:fontRef>
+                      </wps:style>
+                      <wps:bodyPr rot="0" spcFirstLastPara="0" vertOverflow="overflow" horzOverflow="overflow" vert="horz" wrap="square" lIns="91440" tIns="45720" rIns="91440" bIns="45720" numCol="1" spcCol="0" rtlCol="0" fromWordArt="0" anchor="ctr" anchorCtr="0" forceAA="0" compatLnSpc="1">
+                        <a:prstTxWarp prst="textNoShape">
+                          <a:avLst/>
+                        </a:prstTxWarp>
+                        <a:noAutofit/>
+                      </wps:bodyPr>
+                    </wps:wsp>
+                  </a:graphicData>
+                </a:graphic>
+                <wp14:sizeRelH relativeFrom="margin">
+                  <wp14:pctWidth>0</wp14:pctWidth>
+                </wp14:sizeRelH>
+                <wp14:sizeRelV relativeFrom="margin">
+                  <wp14:pctHeight>0</wp14:pctHeight>
+                </wp14:sizeRelV>
+              </wp:anchor>
+            </w:drawing>
+          </mc:Choice>
+          <mc:Fallback>
+            <w:pict>
+              <v:oval w14:anchorId="1A99B570" id="Oval 10" o:spid="_x0000_s1026" style="position:absolute;margin-left:29.85pt;margin-top:441.85pt;width:87pt;height:87pt;z-index:251693056;visibility:visible;mso-wrap-style:square;mso-width-percent:0;mso-height-percent:0;mso-wrap-distance-left:9pt;mso-wrap-distance-top:0;mso-wrap-distance-right:9pt;mso-wrap-distance-bottom:0;mso-position-horizontal:absolute;mso-position-horizontal-relative:text;mso-position-vertical:absolute;mso-position-vertical-relative:text;mso-width-percent:0;mso-height-percent:0;mso-width-relative:margin;mso-height-relative:margin;v-text-anchor:middle" o:gfxdata="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" stroked="f" strokeweight="1pt">
+                <v:fill r:id="rId12" o:title="" recolor="t" rotate="t" type="frame"/>
+                <v:stroke joinstyle="miter"/>
+              </v:oval>
+            </w:pict>
+          </mc:Fallback>
+        </mc:AlternateContent>
+      </w:r>
+      <w:r>
+        <w:rPr>
+          <w:noProof/>
+        </w:rPr>
+        <mc:AlternateContent>
+          <mc:Choice Requires="wps">
+            <w:drawing>
+              <wp:anchor distT="0" distB="0" distL="114300" distR="114300" simplePos="0" relativeHeight="251692032" behindDoc="0" locked="0" layoutInCell="1" allowOverlap="1" wp14:anchorId="2D81F02B" wp14:editId="135B9F60">
+                <wp:simplePos x="0" y="0"/>
+                <wp:positionH relativeFrom="column">
+                  <wp:posOffset>385182</wp:posOffset>
+                </wp:positionH>
+                <wp:positionV relativeFrom="paragraph">
+                  <wp:posOffset>4207378</wp:posOffset>
+                </wp:positionV>
+                <wp:extent cx="1104900" cy="1104900"/>
+                <wp:effectExtent l="0" t="0" r="0" b="0"/>
+                <wp:wrapNone/>
+                <wp:docPr id="631940281" name="Oval 10"/>
+                <wp:cNvGraphicFramePr/>
+                <a:graphic xmlns:a="http://schemas.openxmlformats.org/drawingml/2006/main">
+                  <a:graphicData uri="http://schemas.microsoft.com/office/word/2010/wordprocessingShape">
+                    <wps:wsp>
+                      <wps:cNvSpPr/>
+                      <wps:spPr>
+                        <a:xfrm>
+                          <a:off x="0" y="0"/>
+                          <a:ext cx="1104900" cy="1104900"/>
+                        </a:xfrm>
+                        <a:prstGeom prst="ellipse">
+                          <a:avLst/>
+                        </a:prstGeom>
+                        <a:blipFill dpi="0" rotWithShape="1">
+                          <a:blip r:embed="rId11" cstate="print">
+                            <a:extLst>
+                              <a:ext uri="{28A0092B-C50C-407E-A947-70E740481C1C}">
+                                <a14:useLocalDpi xmlns:a14="http://schemas.microsoft.com/office/drawing/2010/main" val="0"/>
+                              </a:ext>
+                            </a:extLst>
+                          </a:blip>
+                          <a:srcRect/>
+                          <a:stretch>
+                            <a:fillRect/>
+                          </a:stretch>
+                        </a:blipFill>
+                        <a:ln>
+                          <a:noFill/>
+                        </a:ln>
+                      </wps:spPr>
+                      <wps:style>
+                        <a:lnRef idx="2">
+                          <a:schemeClr val="accent1">
+                            <a:shade val="15000"/>
+                          </a:schemeClr>
+                        </a:lnRef>
+                        <a:fillRef idx="1">
+                          <a:schemeClr val="accent1"/>
+                        </a:fillRef>
+                        <a:effectRef idx="0">
+                          <a:schemeClr val="accent1"/>
+                        </a:effectRef>
+                        <a:fontRef idx="minor">
+                          <a:schemeClr val="lt1"/>
+                        </a:fontRef>
+                      </wps:style>
+                      <wps:bodyPr rot="0" spcFirstLastPara="0" vertOverflow="overflow" horzOverflow="overflow" vert="horz" wrap="square" lIns="91440" tIns="45720" rIns="91440" bIns="45720" numCol="1" spcCol="0" rtlCol="0" fromWordArt="0" anchor="ctr" anchorCtr="0" forceAA="0" compatLnSpc="1">
+                        <a:prstTxWarp prst="textNoShape">
+                          <a:avLst/>
+                        </a:prstTxWarp>
+                        <a:noAutofit/>
+                      </wps:bodyPr>
+                    </wps:wsp>
+                  </a:graphicData>
+                </a:graphic>
+                <wp14:sizeRelH relativeFrom="margin">
+                  <wp14:pctWidth>0</wp14:pctWidth>
+                </wp14:sizeRelH>
+                <wp14:sizeRelV relativeFrom="margin">
+                  <wp14:pctHeight>0</wp14:pctHeight>
+                </wp14:sizeRelV>
+              </wp:anchor>
+            </w:drawing>
+          </mc:Choice>
+          <mc:Fallback>
+            <w:pict>
+              <v:oval w14:anchorId="108CF80E" id="Oval 10" o:spid="_x0000_s1026" style="position:absolute;margin-left:30.35pt;margin-top:331.3pt;width:87pt;height:87pt;z-index:251692032;visibility:visible;mso-wrap-style:square;mso-width-percent:0;mso-height-percent:0;mso-wrap-distance-left:9pt;mso-wrap-distance-top:0;mso-wrap-distance-right:9pt;mso-wrap-distance-bottom:0;mso-position-horizontal:absolute;mso-position-horizontal-relative:text;mso-position-vertical:absolute;mso-position-vertical-relative:text;mso-width-percent:0;mso-height-percent:0;mso-width-relative:margin;mso-height-relative:margin;v-text-anchor:middle" o:gfxdata="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" stroked="f" strokeweight="1pt">
+                <v:fill r:id="rId12" o:title="" recolor="t" rotate="t" type="frame"/>
+                <v:stroke joinstyle="miter"/>
+              </v:oval>
+            </w:pict>
+          </mc:Fallback>
+        </mc:AlternateContent>
+      </w:r>
+      <w:r>
+        <w:rPr>
+          <w:noProof/>
+        </w:rPr>
+        <mc:AlternateContent>
+          <mc:Choice Requires="wps">
+            <w:drawing>
+              <wp:anchor distT="0" distB="0" distL="114300" distR="114300" simplePos="0" relativeHeight="251691008" behindDoc="0" locked="0" layoutInCell="1" allowOverlap="1" wp14:anchorId="44A8DACE" wp14:editId="59F3AB3B">
+                <wp:simplePos x="0" y="0"/>
+                <wp:positionH relativeFrom="column">
+                  <wp:posOffset>380101</wp:posOffset>
+                </wp:positionH>
+                <wp:positionV relativeFrom="paragraph">
+                  <wp:posOffset>2809300</wp:posOffset>
+                </wp:positionV>
+                <wp:extent cx="1104900" cy="1104900"/>
+                <wp:effectExtent l="0" t="0" r="0" b="0"/>
+                <wp:wrapNone/>
+                <wp:docPr id="838855957" name="Oval 10"/>
+                <wp:cNvGraphicFramePr/>
+                <a:graphic xmlns:a="http://schemas.openxmlformats.org/drawingml/2006/main">
+                  <a:graphicData uri="http://schemas.microsoft.com/office/word/2010/wordprocessingShape">
+                    <wps:wsp>
+                      <wps:cNvSpPr/>
+                      <wps:spPr>
+                        <a:xfrm>
+                          <a:off x="0" y="0"/>
+                          <a:ext cx="1104900" cy="1104900"/>
+                        </a:xfrm>
+                        <a:prstGeom prst="ellipse">
+                          <a:avLst/>
+                        </a:prstGeom>
+                        <a:blipFill dpi="0" rotWithShape="1">
+                          <a:blip r:embed="rId11" cstate="print">
+                            <a:extLst>
+                              <a:ext uri="{28A0092B-C50C-407E-A947-70E740481C1C}">
+                                <a14:useLocalDpi xmlns:a14="http://schemas.microsoft.com/office/drawing/2010/main" val="0"/>
+                              </a:ext>
+                            </a:extLst>
+                          </a:blip>
+                          <a:srcRect/>
+                          <a:stretch>
+                            <a:fillRect/>
+                          </a:stretch>
+                        </a:blipFill>
+                        <a:ln>
+                          <a:noFill/>
+                        </a:ln>
+                      </wps:spPr>
+                      <wps:style>
+                        <a:lnRef idx="2">
+                          <a:schemeClr val="accent1">
+                            <a:shade val="15000"/>
+                          </a:schemeClr>
+                        </a:lnRef>
+                        <a:fillRef idx="1">
+                          <a:schemeClr val="accent1"/>
+                        </a:fillRef>
+                        <a:effectRef idx="0">
+                          <a:schemeClr val="accent1"/>
+                        </a:effectRef>
+                        <a:fontRef idx="minor">
+                          <a:schemeClr val="lt1"/>
+                        </a:fontRef>
+                      </wps:style>
+                      <wps:bodyPr rot="0" spcFirstLastPara="0" vertOverflow="overflow" horzOverflow="overflow" vert="horz" wrap="square" lIns="91440" tIns="45720" rIns="91440" bIns="45720" numCol="1" spcCol="0" rtlCol="0" fromWordArt="0" anchor="ctr" anchorCtr="0" forceAA="0" compatLnSpc="1">
+                        <a:prstTxWarp prst="textNoShape">
+                          <a:avLst/>
+                        </a:prstTxWarp>
+                        <a:noAutofit/>
+                      </wps:bodyPr>
+                    </wps:wsp>
+                  </a:graphicData>
+                </a:graphic>
+                <wp14:sizeRelH relativeFrom="margin">
+                  <wp14:pctWidth>0</wp14:pctWidth>
+                </wp14:sizeRelH>
+                <wp14:sizeRelV relativeFrom="margin">
+                  <wp14:pctHeight>0</wp14:pctHeight>
+                </wp14:sizeRelV>
+              </wp:anchor>
+            </w:drawing>
+          </mc:Choice>
+          <mc:Fallback>
+            <w:pict>
+              <v:oval w14:anchorId="222A526A" id="Oval 10" o:spid="_x0000_s1026" style="position:absolute;margin-left:29.95pt;margin-top:221.2pt;width:87pt;height:87pt;z-index:251691008;visibility:visible;mso-wrap-style:square;mso-width-percent:0;mso-height-percent:0;mso-wrap-distance-left:9pt;mso-wrap-distance-top:0;mso-wrap-distance-right:9pt;mso-wrap-distance-bottom:0;mso-position-horizontal:absolute;mso-position-horizontal-relative:text;mso-position-vertical:absolute;mso-position-vertical-relative:text;mso-width-percent:0;mso-height-percent:0;mso-width-relative:margin;mso-height-relative:margin;v-text-anchor:middle" o:gfxdata="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" stroked="f" strokeweight="1pt">
+                <v:fill r:id="rId12" o:title="" recolor="t" rotate="t" type="frame"/>
+                <v:stroke joinstyle="miter"/>
+              </v:oval>
+            </w:pict>
+          </mc:Fallback>
+        </mc:AlternateContent>
+      </w:r>
+      <w:r>
+        <w:rPr>
+          <w:noProof/>
+        </w:rPr>
+        <mc:AlternateContent>
+          <mc:Choice Requires="wps">
+            <w:drawing>
+              <wp:anchor distT="0" distB="0" distL="114300" distR="114300" simplePos="0" relativeHeight="251689984" behindDoc="0" locked="0" layoutInCell="1" allowOverlap="1" wp14:anchorId="43950732" wp14:editId="79660DA0">
+                <wp:simplePos x="0" y="0"/>
+                <wp:positionH relativeFrom="column">
+                  <wp:posOffset>379095</wp:posOffset>
+                </wp:positionH>
+                <wp:positionV relativeFrom="paragraph">
+                  <wp:posOffset>1391920</wp:posOffset>
+                </wp:positionV>
+                <wp:extent cx="1104900" cy="1104900"/>
+                <wp:effectExtent l="0" t="0" r="0" b="0"/>
+                <wp:wrapNone/>
+                <wp:docPr id="1189252545" name="Oval 10"/>
+                <wp:cNvGraphicFramePr/>
+                <a:graphic xmlns:a="http://schemas.openxmlformats.org/drawingml/2006/main">
+                  <a:graphicData uri="http://schemas.microsoft.com/office/word/2010/wordprocessingShape">
+                    <wps:wsp>
+                      <wps:cNvSpPr/>
+                      <wps:spPr>
+                        <a:xfrm>
+                          <a:off x="0" y="0"/>
+                          <a:ext cx="1104900" cy="1104900"/>
+                        </a:xfrm>
+                        <a:prstGeom prst="ellipse">
+                          <a:avLst/>
+                        </a:prstGeom>
+                        <a:blipFill dpi="0" rotWithShape="1">
+                          <a:blip r:embed="rId11" cstate="print">
+                            <a:extLst>
+                              <a:ext uri="{28A0092B-C50C-407E-A947-70E740481C1C}">
+                                <a14:useLocalDpi xmlns:a14="http://schemas.microsoft.com/office/drawing/2010/main" val="0"/>
+                              </a:ext>
+                            </a:extLst>
+                          </a:blip>
+                          <a:srcRect/>
+                          <a:stretch>
+                            <a:fillRect/>
+                          </a:stretch>
+                        </a:blipFill>
+                        <a:ln>
+                          <a:noFill/>
+                        </a:ln>
+                      </wps:spPr>
+                      <wps:style>
+                        <a:lnRef idx="2">
+                          <a:schemeClr val="accent1">
+                            <a:shade val="15000"/>
+                          </a:schemeClr>
+                        </a:lnRef>
+                        <a:fillRef idx="1">
+                          <a:schemeClr val="accent1"/>
+                        </a:fillRef>
+                        <a:effectRef idx="0">
+                          <a:schemeClr val="accent1"/>
+                        </a:effectRef>
+                        <a:fontRef idx="minor">
+                          <a:schemeClr val="lt1"/>
+                        </a:fontRef>
+                      </wps:style>
+                      <wps:bodyPr rot="0" spcFirstLastPara="0" vertOverflow="overflow" horzOverflow="overflow" vert="horz" wrap="square" lIns="91440" tIns="45720" rIns="91440" bIns="45720" numCol="1" spcCol="0" rtlCol="0" fromWordArt="0" anchor="ctr" anchorCtr="0" forceAA="0" compatLnSpc="1">
+                        <a:prstTxWarp prst="textNoShape">
+                          <a:avLst/>
+                        </a:prstTxWarp>
+                        <a:noAutofit/>
+                      </wps:bodyPr>
+                    </wps:wsp>
+                  </a:graphicData>
+                </a:graphic>
+                <wp14:sizeRelH relativeFrom="margin">
+                  <wp14:pctWidth>0</wp14:pctWidth>
+                </wp14:sizeRelH>
+                <wp14:sizeRelV relativeFrom="margin">
+                  <wp14:pctHeight>0</wp14:pctHeight>
+                </wp14:sizeRelV>
+              </wp:anchor>
+            </w:drawing>
+          </mc:Choice>
+          <mc:Fallback>
+            <w:pict>
+              <v:oval w14:anchorId="7B960EFD" id="Oval 10" o:spid="_x0000_s1026" style="position:absolute;margin-left:29.85pt;margin-top:109.6pt;width:87pt;height:87pt;z-index:251689984;visibility:visible;mso-wrap-style:square;mso-width-percent:0;mso-height-percent:0;mso-wrap-distance-left:9pt;mso-wrap-distance-top:0;mso-wrap-distance-right:9pt;mso-wrap-distance-bottom:0;mso-position-horizontal:absolute;mso-position-horizontal-relative:text;mso-position-vertical:absolute;mso-position-vertical-relative:text;mso-width-percent:0;mso-height-percent:0;mso-width-relative:margin;mso-height-relative:margin;v-text-anchor:middle" o:gfxdata="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" stroked="f" strokeweight="1pt">
+                <v:fill r:id="rId12" o:title="" recolor="t" rotate="t" type="frame"/>
+                <v:stroke joinstyle="miter"/>
+              </v:oval>
+            </w:pict>
+          </mc:Fallback>
+        </mc:AlternateContent>
+      </w:r>
+      <w:r>
+        <w:rPr>
+          <w:noProof/>
+        </w:rPr>
+        <mc:AlternateContent>
+          <mc:Choice Requires="wps">
+            <w:drawing>
+              <wp:anchor distT="0" distB="0" distL="114300" distR="114300" simplePos="0" relativeHeight="251688960" behindDoc="0" locked="0" layoutInCell="1" allowOverlap="1" wp14:anchorId="13F4C652" wp14:editId="3B1AA5ED">
+                <wp:simplePos x="0" y="0"/>
+                <wp:positionH relativeFrom="column">
+                  <wp:posOffset>389782</wp:posOffset>
+                </wp:positionH>
+                <wp:positionV relativeFrom="paragraph">
+                  <wp:posOffset>13586</wp:posOffset>
+                </wp:positionV>
+                <wp:extent cx="1104900" cy="1104900"/>
+                <wp:effectExtent l="0" t="0" r="0" b="0"/>
+                <wp:wrapNone/>
+                <wp:docPr id="578980711" name="Oval 10"/>
+                <wp:cNvGraphicFramePr/>
+                <a:graphic xmlns:a="http://schemas.openxmlformats.org/drawingml/2006/main">
+                  <a:graphicData uri="http://schemas.microsoft.com/office/word/2010/wordprocessingShape">
+                    <wps:wsp>
+                      <wps:cNvSpPr/>
+                      <wps:spPr>
+                        <a:xfrm>
+                          <a:off x="0" y="0"/>
+                          <a:ext cx="1104900" cy="1104900"/>
+                        </a:xfrm>
+                        <a:prstGeom prst="ellipse">
+                          <a:avLst/>
+                        </a:prstGeom>
+                        <a:blipFill dpi="0" rotWithShape="1">
+                          <a:blip r:embed="rId11" cstate="print">
+                            <a:extLst>
+                              <a:ext uri="{28A0092B-C50C-407E-A947-70E740481C1C}">
+                                <a14:useLocalDpi xmlns:a14="http://schemas.microsoft.com/office/drawing/2010/main" val="0"/>
+                              </a:ext>
+                            </a:extLst>
+                          </a:blip>
+                          <a:srcRect/>
+                          <a:stretch>
+                            <a:fillRect/>
+                          </a:stretch>
+                        </a:blipFill>
+                        <a:ln>
+                          <a:noFill/>
+                        </a:ln>
+                      </wps:spPr>
+                      <wps:style>
+                        <a:lnRef idx="2">
+                          <a:schemeClr val="accent1">
+                            <a:shade val="15000"/>
+                          </a:schemeClr>
+                        </a:lnRef>
+                        <a:fillRef idx="1">
+                          <a:schemeClr val="accent1"/>
+                        </a:fillRef>
+                        <a:effectRef idx="0">
+                          <a:schemeClr val="accent1"/>
+                        </a:effectRef>
+                        <a:fontRef idx="minor">
+                          <a:schemeClr val="lt1"/>
+                        </a:fontRef>
+                      </wps:style>
+                      <wps:bodyPr rot="0" spcFirstLastPara="0" vertOverflow="overflow" horzOverflow="overflow" vert="horz" wrap="square" lIns="91440" tIns="45720" rIns="91440" bIns="45720" numCol="1" spcCol="0" rtlCol="0" fromWordArt="0" anchor="ctr" anchorCtr="0" forceAA="0" compatLnSpc="1">
+                        <a:prstTxWarp prst="textNoShape">
+                          <a:avLst/>
+                        </a:prstTxWarp>
+                        <a:noAutofit/>
+                      </wps:bodyPr>
+                    </wps:wsp>
+                  </a:graphicData>
+                </a:graphic>
+                <wp14:sizeRelH relativeFrom="margin">
+                  <wp14:pctWidth>0</wp14:pctWidth>
+                </wp14:sizeRelH>
+                <wp14:sizeRelV relativeFrom="margin">
+                  <wp14:pctHeight>0</wp14:pctHeight>
+                </wp14:sizeRelV>
+              </wp:anchor>
+            </w:drawing>
+          </mc:Choice>
+          <mc:Fallback>
+            <w:pict>
+              <v:oval w14:anchorId="6B1A8F7E" id="Oval 10" o:spid="_x0000_s1026" style="position:absolute;margin-left:30.7pt;margin-top:1.05pt;width:87pt;height:87pt;z-index:251688960;visibility:visible;mso-wrap-style:square;mso-width-percent:0;mso-height-percent:0;mso-wrap-distance-left:9pt;mso-wrap-distance-top:0;mso-wrap-distance-right:9pt;mso-wrap-distance-bottom:0;mso-position-horizontal:absolute;mso-position-horizontal-relative:text;mso-position-vertical:absolute;mso-position-vertical-relative:text;mso-width-percent:0;mso-height-percent:0;mso-width-relative:margin;mso-height-relative:margin;v-text-anchor:middle" o:gfxdata="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" stroked="f" strokeweight="1pt">
+                <v:fill r:id="rId12" o:title="" recolor="t" rotate="t" type="frame"/>
+                <v:stroke joinstyle="miter"/>
+              </v:oval>
+            </w:pict>
+          </mc:Fallback>
+        </mc:AlternateContent>
+      </w:r>
+    </w:p>
     <w:sectPr>
       <w:headerReference w:type="default" r:id="rId13"/>
       <w:footerReference w:type="default" r:id="rId14"/>
@@ -2002,7 +3342,7 @@
       <mc:AlternateContent>
         <mc:Choice Requires="wps">
           <w:drawing>
-            <wp:anchor distT="0" distB="0" distL="114300" distR="114300" simplePos="0" relativeHeight="251660288" behindDoc="0" locked="0" layoutInCell="1" allowOverlap="1" wp14:anchorId="5007E4CC" wp14:editId="6253BB5B">
+            <wp:anchor distT="0" distB="0" distL="114300" distR="114300" simplePos="0" relativeHeight="251660288" behindDoc="0" locked="0" layoutInCell="1" allowOverlap="1" wp14:anchorId="5007E4CC" wp14:editId="5B2F21FC">
               <wp:simplePos x="0" y="0"/>
               <wp:positionH relativeFrom="margin">
                 <wp:align>right</wp:align>
@@ -2027,6 +3367,11 @@
                       <a:prstGeom prst="rect">
                         <a:avLst/>
                       </a:prstGeom>
+                      <a:solidFill>
+                        <a:schemeClr val="accent3">
+                          <a:lumMod val="50000"/>
+                        </a:schemeClr>
+                      </a:solidFill>
                       <a:ln>
                         <a:noFill/>
                       </a:ln>
@@ -2067,7 +3412,7 @@
         </mc:Choice>
         <mc:Fallback>
           <w:pict>
-            <v:rect w14:anchorId="05B06811" id="Rectangle 7" o:spid="_x0000_s1026" style="position:absolute;margin-left:415.85pt;margin-top:-17.15pt;width:467.05pt;height:3.6pt;z-index:251660288;visibility:visible;mso-wrap-style:square;mso-width-percent:0;mso-height-percent:0;mso-wrap-distance-left:9pt;mso-wrap-distance-top:0;mso-wrap-distance-right:9pt;mso-wrap-distance-bottom:0;mso-position-horizontal:right;mso-position-horizontal-relative:margin;mso-position-vertical:absolute;mso-position-vertical-relative:text;mso-width-percent:0;mso-height-percent:0;mso-width-relative:margin;mso-height-relative:margin;v-text-anchor:middle" o:gfxdata="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" fillcolor="#196b24 [3206]" stroked="f" strokeweight="1pt">
+            <v:rect w14:anchorId="37AA57B4" id="Rectangle 7" o:spid="_x0000_s1026" style="position:absolute;margin-left:415.85pt;margin-top:-17.15pt;width:467.05pt;height:3.6pt;z-index:251660288;visibility:visible;mso-wrap-style:square;mso-width-percent:0;mso-height-percent:0;mso-wrap-distance-left:9pt;mso-wrap-distance-top:0;mso-wrap-distance-right:9pt;mso-wrap-distance-bottom:0;mso-position-horizontal:right;mso-position-horizontal-relative:margin;mso-position-vertical:absolute;mso-position-vertical-relative:text;mso-width-percent:0;mso-height-percent:0;mso-width-relative:margin;mso-height-relative:margin;v-text-anchor:middle" o:gfxdata="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" fillcolor="#0c3511 [1606]" stroked="f" strokeweight="1pt">
               <w10:wrap anchorx="margin"/>
             </v:rect>
           </w:pict>
@@ -2165,13 +3510,84 @@
     <w:pPr>
       <w:pStyle w:val="Header"/>
       <w:tabs>
-        <w:tab w:val="clear" w:pos="4680"/>
         <w:tab w:val="clear" w:pos="9360"/>
-        <w:tab w:val="left" w:pos="4973"/>
-        <w:tab w:val="left" w:pos="5777"/>
       </w:tabs>
-      <w:jc w:val="center"/>
+      <w:rPr>
+        <w:noProof/>
+      </w:rPr>
     </w:pPr>
+    <w:r>
+      <w:rPr>
+        <w:noProof/>
+      </w:rPr>
+      <w:drawing>
+        <wp:anchor distT="0" distB="0" distL="114300" distR="114300" simplePos="0" relativeHeight="251664384" behindDoc="1" locked="0" layoutInCell="1" allowOverlap="1" wp14:anchorId="1E4596FC" wp14:editId="75676F7C">
+          <wp:simplePos x="0" y="0"/>
+          <wp:positionH relativeFrom="margin">
+            <wp:align>right</wp:align>
+          </wp:positionH>
+          <wp:positionV relativeFrom="paragraph">
+            <wp:posOffset>76640</wp:posOffset>
+          </wp:positionV>
+          <wp:extent cx="5940425" cy="460375"/>
+          <wp:effectExtent l="0" t="0" r="3175" b="0"/>
+          <wp:wrapNone/>
+          <wp:docPr id="1784924289" name="Picture 17"/>
+          <wp:cNvGraphicFramePr>
+            <a:graphicFrameLocks xmlns:a="http://schemas.openxmlformats.org/drawingml/2006/main" noChangeAspect="1"/>
+          </wp:cNvGraphicFramePr>
+          <a:graphic xmlns:a="http://schemas.openxmlformats.org/drawingml/2006/main">
+            <a:graphicData uri="http://schemas.openxmlformats.org/drawingml/2006/picture">
+              <pic:pic xmlns:pic="http://schemas.openxmlformats.org/drawingml/2006/picture">
+                <pic:nvPicPr>
+                  <pic:cNvPr id="0" name="Picture 10"/>
+                  <pic:cNvPicPr>
+                    <a:picLocks noChangeAspect="1" noChangeArrowheads="1"/>
+                  </pic:cNvPicPr>
+                </pic:nvPicPr>
+                <pic:blipFill rotWithShape="1">
+                  <a:blip r:embed="rId1">
+                    <a:extLst>
+                      <a:ext uri="{28A0092B-C50C-407E-A947-70E740481C1C}">
+                        <a14:useLocalDpi xmlns:a14="http://schemas.microsoft.com/office/drawing/2010/main" val="0"/>
+                      </a:ext>
+                    </a:extLst>
+                  </a:blip>
+                  <a:srcRect b="87333"/>
+                  <a:stretch>
+                    <a:fillRect/>
+                  </a:stretch>
+                </pic:blipFill>
+                <pic:spPr bwMode="auto">
+                  <a:xfrm>
+                    <a:off x="0" y="0"/>
+                    <a:ext cx="5940425" cy="460375"/>
+                  </a:xfrm>
+                  <a:prstGeom prst="rect">
+                    <a:avLst/>
+                  </a:prstGeom>
+                  <a:noFill/>
+                  <a:ln>
+                    <a:noFill/>
+                  </a:ln>
+                  <a:extLst>
+                    <a:ext uri="{53640926-AAD7-44D8-BBD7-CCE9431645EC}">
+                      <a14:shadowObscured xmlns:a14="http://schemas.microsoft.com/office/drawing/2010/main"/>
+                    </a:ext>
+                  </a:extLst>
+                </pic:spPr>
+              </pic:pic>
+            </a:graphicData>
+          </a:graphic>
+          <wp14:sizeRelH relativeFrom="page">
+            <wp14:pctWidth>0</wp14:pctWidth>
+          </wp14:sizeRelH>
+          <wp14:sizeRelV relativeFrom="page">
+            <wp14:pctHeight>0</wp14:pctHeight>
+          </wp14:sizeRelV>
+        </wp:anchor>
+      </w:drawing>
+    </w:r>
     <w:r>
       <w:rPr>
         <w:noProof/>
@@ -2179,154 +3595,58 @@
       <mc:AlternateContent>
         <mc:Choice Requires="wps">
           <w:drawing>
-            <wp:anchor distT="0" distB="0" distL="118745" distR="118745" simplePos="0" relativeHeight="251659264" behindDoc="1" locked="0" layoutInCell="1" allowOverlap="0" wp14:anchorId="119A4155" wp14:editId="476D6A29">
+            <wp:anchor distT="0" distB="0" distL="114300" distR="114300" simplePos="0" relativeHeight="251665408" behindDoc="0" locked="0" layoutInCell="1" allowOverlap="1" wp14:anchorId="570CF2D3" wp14:editId="2C619A87">
               <wp:simplePos x="0" y="0"/>
-              <wp:positionH relativeFrom="margin">
-                <wp:align>right</wp:align>
+              <wp:positionH relativeFrom="column">
+                <wp:posOffset>104661</wp:posOffset>
               </wp:positionH>
-              <wp:positionV relativeFrom="page">
-                <wp:posOffset>231775</wp:posOffset>
+              <wp:positionV relativeFrom="paragraph">
+                <wp:posOffset>172135</wp:posOffset>
               </wp:positionV>
-              <wp:extent cx="5949950" cy="457835"/>
-              <wp:effectExtent l="0" t="0" r="0" b="0"/>
-              <wp:wrapSquare wrapText="bothSides"/>
-              <wp:docPr id="197" name="Rectangle 200"/>
+              <wp:extent cx="1492250" cy="279400"/>
+              <wp:effectExtent l="0" t="0" r="0" b="6350"/>
+              <wp:wrapNone/>
+              <wp:docPr id="1158787631" name="Text Box 18"/>
               <wp:cNvGraphicFramePr/>
               <a:graphic xmlns:a="http://schemas.openxmlformats.org/drawingml/2006/main">
                 <a:graphicData uri="http://schemas.microsoft.com/office/word/2010/wordprocessingShape">
                   <wps:wsp>
-                    <wps:cNvSpPr/>
+                    <wps:cNvSpPr txBox="1"/>
                     <wps:spPr>
                       <a:xfrm>
                         <a:off x="0" y="0"/>
-                        <a:ext cx="5949950" cy="457835"/>
+                        <a:ext cx="1492250" cy="279400"/>
                       </a:xfrm>
                       <a:prstGeom prst="rect">
                         <a:avLst/>
                       </a:prstGeom>
-                      <a:solidFill>
-                        <a:schemeClr val="accent3"/>
-                      </a:solidFill>
-                      <a:ln>
+                      <a:noFill/>
+                      <a:ln w="6350">
                         <a:noFill/>
                       </a:ln>
                     </wps:spPr>
-                    <wps:style>
-                      <a:lnRef idx="0">
-                        <a:scrgbClr r="0" g="0" b="0"/>
-                      </a:lnRef>
-                      <a:fillRef idx="0">
-                        <a:scrgbClr r="0" g="0" b="0"/>
-                      </a:fillRef>
-                      <a:effectRef idx="0">
-                        <a:scrgbClr r="0" g="0" b="0"/>
-                      </a:effectRef>
-                      <a:fontRef idx="minor">
-                        <a:schemeClr val="lt1"/>
-                      </a:fontRef>
-                    </wps:style>
                     <wps:txbx>
                       <w:txbxContent>
                         <w:p>
                           <w:pPr>
-                            <w:pStyle w:val="Header"/>
-                            <w:tabs>
-                              <w:tab w:val="clear" w:pos="4680"/>
-                              <w:tab w:val="clear" w:pos="9360"/>
-                            </w:tabs>
                             <w:rPr>
-                              <w:caps/>
+                              <w:b/>
+                              <w:bCs/>
                               <w:color w:val="FFFFFF" w:themeColor="background1"/>
                             </w:rPr>
                           </w:pPr>
                           <w:r>
                             <w:rPr>
-                              <w:caps/>
+                              <w:b/>
+                              <w:bCs/>
                               <w:color w:val="FFFFFF" w:themeColor="background1"/>
                             </w:rPr>
-                            <w:t>TEAM Proposal</w:t>
-                          </w:r>
-                          <w:r>
-                            <w:rPr>
-                              <w:caps/>
-                              <w:color w:val="FFFFFF" w:themeColor="background1"/>
-                            </w:rPr>
-                            <w:tab/>
-                          </w:r>
-                          <w:r>
-                            <w:rPr>
-                              <w:caps/>
-                              <w:color w:val="FFFFFF" w:themeColor="background1"/>
-                            </w:rPr>
-                            <w:tab/>
-                          </w:r>
-                          <w:r>
-                            <w:rPr>
-                              <w:caps/>
-                              <w:color w:val="FFFFFF" w:themeColor="background1"/>
-                            </w:rPr>
-                            <w:tab/>
-                          </w:r>
-                          <w:r>
-                            <w:rPr>
-                              <w:caps/>
-                              <w:color w:val="FFFFFF" w:themeColor="background1"/>
-                            </w:rPr>
-                            <w:tab/>
-                          </w:r>
-                          <w:r>
-                            <w:rPr>
-                              <w:caps/>
-                              <w:color w:val="FFFFFF" w:themeColor="background1"/>
-                            </w:rPr>
-                            <w:tab/>
-                          </w:r>
-                          <w:r>
-                            <w:rPr>
-                              <w:caps/>
-                              <w:color w:val="FFFFFF" w:themeColor="background1"/>
-                            </w:rPr>
-                            <w:tab/>
-                          </w:r>
-                          <w:r>
-                            <w:rPr>
-                              <w:caps/>
-                              <w:color w:val="FFFFFF" w:themeColor="background1"/>
-                            </w:rPr>
-                            <w:tab/>
-                          </w:r>
-                          <w:r>
-                            <w:rPr>
-                              <w:caps/>
-                              <w:color w:val="FFFFFF" w:themeColor="background1"/>
-                            </w:rPr>
-                            <w:tab/>
-                          </w:r>
-                          <w:proofErr w:type="spellStart"/>
-                          <w:r>
-                            <w:rPr>
-                              <w:color w:val="FFFFFF" w:themeColor="background1"/>
-                            </w:rPr>
-                            <w:t>ideasprint</w:t>
-                          </w:r>
-                          <w:proofErr w:type="spellEnd"/>
-                          <w:r>
-                            <w:rPr>
-                              <w:color w:val="FFFFFF" w:themeColor="background1"/>
-                            </w:rPr>
-                            <w:t xml:space="preserve"> </w:t>
-                          </w:r>
-                          <w:r>
-                            <w:rPr>
-                              <w:caps/>
-                              <w:color w:val="FFFFFF" w:themeColor="background1"/>
-                            </w:rPr>
-                            <w:t>2026</w:t>
+                            <w:t>TEAM PROPOSAL</w:t>
                           </w:r>
                         </w:p>
                       </w:txbxContent>
                     </wps:txbx>
-                    <wps:bodyPr rot="0" spcFirstLastPara="0" vertOverflow="overflow" horzOverflow="overflow" vert="horz" wrap="square" lIns="91440" tIns="45720" rIns="91440" bIns="45720" numCol="1" spcCol="0" rtlCol="0" fromWordArt="0" anchor="ctr" anchorCtr="0" forceAA="0" compatLnSpc="1">
+                    <wps:bodyPr rot="0" spcFirstLastPara="0" vertOverflow="overflow" horzOverflow="overflow" vert="horz" wrap="square" lIns="91440" tIns="45720" rIns="91440" bIns="45720" numCol="1" spcCol="0" rtlCol="0" fromWordArt="0" anchor="t" anchorCtr="0" forceAA="0" compatLnSpc="1">
                       <a:prstTxWarp prst="textNoShape">
                         <a:avLst/>
                       </a:prstTxWarp>
@@ -2336,9 +3656,9 @@
                 </a:graphicData>
               </a:graphic>
               <wp14:sizeRelH relativeFrom="margin">
-                <wp14:pctWidth>100000</wp14:pctWidth>
+                <wp14:pctWidth>0</wp14:pctWidth>
               </wp14:sizeRelH>
-              <wp14:sizeRelV relativeFrom="page">
+              <wp14:sizeRelV relativeFrom="margin">
                 <wp14:pctHeight>0</wp14:pctHeight>
               </wp14:sizeRelV>
             </wp:anchor>
@@ -2346,113 +3666,133 @@
         </mc:Choice>
         <mc:Fallback>
           <w:pict>
-            <v:rect w14:anchorId="119A4155" id="Rectangle 200" o:spid="_x0000_s1026" style="position:absolute;left:0;text-align:left;margin-left:417.3pt;margin-top:18.25pt;width:468.5pt;height:36.05pt;z-index:-251657216;visibility:visible;mso-wrap-style:square;mso-width-percent:1000;mso-height-percent:0;mso-wrap-distance-left:9.35pt;mso-wrap-distance-top:0;mso-wrap-distance-right:9.35pt;mso-wrap-distance-bottom:0;mso-position-horizontal:right;mso-position-horizontal-relative:margin;mso-position-vertical:absolute;mso-position-vertical-relative:page;mso-width-percent:1000;mso-height-percent:0;mso-width-relative:margin;mso-height-relative:page;v-text-anchor:middle" o:gfxdata="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" o:allowoverlap="f" fillcolor="#196b24 [3206]" stroked="f">
+            <v:shapetype w14:anchorId="570CF2D3" id="_x0000_t202" coordsize="21600,21600" o:spt="202" path="m,l,21600r21600,l21600,xe">
+              <v:stroke joinstyle="miter"/>
+              <v:path gradientshapeok="t" o:connecttype="rect"/>
+            </v:shapetype>
+            <v:shape id="Text Box 18" o:spid="_x0000_s1031" type="#_x0000_t202" style="position:absolute;margin-left:8.25pt;margin-top:13.55pt;width:117.5pt;height:22pt;z-index:251665408;visibility:visible;mso-wrap-style:square;mso-width-percent:0;mso-height-percent:0;mso-wrap-distance-left:9pt;mso-wrap-distance-top:0;mso-wrap-distance-right:9pt;mso-wrap-distance-bottom:0;mso-position-horizontal:absolute;mso-position-horizontal-relative:text;mso-position-vertical:absolute;mso-position-vertical-relative:text;mso-width-percent:0;mso-height-percent:0;mso-width-relative:margin;mso-height-relative:margin;v-text-anchor:top" o:gfxdata="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" filled="f" stroked="f" strokeweight=".5pt">
               <v:textbox>
                 <w:txbxContent>
                   <w:p>
                     <w:pPr>
-                      <w:pStyle w:val="Header"/>
-                      <w:tabs>
-                        <w:tab w:val="clear" w:pos="4680"/>
-                        <w:tab w:val="clear" w:pos="9360"/>
-                      </w:tabs>
                       <w:rPr>
-                        <w:caps/>
+                        <w:b/>
+                        <w:bCs/>
                         <w:color w:val="FFFFFF" w:themeColor="background1"/>
                       </w:rPr>
                     </w:pPr>
                     <w:r>
                       <w:rPr>
-                        <w:caps/>
+                        <w:b/>
+                        <w:bCs/>
                         <w:color w:val="FFFFFF" w:themeColor="background1"/>
                       </w:rPr>
-                      <w:t>TEAM Proposal</w:t>
-                    </w:r>
-                    <w:r>
-                      <w:rPr>
-                        <w:caps/>
-                        <w:color w:val="FFFFFF" w:themeColor="background1"/>
-                      </w:rPr>
-                      <w:tab/>
-                    </w:r>
-                    <w:r>
-                      <w:rPr>
-                        <w:caps/>
-                        <w:color w:val="FFFFFF" w:themeColor="background1"/>
-                      </w:rPr>
-                      <w:tab/>
-                    </w:r>
-                    <w:r>
-                      <w:rPr>
-                        <w:caps/>
-                        <w:color w:val="FFFFFF" w:themeColor="background1"/>
-                      </w:rPr>
-                      <w:tab/>
-                    </w:r>
-                    <w:r>
-                      <w:rPr>
-                        <w:caps/>
-                        <w:color w:val="FFFFFF" w:themeColor="background1"/>
-                      </w:rPr>
-                      <w:tab/>
-                    </w:r>
-                    <w:r>
-                      <w:rPr>
-                        <w:caps/>
-                        <w:color w:val="FFFFFF" w:themeColor="background1"/>
-                      </w:rPr>
-                      <w:tab/>
-                    </w:r>
-                    <w:r>
-                      <w:rPr>
-                        <w:caps/>
-                        <w:color w:val="FFFFFF" w:themeColor="background1"/>
-                      </w:rPr>
-                      <w:tab/>
-                    </w:r>
-                    <w:r>
-                      <w:rPr>
-                        <w:caps/>
-                        <w:color w:val="FFFFFF" w:themeColor="background1"/>
-                      </w:rPr>
-                      <w:tab/>
-                    </w:r>
-                    <w:r>
-                      <w:rPr>
-                        <w:caps/>
-                        <w:color w:val="FFFFFF" w:themeColor="background1"/>
-                      </w:rPr>
-                      <w:tab/>
-                    </w:r>
-                    <w:proofErr w:type="spellStart"/>
-                    <w:r>
-                      <w:rPr>
-                        <w:color w:val="FFFFFF" w:themeColor="background1"/>
-                      </w:rPr>
-                      <w:t>ideasprint</w:t>
-                    </w:r>
-                    <w:proofErr w:type="spellEnd"/>
-                    <w:r>
-                      <w:rPr>
-                        <w:color w:val="FFFFFF" w:themeColor="background1"/>
-                      </w:rPr>
-                      <w:t xml:space="preserve"> </w:t>
-                    </w:r>
-                    <w:r>
-                      <w:rPr>
-                        <w:caps/>
-                        <w:color w:val="FFFFFF" w:themeColor="background1"/>
-                      </w:rPr>
-                      <w:t>2026</w:t>
+                      <w:t>TEAM PROPOSAL</w:t>
                     </w:r>
                   </w:p>
                 </w:txbxContent>
               </v:textbox>
-              <w10:wrap type="square" anchorx="margin" anchory="page"/>
-            </v:rect>
+            </v:shape>
           </w:pict>
         </mc:Fallback>
       </mc:AlternateContent>
+    </w:r>
+  </w:p>
+  <w:p>
+    <w:pPr>
+      <w:pStyle w:val="Header"/>
+      <w:tabs>
+        <w:tab w:val="clear" w:pos="9360"/>
+      </w:tabs>
+      <w:rPr>
+        <w:noProof/>
+      </w:rPr>
+    </w:pPr>
+    <w:r>
+      <w:rPr>
+        <w:noProof/>
+      </w:rPr>
+      <w:drawing>
+        <wp:anchor distT="0" distB="0" distL="114300" distR="114300" simplePos="0" relativeHeight="251663360" behindDoc="0" locked="0" layoutInCell="1" allowOverlap="1" wp14:anchorId="54E7D386" wp14:editId="5BD710F0">
+          <wp:simplePos x="0" y="0"/>
+          <wp:positionH relativeFrom="margin">
+            <wp:posOffset>4040208</wp:posOffset>
+          </wp:positionH>
+          <wp:positionV relativeFrom="paragraph">
+            <wp:posOffset>1905</wp:posOffset>
+          </wp:positionV>
+          <wp:extent cx="1659467" cy="311150"/>
+          <wp:effectExtent l="0" t="0" r="0" b="0"/>
+          <wp:wrapNone/>
+          <wp:docPr id="259930182" name="Picture 14"/>
+          <wp:cNvGraphicFramePr>
+            <a:graphicFrameLocks xmlns:a="http://schemas.openxmlformats.org/drawingml/2006/main" noChangeAspect="1"/>
+          </wp:cNvGraphicFramePr>
+          <a:graphic xmlns:a="http://schemas.openxmlformats.org/drawingml/2006/main">
+            <a:graphicData uri="http://schemas.openxmlformats.org/drawingml/2006/picture">
+              <pic:pic xmlns:pic="http://schemas.openxmlformats.org/drawingml/2006/picture">
+                <pic:nvPicPr>
+                  <pic:cNvPr id="0" name="Picture 7"/>
+                  <pic:cNvPicPr>
+                    <a:picLocks noChangeAspect="1" noChangeArrowheads="1"/>
+                  </pic:cNvPicPr>
+                </pic:nvPicPr>
+                <pic:blipFill>
+                  <a:blip r:embed="rId2">
+                    <a:extLst>
+                      <a:ext uri="{28A0092B-C50C-407E-A947-70E740481C1C}">
+                        <a14:useLocalDpi xmlns:a14="http://schemas.microsoft.com/office/drawing/2010/main" val="0"/>
+                      </a:ext>
+                    </a:extLst>
+                  </a:blip>
+                  <a:srcRect/>
+                  <a:stretch>
+                    <a:fillRect/>
+                  </a:stretch>
+                </pic:blipFill>
+                <pic:spPr bwMode="auto">
+                  <a:xfrm>
+                    <a:off x="0" y="0"/>
+                    <a:ext cx="1659467" cy="311150"/>
+                  </a:xfrm>
+                  <a:prstGeom prst="rect">
+                    <a:avLst/>
+                  </a:prstGeom>
+                  <a:noFill/>
+                  <a:ln>
+                    <a:noFill/>
+                  </a:ln>
+                </pic:spPr>
+              </pic:pic>
+            </a:graphicData>
+          </a:graphic>
+          <wp14:sizeRelH relativeFrom="margin">
+            <wp14:pctWidth>0</wp14:pctWidth>
+          </wp14:sizeRelH>
+          <wp14:sizeRelV relativeFrom="margin">
+            <wp14:pctHeight>0</wp14:pctHeight>
+          </wp14:sizeRelV>
+        </wp:anchor>
+      </w:drawing>
+    </w:r>
+    <w:r>
+      <w:rPr>
+        <w:noProof/>
+      </w:rPr>
+      <w:tab/>
+    </w:r>
+  </w:p>
+  <w:p>
+    <w:pPr>
+      <w:pStyle w:val="Header"/>
+      <w:tabs>
+        <w:tab w:val="clear" w:pos="4680"/>
+        <w:tab w:val="clear" w:pos="9360"/>
+        <w:tab w:val="left" w:pos="5956"/>
+      </w:tabs>
+    </w:pPr>
+    <w:r>
+      <w:tab/>
     </w:r>
   </w:p>
 </w:hdr>

</xml_diff>

<commit_message>
New proposal template 📑
</commit_message>
<xml_diff>
--- a/public/assets/ideasprint-proposal-template.docx
+++ b/public/assets/ideasprint-proposal-template.docx
@@ -214,17 +214,7 @@
                     <w:sz w:val="32"/>
                     <w:szCs w:val="32"/>
                   </w:rPr>
-                  <w:t xml:space="preserve"> </w:t>
-                </w:r>
-                <w:proofErr w:type="gramStart"/>
-                <w:r>
-                  <w:rPr>
-                    <w:rFonts w:cs="Poppins"/>
-                    <w:color w:val="FFFFFF" w:themeColor="background1"/>
-                    <w:sz w:val="32"/>
-                    <w:szCs w:val="32"/>
-                  </w:rPr>
-                  <w:t xml:space="preserve">  </w:t>
+                  <w:t xml:space="preserve">   </w:t>
                 </w:r>
                 <w:r>
                   <w:rPr>
@@ -235,7 +225,6 @@
                   </w:rPr>
                   <w:t>:</w:t>
                 </w:r>
-                <w:proofErr w:type="gramEnd"/>
               </w:p>
             </w:tc>
             <w:tc>
@@ -298,17 +287,7 @@
                     <w:sz w:val="32"/>
                     <w:szCs w:val="32"/>
                   </w:rPr>
-                  <w:t xml:space="preserve">  </w:t>
-                </w:r>
-                <w:proofErr w:type="gramStart"/>
-                <w:r>
-                  <w:rPr>
-                    <w:rFonts w:cs="Poppins"/>
-                    <w:color w:val="FFFFFF" w:themeColor="background1"/>
-                    <w:sz w:val="32"/>
-                    <w:szCs w:val="32"/>
-                  </w:rPr>
-                  <w:t xml:space="preserve">  </w:t>
+                  <w:t xml:space="preserve">    </w:t>
                 </w:r>
                 <w:r>
                   <w:rPr>
@@ -319,7 +298,6 @@
                   </w:rPr>
                   <w:t>:</w:t>
                 </w:r>
-                <w:proofErr w:type="gramEnd"/>
               </w:p>
             </w:tc>
             <w:tc>
@@ -391,17 +369,7 @@
                     <w:sz w:val="32"/>
                     <w:szCs w:val="32"/>
                   </w:rPr>
-                  <w:t xml:space="preserve">  </w:t>
-                </w:r>
-                <w:proofErr w:type="gramStart"/>
-                <w:r>
-                  <w:rPr>
-                    <w:rFonts w:cs="Poppins"/>
-                    <w:color w:val="FFFFFF" w:themeColor="background1"/>
-                    <w:sz w:val="32"/>
-                    <w:szCs w:val="32"/>
-                  </w:rPr>
-                  <w:t xml:space="preserve">  </w:t>
+                  <w:t xml:space="preserve">    </w:t>
                 </w:r>
                 <w:r>
                   <w:rPr>
@@ -412,7 +380,6 @@
                   </w:rPr>
                   <w:t>:</w:t>
                 </w:r>
-                <w:proofErr w:type="gramEnd"/>
               </w:p>
             </w:tc>
             <w:tc>
@@ -473,7 +440,7 @@
               <w:sz w:val="2"/>
             </w:rPr>
             <w:drawing>
-              <wp:anchor distT="0" distB="0" distL="114300" distR="114300" simplePos="0" relativeHeight="251703296" behindDoc="0" locked="0" layoutInCell="1" allowOverlap="1" wp14:anchorId="2EFE9B03" wp14:editId="33C1C520">
+              <wp:anchor distT="0" distB="0" distL="114300" distR="114300" simplePos="0" relativeHeight="251703296" behindDoc="0" locked="0" layoutInCell="1" allowOverlap="1" wp14:anchorId="2EFE9B03" wp14:editId="36F182A5">
                 <wp:simplePos x="0" y="0"/>
                 <wp:positionH relativeFrom="margin">
                   <wp:align>center</wp:align>
@@ -714,39 +681,60 @@
     <w:p>
       <w:pPr>
         <w:jc w:val="both"/>
+        <w:rPr>
+          <w:rFonts w:ascii="Poppins" w:hAnsi="Poppins" w:cs="Poppins"/>
+        </w:rPr>
       </w:pPr>
       <w:r>
+        <w:rPr>
+          <w:rFonts w:ascii="Poppins" w:hAnsi="Poppins" w:cs="Poppins"/>
+        </w:rPr>
         <w:t>Clearly define the problem this project addresses. Who is affected, and why does this problem matter right now?</w:t>
       </w:r>
     </w:p>
     <w:p>
       <w:pPr>
         <w:jc w:val="both"/>
+        <w:rPr>
+          <w:rFonts w:ascii="Poppins" w:hAnsi="Poppins" w:cs="Poppins"/>
+        </w:rPr>
       </w:pPr>
       <w:r>
+        <w:rPr>
+          <w:rFonts w:ascii="Poppins" w:hAnsi="Poppins" w:cs="Poppins"/>
+        </w:rPr>
         <w:t xml:space="preserve">Describe the proposed solution in one concise </w:t>
       </w:r>
       <w:r>
+        <w:rPr>
+          <w:rFonts w:ascii="Poppins" w:hAnsi="Poppins" w:cs="Poppins"/>
+        </w:rPr>
         <w:t>paragraph.</w:t>
       </w:r>
     </w:p>
-    <w:p/>
-    <w:p/>
-    <w:p/>
-    <w:p/>
-    <w:p/>
-    <w:p/>
-    <w:p/>
-    <w:p/>
     <w:p>
       <w:pPr>
         <w:rPr>
-          <w:rFonts w:cs="Poppins"/>
+          <w:rFonts w:ascii="Poppins" w:hAnsi="Poppins" w:cs="Poppins"/>
+        </w:rPr>
+      </w:pPr>
+    </w:p>
+    <w:p/>
+    <w:p/>
+    <w:p/>
+    <w:p/>
+    <w:p/>
+    <w:p/>
+    <w:p/>
+    <w:p>
+      <w:pPr>
+        <w:rPr>
+          <w:rFonts w:ascii="Poppins" w:hAnsi="Poppins" w:cs="Poppins"/>
         </w:rPr>
       </w:pPr>
       <w:r>
         <w:rPr>
-          <w:rFonts w:cs="Poppins"/>
+          <w:rFonts w:ascii="Poppins" w:hAnsi="Poppins" w:cs="Poppins"/>
         </w:rPr>
         <w:t>What are the root causes and who is most affected?</w:t>
       </w:r>
@@ -754,12 +742,12 @@
     <w:p>
       <w:pPr>
         <w:rPr>
-          <w:rFonts w:cs="Poppins"/>
+          <w:rFonts w:ascii="Poppins" w:hAnsi="Poppins" w:cs="Poppins"/>
         </w:rPr>
       </w:pPr>
       <w:r>
         <w:rPr>
-          <w:rFonts w:cs="Poppins"/>
+          <w:rFonts w:ascii="Poppins" w:hAnsi="Poppins" w:cs="Poppins"/>
         </w:rPr>
         <w:t>Analyze existing solutions and clearly explain their limitations.</w:t>
       </w:r>
@@ -767,22 +755,197 @@
     <w:p>
       <w:pPr>
         <w:rPr>
-          <w:rFonts w:cs="Poppins"/>
+          <w:rFonts w:ascii="Poppins" w:hAnsi="Poppins" w:cs="Poppins"/>
         </w:rPr>
       </w:pPr>
       <w:r>
-        <w:t>I</w:t>
+        <w:rPr>
+          <w:rFonts w:ascii="Poppins" w:hAnsi="Poppins" w:cs="Poppins"/>
+        </w:rPr>
+        <w:t>Identify current competitors and substitutes.</w:t>
+      </w:r>
+    </w:p>
+    <w:p>
+      <w:pPr>
+        <w:rPr>
+          <w:rFonts w:ascii="Poppins" w:hAnsi="Poppins" w:cs="Poppins"/>
+        </w:rPr>
+      </w:pPr>
+    </w:p>
+    <w:p/>
+    <w:p/>
+    <w:p/>
+    <w:p/>
+    <w:p/>
+    <w:tbl>
+      <w:tblPr>
+        <w:tblStyle w:val="TableGrid"/>
+        <w:tblpPr w:leftFromText="180" w:rightFromText="180" w:vertAnchor="text" w:tblpY="361"/>
+        <w:tblW w:w="0" w:type="auto"/>
+        <w:tblLook w:val="04A0" w:firstRow="1" w:lastRow="0" w:firstColumn="1" w:lastColumn="0" w:noHBand="0" w:noVBand="1"/>
+      </w:tblPr>
+      <w:tblGrid>
+        <w:gridCol w:w="9350"/>
+      </w:tblGrid>
+      <w:tr>
+        <w:trPr>
+          <w:trHeight w:val="836"/>
+        </w:trPr>
+        <w:tc>
+          <w:tcPr>
+            <w:tcW w:w="9350" w:type="dxa"/>
+            <w:vAlign w:val="center"/>
+          </w:tcPr>
+          <w:p>
+            <w:pPr>
+              <w:rPr>
+                <w:rFonts w:ascii="Poppins" w:hAnsi="Poppins" w:cs="Poppins"/>
+                <w:b/>
+                <w:bCs/>
+              </w:rPr>
+            </w:pPr>
+            <w:r>
+              <w:rPr>
+                <w:rFonts w:ascii="Poppins" w:hAnsi="Poppins" w:cs="Poppins"/>
+                <w:b/>
+                <w:bCs/>
+              </w:rPr>
+              <w:lastRenderedPageBreak/>
+              <w:t>Solution</w:t>
+            </w:r>
+          </w:p>
+        </w:tc>
+      </w:tr>
+    </w:tbl>
+    <w:p/>
+    <w:p/>
+    <w:tbl>
+      <w:tblPr>
+        <w:tblStyle w:val="TableGrid"/>
+        <w:tblpPr w:leftFromText="180" w:rightFromText="180" w:vertAnchor="text" w:tblpY="4945"/>
+        <w:tblW w:w="0" w:type="auto"/>
+        <w:tblLook w:val="04A0" w:firstRow="1" w:lastRow="0" w:firstColumn="1" w:lastColumn="0" w:noHBand="0" w:noVBand="1"/>
+      </w:tblPr>
+      <w:tblGrid>
+        <w:gridCol w:w="9350"/>
+      </w:tblGrid>
+      <w:tr>
+        <w:trPr>
+          <w:trHeight w:val="803"/>
+        </w:trPr>
+        <w:tc>
+          <w:tcPr>
+            <w:tcW w:w="9350" w:type="dxa"/>
+            <w:vAlign w:val="center"/>
+          </w:tcPr>
+          <w:p>
+            <w:pPr>
+              <w:rPr>
+                <w:rFonts w:ascii="Poppins" w:hAnsi="Poppins" w:cs="Poppins"/>
+                <w:b/>
+                <w:bCs/>
+              </w:rPr>
+            </w:pPr>
+            <w:r>
+              <w:rPr>
+                <w:rFonts w:ascii="Poppins" w:hAnsi="Poppins" w:cs="Poppins"/>
+                <w:b/>
+                <w:bCs/>
+              </w:rPr>
+              <w:t>Product Overview and Uniqueness</w:t>
+            </w:r>
+          </w:p>
+        </w:tc>
+      </w:tr>
+    </w:tbl>
+    <w:p>
+      <w:pPr>
+        <w:jc w:val="both"/>
+        <w:rPr>
+          <w:rFonts w:ascii="Poppins" w:hAnsi="Poppins" w:cs="Poppins"/>
+        </w:rPr>
+      </w:pPr>
+      <w:r>
+        <w:rPr>
+          <w:rFonts w:ascii="Poppins" w:hAnsi="Poppins" w:cs="Poppins"/>
+        </w:rPr>
+        <w:t>Describe the proposed solution in a clear and practical manner. What is the system/product and how does it directly address the identified problem?</w:t>
+      </w:r>
+    </w:p>
+    <w:p>
+      <w:pPr>
+        <w:jc w:val="both"/>
+        <w:rPr>
+          <w:rFonts w:ascii="Poppins" w:hAnsi="Poppins" w:cs="Poppins"/>
+        </w:rPr>
+      </w:pPr>
+      <w:r>
+        <w:rPr>
+          <w:rFonts w:ascii="Poppins" w:hAnsi="Poppins" w:cs="Poppins"/>
+        </w:rPr>
+        <w:t>Explain the core functionality and key features without going too deep into technical implementation. Focus on what the system does and how it improves the current situation.</w:t>
+      </w:r>
+    </w:p>
+    <w:p/>
+    <w:p/>
+    <w:p/>
+    <w:p/>
+    <w:p/>
+    <w:p/>
+    <w:p>
+      <w:pPr>
+        <w:jc w:val="both"/>
+        <w:rPr>
+          <w:rFonts w:ascii="Poppins" w:hAnsi="Poppins" w:cs="Poppins"/>
+        </w:rPr>
+      </w:pPr>
+      <w:r>
+        <w:rPr>
+          <w:rFonts w:ascii="Poppins" w:hAnsi="Poppins" w:cs="Poppins"/>
+        </w:rPr>
+        <w:t>Provide a high-level overview of the product. What is it, who is it for, and what are its core functions?</w:t>
+      </w:r>
+    </w:p>
+    <w:p>
+      <w:pPr>
+        <w:jc w:val="both"/>
+        <w:rPr>
+          <w:rFonts w:ascii="Poppins" w:hAnsi="Poppins" w:cs="Poppins"/>
+        </w:rPr>
+      </w:pPr>
+      <w:r>
+        <w:rPr>
+          <w:rFonts w:ascii="Poppins" w:hAnsi="Poppins" w:cs="Poppins"/>
+        </w:rPr>
+        <w:t xml:space="preserve">Summarize the key features that define the product, focusing only on what </w:t>
       </w:r>
       <w:r>
         <w:rPr>
-          <w:rFonts w:cs="Poppins"/>
-        </w:rPr>
-        <w:t>dentify current competitors and substitutes.</w:t>
+          <w:rFonts w:ascii="Poppins" w:hAnsi="Poppins" w:cs="Poppins"/>
+        </w:rPr>
+        <w:t>delivers</w:t>
+      </w:r>
+      <w:r>
+        <w:rPr>
+          <w:rFonts w:ascii="Poppins" w:hAnsi="Poppins" w:cs="Poppins"/>
+        </w:rPr>
+        <w:t xml:space="preserve"> value to the user.</w:t>
       </w:r>
     </w:p>
-    <w:p/>
-    <w:p/>
-    <w:p/>
+    <w:p>
+      <w:pPr>
+        <w:jc w:val="both"/>
+        <w:rPr>
+          <w:rFonts w:ascii="Poppins" w:hAnsi="Poppins" w:cs="Poppins"/>
+        </w:rPr>
+      </w:pPr>
+      <w:r>
+        <w:rPr>
+          <w:rFonts w:ascii="Poppins" w:hAnsi="Poppins" w:cs="Poppins"/>
+        </w:rPr>
+        <w:t>Clearly explain what makes this product unique compared to existing solutions. Identify specific differences in functionality, approach, or user experience.</w:t>
+      </w:r>
+    </w:p>
     <w:p/>
     <w:p/>
     <w:tbl>
@@ -869,62 +1032,82 @@
     <w:p>
       <w:pPr>
         <w:rPr>
-          <w:rFonts w:cs="Poppins"/>
+          <w:rFonts w:ascii="Poppins" w:hAnsi="Poppins" w:cs="Poppins"/>
         </w:rPr>
       </w:pPr>
       <w:r>
         <w:rPr>
-          <w:rFonts w:cs="Poppins"/>
+          <w:rFonts w:ascii="Poppins" w:hAnsi="Poppins" w:cs="Poppins"/>
         </w:rPr>
         <w:t>Explain how this project creates value. Who are the target users/customers?</w:t>
       </w:r>
       <w:r>
         <w:rPr>
-          <w:rFonts w:cs="Poppins"/>
+          <w:rFonts w:ascii="Poppins" w:hAnsi="Poppins" w:cs="Poppins"/>
         </w:rPr>
         <w:br/>
         <w:t>Describe the revenue model (if applicable) or sustainability approach.</w:t>
       </w:r>
     </w:p>
-    <w:p/>
-    <w:p/>
-    <w:p/>
-    <w:p/>
-    <w:p/>
-    <w:p/>
-    <w:p/>
-    <w:p/>
-    <w:p/>
     <w:p>
+      <w:pPr>
+        <w:rPr>
+          <w:rFonts w:ascii="Poppins" w:hAnsi="Poppins" w:cs="Poppins"/>
+        </w:rPr>
+      </w:pPr>
+    </w:p>
+    <w:p>
+      <w:pPr>
+        <w:rPr>
+          <w:rFonts w:ascii="Poppins" w:hAnsi="Poppins" w:cs="Poppins"/>
+        </w:rPr>
+      </w:pPr>
+    </w:p>
+    <w:p/>
+    <w:p/>
+    <w:p/>
+    <w:p/>
+    <w:p/>
+    <w:p/>
+    <w:p>
+      <w:pPr>
+        <w:rPr>
+          <w:rFonts w:ascii="Poppins" w:hAnsi="Poppins" w:cs="Poppins"/>
+        </w:rPr>
+      </w:pPr>
+    </w:p>
+    <w:p>
+      <w:pPr>
+        <w:rPr>
+          <w:rFonts w:ascii="Poppins" w:hAnsi="Poppins" w:cs="Poppins"/>
+        </w:rPr>
+      </w:pPr>
       <w:r>
         <w:rPr>
-          <w:rFonts w:cs="Poppins"/>
+          <w:rFonts w:ascii="Poppins" w:hAnsi="Poppins" w:cs="Poppins"/>
         </w:rPr>
         <w:t>Describe the system architecture at a high level (components, technologies, integrations).</w:t>
       </w:r>
       <w:r>
         <w:rPr>
-          <w:rFonts w:cs="Poppins"/>
+          <w:rFonts w:ascii="Poppins" w:hAnsi="Poppins" w:cs="Poppins"/>
         </w:rPr>
         <w:br/>
         <w:t>Explain how the core features will be implemented.</w:t>
       </w:r>
       <w:r>
         <w:rPr>
-          <w:rFonts w:cs="Poppins"/>
+          <w:rFonts w:ascii="Poppins" w:hAnsi="Poppins" w:cs="Poppins"/>
         </w:rPr>
         <w:br/>
         <w:t>Mention tools, frameworks, and platforms you plan to use.</w:t>
       </w:r>
       <w:r>
         <w:rPr>
-          <w:rFonts w:cs="Poppins"/>
+          <w:rFonts w:ascii="Poppins" w:hAnsi="Poppins" w:cs="Poppins"/>
         </w:rPr>
         <w:br/>
-        <w:t>Include scalability, security, and performance considerations</w:t>
-      </w:r>
-      <w:r>
-        <w:t>.</w:t>
+        <w:t>Include scalability, security, and performance considerations.</w:t>
       </w:r>
     </w:p>
     <w:p/>
@@ -1016,25 +1199,25 @@
     <w:p>
       <w:pPr>
         <w:rPr>
-          <w:rFonts w:cs="Poppins"/>
+          <w:rFonts w:ascii="Poppins" w:hAnsi="Poppins" w:cs="Poppins"/>
         </w:rPr>
       </w:pPr>
       <w:r>
         <w:rPr>
-          <w:rFonts w:cs="Poppins"/>
+          <w:rFonts w:ascii="Poppins" w:hAnsi="Poppins" w:cs="Poppins"/>
         </w:rPr>
         <w:t>Describe a realistic use-case step-by-step.</w:t>
       </w:r>
       <w:r>
         <w:rPr>
-          <w:rFonts w:cs="Poppins"/>
+          <w:rFonts w:ascii="Poppins" w:hAnsi="Poppins" w:cs="Poppins"/>
         </w:rPr>
         <w:br/>
         <w:t>Who is the user? What problem are they facing?</w:t>
       </w:r>
       <w:r>
         <w:rPr>
-          <w:rFonts w:cs="Poppins"/>
+          <w:rFonts w:ascii="Poppins" w:hAnsi="Poppins" w:cs="Poppins"/>
         </w:rPr>
         <w:br/>
         <w:t>Walk through how they interact with the system and what outcome they achieve.</w:t>
@@ -1047,29 +1230,28 @@
     <w:p/>
     <w:p/>
     <w:p/>
-    <w:p/>
     <w:p>
       <w:pPr>
         <w:rPr>
-          <w:rFonts w:cs="Poppins"/>
+          <w:rFonts w:ascii="Poppins" w:hAnsi="Poppins" w:cs="Poppins"/>
         </w:rPr>
       </w:pPr>
       <w:r>
         <w:rPr>
-          <w:rFonts w:cs="Poppins"/>
+          <w:rFonts w:ascii="Poppins" w:hAnsi="Poppins" w:cs="Poppins"/>
         </w:rPr>
         <w:t>Summarize the problem, solution, and expected impact.</w:t>
       </w:r>
       <w:r>
         <w:rPr>
-          <w:rFonts w:cs="Poppins"/>
+          <w:rFonts w:ascii="Poppins" w:hAnsi="Poppins" w:cs="Poppins"/>
         </w:rPr>
         <w:br/>
         <w:t>Reinforce why this project is worth building.</w:t>
       </w:r>
       <w:r>
         <w:rPr>
-          <w:rFonts w:cs="Poppins"/>
+          <w:rFonts w:ascii="Poppins" w:hAnsi="Poppins" w:cs="Poppins"/>
         </w:rPr>
         <w:br/>
         <w:t>Mention future improvements or expansion possibilities.</w:t>
@@ -1137,31 +1319,14 @@
           <w:b/>
           <w:bCs/>
         </w:rPr>
-        <w:t>Insert Link</w:t>
+        <w:t>Insert Link:</w:t>
       </w:r>
-      <w:proofErr w:type="gramStart"/>
       <w:r>
         <w:rPr>
-          <w:rFonts w:cs="Poppins"/>
           <w:b/>
           <w:bCs/>
         </w:rPr>
-        <w:t>:</w:t>
-      </w:r>
-      <w:r>
-        <w:rPr>
-          <w:b/>
-          <w:bCs/>
-        </w:rPr>
-        <w:t xml:space="preserve">  -</w:t>
-      </w:r>
-      <w:proofErr w:type="gramEnd"/>
-      <w:r>
-        <w:rPr>
-          <w:b/>
-          <w:bCs/>
-        </w:rPr>
-        <w:t>Link-</w:t>
+        <w:t xml:space="preserve">  -Link-</w:t>
       </w:r>
       <w:r>
         <w:rPr>
@@ -1221,7 +1386,7 @@
         <mc:AlternateContent>
           <mc:Choice Requires="wps">
             <w:drawing>
-              <wp:anchor distT="0" distB="0" distL="114300" distR="114300" simplePos="0" relativeHeight="251702272" behindDoc="0" locked="0" layoutInCell="1" allowOverlap="1" wp14:anchorId="4A2ED01A" wp14:editId="52EDFBEC">
+              <wp:anchor distT="0" distB="0" distL="114300" distR="114300" simplePos="0" relativeHeight="251702272" behindDoc="0" locked="0" layoutInCell="1" allowOverlap="1" wp14:anchorId="4A2ED01A" wp14:editId="10601B2B">
                 <wp:simplePos x="0" y="0"/>
                 <wp:positionH relativeFrom="column">
                   <wp:posOffset>1917340</wp:posOffset>
@@ -1265,14 +1430,7 @@
                               <w:rPr>
                                 <w:rFonts w:cs="Poppins Medium"/>
                               </w:rPr>
-                              <w:t xml:space="preserve">Member </w:t>
-                            </w:r>
-                            <w:proofErr w:type="gramStart"/>
-                            <w:r>
-                              <w:rPr>
-                                <w:rFonts w:cs="Poppins Medium"/>
-                              </w:rPr>
-                              <w:t>Name</w:t>
+                              <w:t>Member Name</w:t>
                             </w:r>
                             <w:r>
                               <w:rPr>
@@ -1286,7 +1444,6 @@
                               </w:rPr>
                               <w:t>:</w:t>
                             </w:r>
-                            <w:proofErr w:type="gramEnd"/>
                           </w:p>
                           <w:p>
                             <w:pPr>
@@ -1305,42 +1462,27 @@
                                 <w:rFonts w:cs="Poppins Medium"/>
                               </w:rPr>
                               <w:tab/>
+                              <w:t xml:space="preserve">  </w:t>
+                            </w:r>
+                            <w:r>
+                              <w:rPr>
+                                <w:rFonts w:cs="Poppins Medium"/>
+                              </w:rPr>
                               <w:t xml:space="preserve"> </w:t>
                             </w:r>
-                            <w:proofErr w:type="gramStart"/>
-                            <w:r>
-                              <w:rPr>
-                                <w:rFonts w:cs="Poppins Medium"/>
-                              </w:rPr>
-                              <w:t xml:space="preserve"> </w:t>
-                            </w:r>
-                            <w:r>
-                              <w:rPr>
-                                <w:rFonts w:cs="Poppins Medium"/>
-                              </w:rPr>
-                              <w:t xml:space="preserve"> </w:t>
-                            </w:r>
                             <w:r>
                               <w:rPr>
                                 <w:rFonts w:cs="Poppins Medium"/>
                               </w:rPr>
                               <w:t>:</w:t>
                             </w:r>
-                            <w:proofErr w:type="gramEnd"/>
                           </w:p>
                           <w:p>
                             <w:r>
                               <w:rPr>
                                 <w:rFonts w:cs="Poppins Medium"/>
                               </w:rPr>
-                              <w:t xml:space="preserve">Phone </w:t>
-                            </w:r>
-                            <w:proofErr w:type="gramStart"/>
-                            <w:r>
-                              <w:rPr>
-                                <w:rFonts w:cs="Poppins Medium"/>
-                              </w:rPr>
-                              <w:t>No</w:t>
+                              <w:t>Phone No</w:t>
                             </w:r>
                             <w:r>
                               <w:rPr>
@@ -1353,34 +1495,20 @@
                                 <w:rFonts w:cs="Poppins Medium"/>
                               </w:rPr>
                               <w:tab/>
-                            </w:r>
-                            <w:proofErr w:type="gramEnd"/>
+                              <w:t xml:space="preserve">  </w:t>
+                            </w:r>
                             <w:r>
                               <w:rPr>
                                 <w:rFonts w:cs="Poppins Medium"/>
                               </w:rPr>
                               <w:t xml:space="preserve"> </w:t>
                             </w:r>
-                            <w:proofErr w:type="gramStart"/>
-                            <w:r>
-                              <w:rPr>
-                                <w:rFonts w:cs="Poppins Medium"/>
-                              </w:rPr>
-                              <w:t xml:space="preserve"> </w:t>
-                            </w:r>
-                            <w:r>
-                              <w:rPr>
-                                <w:rFonts w:cs="Poppins Medium"/>
-                              </w:rPr>
-                              <w:t xml:space="preserve"> </w:t>
-                            </w:r>
                             <w:r>
                               <w:rPr>
                                 <w:rFonts w:cs="Poppins Medium"/>
                               </w:rPr>
                               <w:t>:</w:t>
                             </w:r>
-                            <w:proofErr w:type="gramEnd"/>
                           </w:p>
                         </w:txbxContent>
                       </wps:txbx>
@@ -1421,14 +1549,7 @@
                         <w:rPr>
                           <w:rFonts w:cs="Poppins Medium"/>
                         </w:rPr>
-                        <w:t xml:space="preserve">Member </w:t>
-                      </w:r>
-                      <w:proofErr w:type="gramStart"/>
-                      <w:r>
-                        <w:rPr>
-                          <w:rFonts w:cs="Poppins Medium"/>
-                        </w:rPr>
-                        <w:t>Name</w:t>
+                        <w:t>Member Name</w:t>
                       </w:r>
                       <w:r>
                         <w:rPr>
@@ -1442,7 +1563,6 @@
                         </w:rPr>
                         <w:t>:</w:t>
                       </w:r>
-                      <w:proofErr w:type="gramEnd"/>
                     </w:p>
                     <w:p>
                       <w:pPr>
@@ -1461,42 +1581,27 @@
                           <w:rFonts w:cs="Poppins Medium"/>
                         </w:rPr>
                         <w:tab/>
+                        <w:t xml:space="preserve">  </w:t>
+                      </w:r>
+                      <w:r>
+                        <w:rPr>
+                          <w:rFonts w:cs="Poppins Medium"/>
+                        </w:rPr>
                         <w:t xml:space="preserve"> </w:t>
                       </w:r>
-                      <w:proofErr w:type="gramStart"/>
-                      <w:r>
-                        <w:rPr>
-                          <w:rFonts w:cs="Poppins Medium"/>
-                        </w:rPr>
-                        <w:t xml:space="preserve"> </w:t>
-                      </w:r>
-                      <w:r>
-                        <w:rPr>
-                          <w:rFonts w:cs="Poppins Medium"/>
-                        </w:rPr>
-                        <w:t xml:space="preserve"> </w:t>
-                      </w:r>
                       <w:r>
                         <w:rPr>
                           <w:rFonts w:cs="Poppins Medium"/>
                         </w:rPr>
                         <w:t>:</w:t>
                       </w:r>
-                      <w:proofErr w:type="gramEnd"/>
                     </w:p>
                     <w:p>
                       <w:r>
                         <w:rPr>
                           <w:rFonts w:cs="Poppins Medium"/>
                         </w:rPr>
-                        <w:t xml:space="preserve">Phone </w:t>
-                      </w:r>
-                      <w:proofErr w:type="gramStart"/>
-                      <w:r>
-                        <w:rPr>
-                          <w:rFonts w:cs="Poppins Medium"/>
-                        </w:rPr>
-                        <w:t>No</w:t>
+                        <w:t>Phone No</w:t>
                       </w:r>
                       <w:r>
                         <w:rPr>
@@ -1509,34 +1614,20 @@
                           <w:rFonts w:cs="Poppins Medium"/>
                         </w:rPr>
                         <w:tab/>
-                      </w:r>
-                      <w:proofErr w:type="gramEnd"/>
+                        <w:t xml:space="preserve">  </w:t>
+                      </w:r>
                       <w:r>
                         <w:rPr>
                           <w:rFonts w:cs="Poppins Medium"/>
                         </w:rPr>
                         <w:t xml:space="preserve"> </w:t>
                       </w:r>
-                      <w:proofErr w:type="gramStart"/>
-                      <w:r>
-                        <w:rPr>
-                          <w:rFonts w:cs="Poppins Medium"/>
-                        </w:rPr>
-                        <w:t xml:space="preserve"> </w:t>
-                      </w:r>
-                      <w:r>
-                        <w:rPr>
-                          <w:rFonts w:cs="Poppins Medium"/>
-                        </w:rPr>
-                        <w:t xml:space="preserve"> </w:t>
-                      </w:r>
                       <w:r>
                         <w:rPr>
                           <w:rFonts w:cs="Poppins Medium"/>
                         </w:rPr>
                         <w:t>:</w:t>
                       </w:r>
-                      <w:proofErr w:type="gramEnd"/>
                     </w:p>
                   </w:txbxContent>
                 </v:textbox>
@@ -1596,14 +1687,7 @@
                               <w:rPr>
                                 <w:rFonts w:cs="Poppins Medium"/>
                               </w:rPr>
-                              <w:t xml:space="preserve">Member </w:t>
-                            </w:r>
-                            <w:proofErr w:type="gramStart"/>
-                            <w:r>
-                              <w:rPr>
-                                <w:rFonts w:cs="Poppins Medium"/>
-                              </w:rPr>
-                              <w:t>Name</w:t>
+                              <w:t>Member Name</w:t>
                             </w:r>
                             <w:r>
                               <w:rPr>
@@ -1617,7 +1701,6 @@
                               </w:rPr>
                               <w:t>:</w:t>
                             </w:r>
-                            <w:proofErr w:type="gramEnd"/>
                           </w:p>
                           <w:p>
                             <w:pPr>
@@ -1636,42 +1719,27 @@
                                 <w:rFonts w:cs="Poppins Medium"/>
                               </w:rPr>
                               <w:tab/>
+                              <w:t xml:space="preserve">  </w:t>
+                            </w:r>
+                            <w:r>
+                              <w:rPr>
+                                <w:rFonts w:cs="Poppins Medium"/>
+                              </w:rPr>
                               <w:t xml:space="preserve"> </w:t>
                             </w:r>
-                            <w:proofErr w:type="gramStart"/>
-                            <w:r>
-                              <w:rPr>
-                                <w:rFonts w:cs="Poppins Medium"/>
-                              </w:rPr>
-                              <w:t xml:space="preserve"> </w:t>
-                            </w:r>
-                            <w:r>
-                              <w:rPr>
-                                <w:rFonts w:cs="Poppins Medium"/>
-                              </w:rPr>
-                              <w:t xml:space="preserve"> </w:t>
-                            </w:r>
                             <w:r>
                               <w:rPr>
                                 <w:rFonts w:cs="Poppins Medium"/>
                               </w:rPr>
                               <w:t>:</w:t>
                             </w:r>
-                            <w:proofErr w:type="gramEnd"/>
                           </w:p>
                           <w:p>
                             <w:r>
                               <w:rPr>
                                 <w:rFonts w:cs="Poppins Medium"/>
                               </w:rPr>
-                              <w:t xml:space="preserve">Phone </w:t>
-                            </w:r>
-                            <w:proofErr w:type="gramStart"/>
-                            <w:r>
-                              <w:rPr>
-                                <w:rFonts w:cs="Poppins Medium"/>
-                              </w:rPr>
-                              <w:t>No</w:t>
+                              <w:t>Phone No</w:t>
                             </w:r>
                             <w:r>
                               <w:rPr>
@@ -1684,34 +1752,20 @@
                                 <w:rFonts w:cs="Poppins Medium"/>
                               </w:rPr>
                               <w:tab/>
-                            </w:r>
-                            <w:proofErr w:type="gramEnd"/>
+                              <w:t xml:space="preserve">  </w:t>
+                            </w:r>
                             <w:r>
                               <w:rPr>
                                 <w:rFonts w:cs="Poppins Medium"/>
                               </w:rPr>
                               <w:t xml:space="preserve"> </w:t>
                             </w:r>
-                            <w:proofErr w:type="gramStart"/>
-                            <w:r>
-                              <w:rPr>
-                                <w:rFonts w:cs="Poppins Medium"/>
-                              </w:rPr>
-                              <w:t xml:space="preserve"> </w:t>
-                            </w:r>
-                            <w:r>
-                              <w:rPr>
-                                <w:rFonts w:cs="Poppins Medium"/>
-                              </w:rPr>
-                              <w:t xml:space="preserve"> </w:t>
-                            </w:r>
                             <w:r>
                               <w:rPr>
                                 <w:rFonts w:cs="Poppins Medium"/>
                               </w:rPr>
                               <w:t>:</w:t>
                             </w:r>
-                            <w:proofErr w:type="gramEnd"/>
                           </w:p>
                         </w:txbxContent>
                       </wps:txbx>
@@ -1923,14 +1977,7 @@
                               <w:rPr>
                                 <w:rFonts w:cs="Poppins Medium"/>
                               </w:rPr>
-                              <w:t xml:space="preserve">Member </w:t>
-                            </w:r>
-                            <w:proofErr w:type="gramStart"/>
-                            <w:r>
-                              <w:rPr>
-                                <w:rFonts w:cs="Poppins Medium"/>
-                              </w:rPr>
-                              <w:t>Name</w:t>
+                              <w:t>Member Name</w:t>
                             </w:r>
                             <w:r>
                               <w:rPr>
@@ -1944,7 +1991,6 @@
                               </w:rPr>
                               <w:t>:</w:t>
                             </w:r>
-                            <w:proofErr w:type="gramEnd"/>
                           </w:p>
                           <w:p>
                             <w:pPr>
@@ -1963,42 +2009,27 @@
                                 <w:rFonts w:cs="Poppins Medium"/>
                               </w:rPr>
                               <w:tab/>
+                              <w:t xml:space="preserve">  </w:t>
+                            </w:r>
+                            <w:r>
+                              <w:rPr>
+                                <w:rFonts w:cs="Poppins Medium"/>
+                              </w:rPr>
                               <w:t xml:space="preserve"> </w:t>
                             </w:r>
-                            <w:proofErr w:type="gramStart"/>
-                            <w:r>
-                              <w:rPr>
-                                <w:rFonts w:cs="Poppins Medium"/>
-                              </w:rPr>
-                              <w:t xml:space="preserve"> </w:t>
-                            </w:r>
-                            <w:r>
-                              <w:rPr>
-                                <w:rFonts w:cs="Poppins Medium"/>
-                              </w:rPr>
-                              <w:t xml:space="preserve"> </w:t>
-                            </w:r>
                             <w:r>
                               <w:rPr>
                                 <w:rFonts w:cs="Poppins Medium"/>
                               </w:rPr>
                               <w:t>:</w:t>
                             </w:r>
-                            <w:proofErr w:type="gramEnd"/>
                           </w:p>
                           <w:p>
                             <w:r>
                               <w:rPr>
                                 <w:rFonts w:cs="Poppins Medium"/>
                               </w:rPr>
-                              <w:t xml:space="preserve">Phone </w:t>
-                            </w:r>
-                            <w:proofErr w:type="gramStart"/>
-                            <w:r>
-                              <w:rPr>
-                                <w:rFonts w:cs="Poppins Medium"/>
-                              </w:rPr>
-                              <w:t>No</w:t>
+                              <w:t>Phone No</w:t>
                             </w:r>
                             <w:r>
                               <w:rPr>
@@ -2011,34 +2042,20 @@
                                 <w:rFonts w:cs="Poppins Medium"/>
                               </w:rPr>
                               <w:tab/>
-                            </w:r>
-                            <w:proofErr w:type="gramEnd"/>
+                              <w:t xml:space="preserve">  </w:t>
+                            </w:r>
                             <w:r>
                               <w:rPr>
                                 <w:rFonts w:cs="Poppins Medium"/>
                               </w:rPr>
                               <w:t xml:space="preserve"> </w:t>
                             </w:r>
-                            <w:proofErr w:type="gramStart"/>
-                            <w:r>
-                              <w:rPr>
-                                <w:rFonts w:cs="Poppins Medium"/>
-                              </w:rPr>
-                              <w:t xml:space="preserve"> </w:t>
-                            </w:r>
-                            <w:r>
-                              <w:rPr>
-                                <w:rFonts w:cs="Poppins Medium"/>
-                              </w:rPr>
-                              <w:t xml:space="preserve"> </w:t>
-                            </w:r>
                             <w:r>
                               <w:rPr>
                                 <w:rFonts w:cs="Poppins Medium"/>
                               </w:rPr>
                               <w:t>:</w:t>
                             </w:r>
-                            <w:proofErr w:type="gramEnd"/>
                           </w:p>
                         </w:txbxContent>
                       </wps:txbx>
@@ -2250,14 +2267,7 @@
                               <w:rPr>
                                 <w:rFonts w:cs="Poppins Medium"/>
                               </w:rPr>
-                              <w:t xml:space="preserve">Member </w:t>
-                            </w:r>
-                            <w:proofErr w:type="gramStart"/>
-                            <w:r>
-                              <w:rPr>
-                                <w:rFonts w:cs="Poppins Medium"/>
-                              </w:rPr>
-                              <w:t>Name</w:t>
+                              <w:t>Member Name</w:t>
                             </w:r>
                             <w:r>
                               <w:rPr>
@@ -2271,7 +2281,6 @@
                               </w:rPr>
                               <w:t>:</w:t>
                             </w:r>
-                            <w:proofErr w:type="gramEnd"/>
                           </w:p>
                           <w:p>
                             <w:pPr>
@@ -2290,42 +2299,27 @@
                                 <w:rFonts w:cs="Poppins Medium"/>
                               </w:rPr>
                               <w:tab/>
+                              <w:t xml:space="preserve">  </w:t>
+                            </w:r>
+                            <w:r>
+                              <w:rPr>
+                                <w:rFonts w:cs="Poppins Medium"/>
+                              </w:rPr>
                               <w:t xml:space="preserve"> </w:t>
                             </w:r>
-                            <w:proofErr w:type="gramStart"/>
-                            <w:r>
-                              <w:rPr>
-                                <w:rFonts w:cs="Poppins Medium"/>
-                              </w:rPr>
-                              <w:t xml:space="preserve"> </w:t>
-                            </w:r>
-                            <w:r>
-                              <w:rPr>
-                                <w:rFonts w:cs="Poppins Medium"/>
-                              </w:rPr>
-                              <w:t xml:space="preserve"> </w:t>
-                            </w:r>
                             <w:r>
                               <w:rPr>
                                 <w:rFonts w:cs="Poppins Medium"/>
                               </w:rPr>
                               <w:t>:</w:t>
                             </w:r>
-                            <w:proofErr w:type="gramEnd"/>
                           </w:p>
                           <w:p>
                             <w:r>
                               <w:rPr>
                                 <w:rFonts w:cs="Poppins Medium"/>
                               </w:rPr>
-                              <w:t xml:space="preserve">Phone </w:t>
-                            </w:r>
-                            <w:proofErr w:type="gramStart"/>
-                            <w:r>
-                              <w:rPr>
-                                <w:rFonts w:cs="Poppins Medium"/>
-                              </w:rPr>
-                              <w:t>No</w:t>
+                              <w:t>Phone No</w:t>
                             </w:r>
                             <w:r>
                               <w:rPr>
@@ -2338,34 +2332,20 @@
                                 <w:rFonts w:cs="Poppins Medium"/>
                               </w:rPr>
                               <w:tab/>
-                            </w:r>
-                            <w:proofErr w:type="gramEnd"/>
+                              <w:t xml:space="preserve">  </w:t>
+                            </w:r>
                             <w:r>
                               <w:rPr>
                                 <w:rFonts w:cs="Poppins Medium"/>
                               </w:rPr>
                               <w:t xml:space="preserve"> </w:t>
                             </w:r>
-                            <w:proofErr w:type="gramStart"/>
-                            <w:r>
-                              <w:rPr>
-                                <w:rFonts w:cs="Poppins Medium"/>
-                              </w:rPr>
-                              <w:t xml:space="preserve"> </w:t>
-                            </w:r>
-                            <w:r>
-                              <w:rPr>
-                                <w:rFonts w:cs="Poppins Medium"/>
-                              </w:rPr>
-                              <w:t xml:space="preserve"> </w:t>
-                            </w:r>
                             <w:r>
                               <w:rPr>
                                 <w:rFonts w:cs="Poppins Medium"/>
                               </w:rPr>
                               <w:t>:</w:t>
                             </w:r>
-                            <w:proofErr w:type="gramEnd"/>
                           </w:p>
                         </w:txbxContent>
                       </wps:txbx>
@@ -2533,7 +2513,7 @@
         <mc:AlternateContent>
           <mc:Choice Requires="wps">
             <w:drawing>
-              <wp:anchor distT="0" distB="0" distL="114300" distR="114300" simplePos="0" relativeHeight="251694080" behindDoc="0" locked="0" layoutInCell="1" allowOverlap="1" wp14:anchorId="7377FA49" wp14:editId="3CA76892">
+              <wp:anchor distT="0" distB="0" distL="114300" distR="114300" simplePos="0" relativeHeight="251694080" behindDoc="0" locked="0" layoutInCell="1" allowOverlap="1" wp14:anchorId="7377FA49" wp14:editId="3E9DAECC">
                 <wp:simplePos x="0" y="0"/>
                 <wp:positionH relativeFrom="column">
                   <wp:posOffset>1929325</wp:posOffset>
@@ -2577,14 +2557,7 @@
                               <w:rPr>
                                 <w:rFonts w:cs="Poppins Medium"/>
                               </w:rPr>
-                              <w:t xml:space="preserve">Member </w:t>
-                            </w:r>
-                            <w:proofErr w:type="gramStart"/>
-                            <w:r>
-                              <w:rPr>
-                                <w:rFonts w:cs="Poppins Medium"/>
-                              </w:rPr>
-                              <w:t>Name</w:t>
+                              <w:t>Member Name</w:t>
                             </w:r>
                             <w:r>
                               <w:rPr>
@@ -2598,7 +2571,6 @@
                               </w:rPr>
                               <w:t>:</w:t>
                             </w:r>
-                            <w:proofErr w:type="gramEnd"/>
                           </w:p>
                           <w:p>
                             <w:pPr>
@@ -2617,28 +2589,20 @@
                                 <w:rFonts w:cs="Poppins Medium"/>
                               </w:rPr>
                               <w:tab/>
+                              <w:t xml:space="preserve">  </w:t>
+                            </w:r>
+                            <w:r>
+                              <w:rPr>
+                                <w:rFonts w:cs="Poppins Medium"/>
+                              </w:rPr>
                               <w:t xml:space="preserve"> </w:t>
                             </w:r>
-                            <w:proofErr w:type="gramStart"/>
-                            <w:r>
-                              <w:rPr>
-                                <w:rFonts w:cs="Poppins Medium"/>
-                              </w:rPr>
-                              <w:t xml:space="preserve"> </w:t>
-                            </w:r>
-                            <w:r>
-                              <w:rPr>
-                                <w:rFonts w:cs="Poppins Medium"/>
-                              </w:rPr>
-                              <w:t xml:space="preserve"> </w:t>
-                            </w:r>
                             <w:r>
                               <w:rPr>
                                 <w:rFonts w:cs="Poppins Medium"/>
                               </w:rPr>
                               <w:t>:</w:t>
                             </w:r>
-                            <w:proofErr w:type="gramEnd"/>
                           </w:p>
                           <w:p>
                             <w:r>
@@ -2652,28 +2616,20 @@
                                 <w:rFonts w:cs="Poppins Medium"/>
                               </w:rPr>
                               <w:tab/>
+                              <w:t xml:space="preserve">  </w:t>
+                            </w:r>
+                            <w:r>
+                              <w:rPr>
+                                <w:rFonts w:cs="Poppins Medium"/>
+                              </w:rPr>
                               <w:t xml:space="preserve"> </w:t>
                             </w:r>
-                            <w:proofErr w:type="gramStart"/>
-                            <w:r>
-                              <w:rPr>
-                                <w:rFonts w:cs="Poppins Medium"/>
-                              </w:rPr>
-                              <w:t xml:space="preserve"> </w:t>
-                            </w:r>
-                            <w:r>
-                              <w:rPr>
-                                <w:rFonts w:cs="Poppins Medium"/>
-                              </w:rPr>
-                              <w:t xml:space="preserve"> </w:t>
-                            </w:r>
                             <w:r>
                               <w:rPr>
                                 <w:rFonts w:cs="Poppins Medium"/>
                               </w:rPr>
                               <w:t>:</w:t>
                             </w:r>
-                            <w:proofErr w:type="gramEnd"/>
                           </w:p>
                         </w:txbxContent>
                       </wps:txbx>
@@ -2822,7 +2778,7 @@
         <mc:AlternateContent>
           <mc:Choice Requires="wps">
             <w:drawing>
-              <wp:anchor distT="0" distB="0" distL="114300" distR="114300" simplePos="0" relativeHeight="251693056" behindDoc="0" locked="0" layoutInCell="1" allowOverlap="1" wp14:anchorId="07641073" wp14:editId="530CE473">
+              <wp:anchor distT="0" distB="0" distL="114300" distR="114300" simplePos="0" relativeHeight="251693056" behindDoc="0" locked="0" layoutInCell="1" allowOverlap="1" wp14:anchorId="07641073" wp14:editId="09074B14">
                 <wp:simplePos x="0" y="0"/>
                 <wp:positionH relativeFrom="column">
                   <wp:posOffset>379203</wp:posOffset>
@@ -2900,7 +2856,7 @@
           </mc:Choice>
           <mc:Fallback>
             <w:pict>
-              <v:oval w14:anchorId="1A99B570" id="Oval 10" o:spid="_x0000_s1026" style="position:absolute;margin-left:29.85pt;margin-top:441.85pt;width:87pt;height:87pt;z-index:251693056;visibility:visible;mso-wrap-style:square;mso-width-percent:0;mso-height-percent:0;mso-wrap-distance-left:9pt;mso-wrap-distance-top:0;mso-wrap-distance-right:9pt;mso-wrap-distance-bottom:0;mso-position-horizontal:absolute;mso-position-horizontal-relative:text;mso-position-vertical:absolute;mso-position-vertical-relative:text;mso-width-percent:0;mso-height-percent:0;mso-width-relative:margin;mso-height-relative:margin;v-text-anchor:middle" o:gfxdata="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" stroked="f" strokeweight="1pt">
+              <v:oval w14:anchorId="55EEA711" id="Oval 10" o:spid="_x0000_s1026" style="position:absolute;margin-left:29.85pt;margin-top:441.85pt;width:87pt;height:87pt;z-index:251693056;visibility:visible;mso-wrap-style:square;mso-width-percent:0;mso-height-percent:0;mso-wrap-distance-left:9pt;mso-wrap-distance-top:0;mso-wrap-distance-right:9pt;mso-wrap-distance-bottom:0;mso-position-horizontal:absolute;mso-position-horizontal-relative:text;mso-position-vertical:absolute;mso-position-vertical-relative:text;mso-width-percent:0;mso-height-percent:0;mso-width-relative:margin;mso-height-relative:margin;v-text-anchor:middle" o:gfxdata="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" stroked="f" strokeweight="1pt">
                 <v:fill r:id="rId12" o:title="" recolor="t" rotate="t" type="frame"/>
                 <v:stroke joinstyle="miter"/>
               </v:oval>
@@ -2994,7 +2950,7 @@
           <mc:Fallback>
             <w:pict>
               <v:oval w14:anchorId="108CF80E" id="Oval 10" o:spid="_x0000_s1026" style="position:absolute;margin-left:30.35pt;margin-top:331.3pt;width:87pt;height:87pt;z-index:251692032;visibility:visible;mso-wrap-style:square;mso-width-percent:0;mso-height-percent:0;mso-wrap-distance-left:9pt;mso-wrap-distance-top:0;mso-wrap-distance-right:9pt;mso-wrap-distance-bottom:0;mso-position-horizontal:absolute;mso-position-horizontal-relative:text;mso-position-vertical:absolute;mso-position-vertical-relative:text;mso-width-percent:0;mso-height-percent:0;mso-width-relative:margin;mso-height-relative:margin;v-text-anchor:middle" o:gfxdata="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" stroked="f" strokeweight="1pt">
-                <v:fill r:id="rId12" o:title="" recolor="t" rotate="t" type="frame"/>
+                <v:fill r:id="rId13" o:title="" recolor="t" rotate="t" type="frame"/>
                 <v:stroke joinstyle="miter"/>
               </v:oval>
             </w:pict>
@@ -3087,7 +3043,7 @@
           <mc:Fallback>
             <w:pict>
               <v:oval w14:anchorId="222A526A" id="Oval 10" o:spid="_x0000_s1026" style="position:absolute;margin-left:29.95pt;margin-top:221.2pt;width:87pt;height:87pt;z-index:251691008;visibility:visible;mso-wrap-style:square;mso-width-percent:0;mso-height-percent:0;mso-wrap-distance-left:9pt;mso-wrap-distance-top:0;mso-wrap-distance-right:9pt;mso-wrap-distance-bottom:0;mso-position-horizontal:absolute;mso-position-horizontal-relative:text;mso-position-vertical:absolute;mso-position-vertical-relative:text;mso-width-percent:0;mso-height-percent:0;mso-width-relative:margin;mso-height-relative:margin;v-text-anchor:middle" o:gfxdata="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" stroked="f" strokeweight="1pt">
-                <v:fill r:id="rId12" o:title="" recolor="t" rotate="t" type="frame"/>
+                <v:fill r:id="rId13" o:title="" recolor="t" rotate="t" type="frame"/>
                 <v:stroke joinstyle="miter"/>
               </v:oval>
             </w:pict>
@@ -3180,7 +3136,7 @@
           <mc:Fallback>
             <w:pict>
               <v:oval w14:anchorId="7B960EFD" id="Oval 10" o:spid="_x0000_s1026" style="position:absolute;margin-left:29.85pt;margin-top:109.6pt;width:87pt;height:87pt;z-index:251689984;visibility:visible;mso-wrap-style:square;mso-width-percent:0;mso-height-percent:0;mso-wrap-distance-left:9pt;mso-wrap-distance-top:0;mso-wrap-distance-right:9pt;mso-wrap-distance-bottom:0;mso-position-horizontal:absolute;mso-position-horizontal-relative:text;mso-position-vertical:absolute;mso-position-vertical-relative:text;mso-width-percent:0;mso-height-percent:0;mso-width-relative:margin;mso-height-relative:margin;v-text-anchor:middle" o:gfxdata="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" stroked="f" strokeweight="1pt">
-                <v:fill r:id="rId12" o:title="" recolor="t" rotate="t" type="frame"/>
+                <v:fill r:id="rId13" o:title="" recolor="t" rotate="t" type="frame"/>
                 <v:stroke joinstyle="miter"/>
               </v:oval>
             </w:pict>
@@ -3273,7 +3229,7 @@
           <mc:Fallback>
             <w:pict>
               <v:oval w14:anchorId="6B1A8F7E" id="Oval 10" o:spid="_x0000_s1026" style="position:absolute;margin-left:30.7pt;margin-top:1.05pt;width:87pt;height:87pt;z-index:251688960;visibility:visible;mso-wrap-style:square;mso-width-percent:0;mso-height-percent:0;mso-wrap-distance-left:9pt;mso-wrap-distance-top:0;mso-wrap-distance-right:9pt;mso-wrap-distance-bottom:0;mso-position-horizontal:absolute;mso-position-horizontal-relative:text;mso-position-vertical:absolute;mso-position-vertical-relative:text;mso-width-percent:0;mso-height-percent:0;mso-width-relative:margin;mso-height-relative:margin;v-text-anchor:middle" o:gfxdata="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" stroked="f" strokeweight="1pt">
-                <v:fill r:id="rId12" o:title="" recolor="t" rotate="t" type="frame"/>
+                <v:fill r:id="rId13" o:title="" recolor="t" rotate="t" type="frame"/>
                 <v:stroke joinstyle="miter"/>
               </v:oval>
             </w:pict>
@@ -3282,8 +3238,8 @@
       </w:r>
     </w:p>
     <w:sectPr>
-      <w:headerReference w:type="default" r:id="rId13"/>
-      <w:footerReference w:type="default" r:id="rId14"/>
+      <w:headerReference w:type="default" r:id="rId14"/>
+      <w:footerReference w:type="default" r:id="rId15"/>
       <w:pgSz w:w="12240" w:h="15840"/>
       <w:pgMar w:top="1440" w:right="1440" w:bottom="1440" w:left="1440" w:header="720" w:footer="720" w:gutter="0"/>
       <w:pgNumType w:start="0"/>

</xml_diff>